<commit_message>
feat: add lista 07
</commit_message>
<xml_diff>
--- a/lista/lista_t/07/07.mc_lista_ex_t_tabela_v.docx
+++ b/lista/lista_t/07/07.mc_lista_ex_t_tabela_v.docx
@@ -326,7 +326,7 @@
       <w:pPr>
         <w:numPr>
           <w:ilvl w:val="0"/>
-          <w:numId w:val="23"/>
+          <w:numId w:val="1"/>
         </w:numPr>
         <w:rPr>
           <w:rFonts w:ascii="Roboto" w:hAnsi="Roboto"/>
@@ -499,7 +499,7 @@
       <w:pPr>
         <w:numPr>
           <w:ilvl w:val="0"/>
-          <w:numId w:val="24"/>
+          <w:numId w:val="2"/>
         </w:numPr>
         <w:rPr>
           <w:rFonts w:ascii="Roboto" w:hAnsi="Roboto"/>
@@ -718,7 +718,7 @@
       <w:pPr>
         <w:numPr>
           <w:ilvl w:val="0"/>
-          <w:numId w:val="25"/>
+          <w:numId w:val="3"/>
         </w:numPr>
         <w:rPr>
           <w:rFonts w:ascii="Roboto" w:hAnsi="Roboto"/>
@@ -908,7 +908,7 @@
       <w:pPr>
         <w:numPr>
           <w:ilvl w:val="0"/>
-          <w:numId w:val="26"/>
+          <w:numId w:val="4"/>
         </w:numPr>
         <w:rPr>
           <w:rFonts w:ascii="Roboto" w:hAnsi="Roboto"/>
@@ -931,7 +931,7 @@
       <w:pPr>
         <w:numPr>
           <w:ilvl w:val="0"/>
-          <w:numId w:val="27"/>
+          <w:numId w:val="5"/>
         </w:numPr>
         <w:rPr>
           <w:rFonts w:ascii="Roboto" w:hAnsi="Roboto"/>
@@ -988,7 +988,7 @@
       <w:pPr>
         <w:numPr>
           <w:ilvl w:val="0"/>
-          <w:numId w:val="27"/>
+          <w:numId w:val="5"/>
         </w:numPr>
         <w:rPr>
           <w:rFonts w:ascii="Roboto" w:hAnsi="Roboto"/>
@@ -1289,7 +1289,7 @@
       <w:pPr>
         <w:numPr>
           <w:ilvl w:val="0"/>
-          <w:numId w:val="28"/>
+          <w:numId w:val="6"/>
         </w:numPr>
         <w:rPr>
           <w:rFonts w:ascii="Roboto" w:hAnsi="Roboto"/>
@@ -1443,7 +1443,7 @@
       <w:pPr>
         <w:numPr>
           <w:ilvl w:val="0"/>
-          <w:numId w:val="29"/>
+          <w:numId w:val="7"/>
         </w:numPr>
         <w:rPr>
           <w:rFonts w:ascii="Roboto" w:hAnsi="Roboto"/>
@@ -1466,7 +1466,7 @@
       <w:pPr>
         <w:numPr>
           <w:ilvl w:val="0"/>
-          <w:numId w:val="30"/>
+          <w:numId w:val="8"/>
         </w:numPr>
         <w:rPr>
           <w:rFonts w:ascii="Roboto" w:hAnsi="Roboto"/>
@@ -1505,7 +1505,7 @@
       <w:pPr>
         <w:numPr>
           <w:ilvl w:val="0"/>
-          <w:numId w:val="30"/>
+          <w:numId w:val="8"/>
         </w:numPr>
         <w:rPr>
           <w:rFonts w:ascii="Roboto" w:hAnsi="Roboto"/>
@@ -1614,7 +1614,7 @@
       <w:pPr>
         <w:numPr>
           <w:ilvl w:val="0"/>
-          <w:numId w:val="31"/>
+          <w:numId w:val="9"/>
         </w:numPr>
         <w:rPr>
           <w:rFonts w:ascii="Roboto" w:hAnsi="Roboto"/>
@@ -1637,7 +1637,7 @@
       <w:pPr>
         <w:numPr>
           <w:ilvl w:val="0"/>
-          <w:numId w:val="32"/>
+          <w:numId w:val="10"/>
         </w:numPr>
         <w:rPr>
           <w:rFonts w:ascii="Roboto" w:hAnsi="Roboto"/>
@@ -1676,7 +1676,7 @@
       <w:pPr>
         <w:numPr>
           <w:ilvl w:val="0"/>
-          <w:numId w:val="32"/>
+          <w:numId w:val="10"/>
         </w:numPr>
         <w:rPr>
           <w:rFonts w:ascii="Roboto" w:hAnsi="Roboto"/>
@@ -1805,7 +1805,7 @@
       <w:pPr>
         <w:numPr>
           <w:ilvl w:val="0"/>
-          <w:numId w:val="33"/>
+          <w:numId w:val="11"/>
         </w:numPr>
         <w:rPr>
           <w:rFonts w:ascii="Roboto" w:hAnsi="Roboto"/>
@@ -2066,7 +2066,7 @@
       <w:pPr>
         <w:numPr>
           <w:ilvl w:val="0"/>
-          <w:numId w:val="34"/>
+          <w:numId w:val="12"/>
         </w:numPr>
         <w:rPr>
           <w:rFonts w:ascii="Roboto" w:hAnsi="Roboto"/>
@@ -2480,7 +2480,7 @@
       <w:pPr>
         <w:numPr>
           <w:ilvl w:val="0"/>
-          <w:numId w:val="35"/>
+          <w:numId w:val="13"/>
         </w:numPr>
         <w:rPr>
           <w:rFonts w:ascii="Roboto" w:hAnsi="Roboto"/>
@@ -2566,6 +2566,15 @@
         </w:rPr>
         <w:t xml:space="preserve"> e determine a função lógica simplificada equivalente a esse circuito.</w:t>
       </w:r>
+    </w:p>
+    <w:p>
+      <w:pPr>
+        <w:rPr>
+          <w:rFonts w:ascii="Roboto" w:hAnsi="Roboto"/>
+          <w:sz w:val="36"/>
+          <w:szCs w:val="36"/>
+        </w:rPr>
+      </w:pPr>
     </w:p>
     <w:p>
       <w:pPr>
@@ -2791,6 +2800,155 @@
 <file path=word/numbering.xml><?xml version="1.0" encoding="utf-8"?>
 <w:numbering xmlns:wpc="http://schemas.microsoft.com/office/word/2010/wordprocessingCanvas" xmlns:cx="http://schemas.microsoft.com/office/drawing/2014/chartex" xmlns:cx1="http://schemas.microsoft.com/office/drawing/2015/9/8/chartex" xmlns:cx2="http://schemas.microsoft.com/office/drawing/2015/10/21/chartex" xmlns:cx3="http://schemas.microsoft.com/office/drawing/2016/5/9/chartex" xmlns:cx4="http://schemas.microsoft.com/office/drawing/2016/5/10/chartex" xmlns:cx5="http://schemas.microsoft.com/office/drawing/2016/5/11/chartex" xmlns:cx6="http://schemas.microsoft.com/office/drawing/2016/5/12/chartex" xmlns:cx7="http://schemas.microsoft.com/office/drawing/2016/5/13/chartex" xmlns:cx8="http://schemas.microsoft.com/office/drawing/2016/5/14/chartex" xmlns:mc="http://schemas.openxmlformats.org/markup-compatibility/2006" xmlns:aink="http://schemas.microsoft.com/office/drawing/2016/ink" xmlns:am3d="http://schemas.microsoft.com/office/drawing/2017/model3d" xmlns:o="urn:schemas-microsoft-com:office:office" xmlns:oel="http://schemas.microsoft.com/office/2019/extlst" xmlns:r="http://schemas.openxmlformats.org/officeDocument/2006/relationships" xmlns:m="http://schemas.openxmlformats.org/officeDocument/2006/math" xmlns:v="urn:schemas-microsoft-com:vml" xmlns:wp14="http://schemas.microsoft.com/office/word/2010/wordprocessingDrawing" xmlns:wp="http://schemas.openxmlformats.org/drawingml/2006/wordprocessingDrawing" xmlns:w10="urn:schemas-microsoft-com:office:word" xmlns:w="http://schemas.openxmlformats.org/wordprocessingml/2006/main" xmlns:w14="http://schemas.microsoft.com/office/word/2010/wordml" xmlns:w15="http://schemas.microsoft.com/office/word/2012/wordml" xmlns:w16cex="http://schemas.microsoft.com/office/word/2018/wordml/cex" xmlns:w16cid="http://schemas.microsoft.com/office/word/2016/wordml/cid" xmlns:w16="http://schemas.microsoft.com/office/word/2018/wordml" xmlns:w16du="http://schemas.microsoft.com/office/word/2023/wordml/word16du" xmlns:w16sdtdh="http://schemas.microsoft.com/office/word/2020/wordml/sdtdatahash" xmlns:w16sdtfl="http://schemas.microsoft.com/office/word/2024/wordml/sdtformatlock" xmlns:w16se="http://schemas.microsoft.com/office/word/2015/wordml/symex" xmlns:wpg="http://schemas.microsoft.com/office/word/2010/wordprocessingGroup" xmlns:wpi="http://schemas.microsoft.com/office/word/2010/wordprocessingInk" xmlns:wne="http://schemas.microsoft.com/office/word/2006/wordml" xmlns:wps="http://schemas.microsoft.com/office/word/2010/wordprocessingShape" mc:Ignorable="w14 w15 w16se w16cid w16 w16cex w16sdtdh w16sdtfl w16du wp14">
   <w:abstractNum w:abstractNumId="0" w15:restartNumberingAfterBreak="0">
+    <w:nsid w:val="0127556D"/>
+    <w:multiLevelType w:val="multilevel"/>
+    <w:tmpl w:val="2280D1BE"/>
+    <w:lvl w:ilvl="0">
+      <w:start w:val="1"/>
+      <w:numFmt w:val="bullet"/>
+      <w:lvlText w:val=""/>
+      <w:lvlJc w:val="left"/>
+      <w:pPr>
+        <w:tabs>
+          <w:tab w:val="num" w:pos="720"/>
+        </w:tabs>
+        <w:ind w:left="720" w:hanging="360"/>
+      </w:pPr>
+      <w:rPr>
+        <w:rFonts w:ascii="Symbol" w:hAnsi="Symbol" w:hint="default"/>
+        <w:sz w:val="20"/>
+      </w:rPr>
+    </w:lvl>
+    <w:lvl w:ilvl="1" w:tentative="1">
+      <w:start w:val="1"/>
+      <w:numFmt w:val="bullet"/>
+      <w:lvlText w:val="o"/>
+      <w:lvlJc w:val="left"/>
+      <w:pPr>
+        <w:tabs>
+          <w:tab w:val="num" w:pos="1440"/>
+        </w:tabs>
+        <w:ind w:left="1440" w:hanging="360"/>
+      </w:pPr>
+      <w:rPr>
+        <w:rFonts w:ascii="Courier New" w:hAnsi="Courier New" w:hint="default"/>
+        <w:sz w:val="20"/>
+      </w:rPr>
+    </w:lvl>
+    <w:lvl w:ilvl="2" w:tentative="1">
+      <w:start w:val="1"/>
+      <w:numFmt w:val="bullet"/>
+      <w:lvlText w:val=""/>
+      <w:lvlJc w:val="left"/>
+      <w:pPr>
+        <w:tabs>
+          <w:tab w:val="num" w:pos="2160"/>
+        </w:tabs>
+        <w:ind w:left="2160" w:hanging="360"/>
+      </w:pPr>
+      <w:rPr>
+        <w:rFonts w:ascii="Wingdings" w:hAnsi="Wingdings" w:hint="default"/>
+        <w:sz w:val="20"/>
+      </w:rPr>
+    </w:lvl>
+    <w:lvl w:ilvl="3" w:tentative="1">
+      <w:start w:val="1"/>
+      <w:numFmt w:val="bullet"/>
+      <w:lvlText w:val=""/>
+      <w:lvlJc w:val="left"/>
+      <w:pPr>
+        <w:tabs>
+          <w:tab w:val="num" w:pos="2880"/>
+        </w:tabs>
+        <w:ind w:left="2880" w:hanging="360"/>
+      </w:pPr>
+      <w:rPr>
+        <w:rFonts w:ascii="Wingdings" w:hAnsi="Wingdings" w:hint="default"/>
+        <w:sz w:val="20"/>
+      </w:rPr>
+    </w:lvl>
+    <w:lvl w:ilvl="4" w:tentative="1">
+      <w:start w:val="1"/>
+      <w:numFmt w:val="bullet"/>
+      <w:lvlText w:val=""/>
+      <w:lvlJc w:val="left"/>
+      <w:pPr>
+        <w:tabs>
+          <w:tab w:val="num" w:pos="3600"/>
+        </w:tabs>
+        <w:ind w:left="3600" w:hanging="360"/>
+      </w:pPr>
+      <w:rPr>
+        <w:rFonts w:ascii="Wingdings" w:hAnsi="Wingdings" w:hint="default"/>
+        <w:sz w:val="20"/>
+      </w:rPr>
+    </w:lvl>
+    <w:lvl w:ilvl="5" w:tentative="1">
+      <w:start w:val="1"/>
+      <w:numFmt w:val="bullet"/>
+      <w:lvlText w:val=""/>
+      <w:lvlJc w:val="left"/>
+      <w:pPr>
+        <w:tabs>
+          <w:tab w:val="num" w:pos="4320"/>
+        </w:tabs>
+        <w:ind w:left="4320" w:hanging="360"/>
+      </w:pPr>
+      <w:rPr>
+        <w:rFonts w:ascii="Wingdings" w:hAnsi="Wingdings" w:hint="default"/>
+        <w:sz w:val="20"/>
+      </w:rPr>
+    </w:lvl>
+    <w:lvl w:ilvl="6" w:tentative="1">
+      <w:start w:val="1"/>
+      <w:numFmt w:val="bullet"/>
+      <w:lvlText w:val=""/>
+      <w:lvlJc w:val="left"/>
+      <w:pPr>
+        <w:tabs>
+          <w:tab w:val="num" w:pos="5040"/>
+        </w:tabs>
+        <w:ind w:left="5040" w:hanging="360"/>
+      </w:pPr>
+      <w:rPr>
+        <w:rFonts w:ascii="Wingdings" w:hAnsi="Wingdings" w:hint="default"/>
+        <w:sz w:val="20"/>
+      </w:rPr>
+    </w:lvl>
+    <w:lvl w:ilvl="7" w:tentative="1">
+      <w:start w:val="1"/>
+      <w:numFmt w:val="bullet"/>
+      <w:lvlText w:val=""/>
+      <w:lvlJc w:val="left"/>
+      <w:pPr>
+        <w:tabs>
+          <w:tab w:val="num" w:pos="5760"/>
+        </w:tabs>
+        <w:ind w:left="5760" w:hanging="360"/>
+      </w:pPr>
+      <w:rPr>
+        <w:rFonts w:ascii="Wingdings" w:hAnsi="Wingdings" w:hint="default"/>
+        <w:sz w:val="20"/>
+      </w:rPr>
+    </w:lvl>
+    <w:lvl w:ilvl="8" w:tentative="1">
+      <w:start w:val="1"/>
+      <w:numFmt w:val="bullet"/>
+      <w:lvlText w:val=""/>
+      <w:lvlJc w:val="left"/>
+      <w:pPr>
+        <w:tabs>
+          <w:tab w:val="num" w:pos="6480"/>
+        </w:tabs>
+        <w:ind w:left="6480" w:hanging="360"/>
+      </w:pPr>
+      <w:rPr>
+        <w:rFonts w:ascii="Wingdings" w:hAnsi="Wingdings" w:hint="default"/>
+        <w:sz w:val="20"/>
+      </w:rPr>
+    </w:lvl>
+  </w:abstractNum>
+  <w:abstractNum w:abstractNumId="1" w15:restartNumberingAfterBreak="0">
     <w:nsid w:val="020A6A31"/>
     <w:multiLevelType w:val="multilevel"/>
     <w:tmpl w:val="4E72BF8A"/>
@@ -2903,627 +3061,570 @@
       </w:pPr>
     </w:lvl>
   </w:abstractNum>
-  <w:abstractNum w:abstractNumId="1" w15:restartNumberingAfterBreak="0">
-    <w:nsid w:val="06884AB7"/>
-    <w:multiLevelType w:val="multilevel"/>
-    <w:tmpl w:val="3F4CCC02"/>
-    <w:lvl w:ilvl="0">
-      <w:start w:val="1"/>
-      <w:numFmt w:val="bullet"/>
-      <w:lvlText w:val=""/>
-      <w:lvlJc w:val="left"/>
-      <w:pPr>
-        <w:tabs>
-          <w:tab w:val="num" w:pos="720"/>
-        </w:tabs>
-        <w:ind w:left="720" w:hanging="360"/>
-      </w:pPr>
-      <w:rPr>
-        <w:rFonts w:ascii="Symbol" w:hAnsi="Symbol" w:hint="default"/>
-        <w:sz w:val="20"/>
-      </w:rPr>
-    </w:lvl>
-    <w:lvl w:ilvl="1" w:tentative="1">
-      <w:start w:val="1"/>
-      <w:numFmt w:val="bullet"/>
-      <w:lvlText w:val="o"/>
-      <w:lvlJc w:val="left"/>
-      <w:pPr>
-        <w:tabs>
-          <w:tab w:val="num" w:pos="1440"/>
-        </w:tabs>
-        <w:ind w:left="1440" w:hanging="360"/>
-      </w:pPr>
-      <w:rPr>
-        <w:rFonts w:ascii="Courier New" w:hAnsi="Courier New" w:hint="default"/>
-        <w:sz w:val="20"/>
-      </w:rPr>
-    </w:lvl>
-    <w:lvl w:ilvl="2" w:tentative="1">
-      <w:start w:val="1"/>
-      <w:numFmt w:val="bullet"/>
-      <w:lvlText w:val=""/>
-      <w:lvlJc w:val="left"/>
-      <w:pPr>
-        <w:tabs>
-          <w:tab w:val="num" w:pos="2160"/>
-        </w:tabs>
-        <w:ind w:left="2160" w:hanging="360"/>
-      </w:pPr>
-      <w:rPr>
-        <w:rFonts w:ascii="Wingdings" w:hAnsi="Wingdings" w:hint="default"/>
-        <w:sz w:val="20"/>
-      </w:rPr>
-    </w:lvl>
-    <w:lvl w:ilvl="3" w:tentative="1">
-      <w:start w:val="1"/>
-      <w:numFmt w:val="bullet"/>
-      <w:lvlText w:val=""/>
-      <w:lvlJc w:val="left"/>
-      <w:pPr>
-        <w:tabs>
-          <w:tab w:val="num" w:pos="2880"/>
-        </w:tabs>
-        <w:ind w:left="2880" w:hanging="360"/>
-      </w:pPr>
-      <w:rPr>
-        <w:rFonts w:ascii="Wingdings" w:hAnsi="Wingdings" w:hint="default"/>
-        <w:sz w:val="20"/>
-      </w:rPr>
-    </w:lvl>
-    <w:lvl w:ilvl="4" w:tentative="1">
-      <w:start w:val="1"/>
-      <w:numFmt w:val="bullet"/>
-      <w:lvlText w:val=""/>
-      <w:lvlJc w:val="left"/>
-      <w:pPr>
-        <w:tabs>
-          <w:tab w:val="num" w:pos="3600"/>
-        </w:tabs>
-        <w:ind w:left="3600" w:hanging="360"/>
-      </w:pPr>
-      <w:rPr>
-        <w:rFonts w:ascii="Wingdings" w:hAnsi="Wingdings" w:hint="default"/>
-        <w:sz w:val="20"/>
-      </w:rPr>
-    </w:lvl>
-    <w:lvl w:ilvl="5" w:tentative="1">
-      <w:start w:val="1"/>
-      <w:numFmt w:val="bullet"/>
-      <w:lvlText w:val=""/>
-      <w:lvlJc w:val="left"/>
-      <w:pPr>
-        <w:tabs>
-          <w:tab w:val="num" w:pos="4320"/>
-        </w:tabs>
-        <w:ind w:left="4320" w:hanging="360"/>
-      </w:pPr>
-      <w:rPr>
-        <w:rFonts w:ascii="Wingdings" w:hAnsi="Wingdings" w:hint="default"/>
-        <w:sz w:val="20"/>
-      </w:rPr>
-    </w:lvl>
-    <w:lvl w:ilvl="6" w:tentative="1">
-      <w:start w:val="1"/>
-      <w:numFmt w:val="bullet"/>
-      <w:lvlText w:val=""/>
-      <w:lvlJc w:val="left"/>
-      <w:pPr>
-        <w:tabs>
-          <w:tab w:val="num" w:pos="5040"/>
-        </w:tabs>
-        <w:ind w:left="5040" w:hanging="360"/>
-      </w:pPr>
-      <w:rPr>
-        <w:rFonts w:ascii="Wingdings" w:hAnsi="Wingdings" w:hint="default"/>
-        <w:sz w:val="20"/>
-      </w:rPr>
-    </w:lvl>
-    <w:lvl w:ilvl="7" w:tentative="1">
-      <w:start w:val="1"/>
-      <w:numFmt w:val="bullet"/>
-      <w:lvlText w:val=""/>
-      <w:lvlJc w:val="left"/>
-      <w:pPr>
-        <w:tabs>
-          <w:tab w:val="num" w:pos="5760"/>
-        </w:tabs>
-        <w:ind w:left="5760" w:hanging="360"/>
-      </w:pPr>
-      <w:rPr>
-        <w:rFonts w:ascii="Wingdings" w:hAnsi="Wingdings" w:hint="default"/>
-        <w:sz w:val="20"/>
-      </w:rPr>
-    </w:lvl>
-    <w:lvl w:ilvl="8" w:tentative="1">
-      <w:start w:val="1"/>
-      <w:numFmt w:val="bullet"/>
-      <w:lvlText w:val=""/>
-      <w:lvlJc w:val="left"/>
-      <w:pPr>
-        <w:tabs>
-          <w:tab w:val="num" w:pos="6480"/>
-        </w:tabs>
-        <w:ind w:left="6480" w:hanging="360"/>
-      </w:pPr>
-      <w:rPr>
-        <w:rFonts w:ascii="Wingdings" w:hAnsi="Wingdings" w:hint="default"/>
-        <w:sz w:val="20"/>
-      </w:rPr>
-    </w:lvl>
-  </w:abstractNum>
   <w:abstractNum w:abstractNumId="2" w15:restartNumberingAfterBreak="0">
-    <w:nsid w:val="088F0174"/>
-    <w:multiLevelType w:val="hybridMultilevel"/>
-    <w:tmpl w:val="686EA366"/>
-    <w:lvl w:ilvl="0" w:tplc="0416000F">
-      <w:start w:val="1"/>
-      <w:numFmt w:val="decimal"/>
-      <w:lvlText w:val="%1."/>
-      <w:lvlJc w:val="left"/>
-      <w:pPr>
-        <w:ind w:left="720" w:hanging="360"/>
-      </w:pPr>
-      <w:rPr>
-        <w:rFonts w:hint="default"/>
-      </w:rPr>
-    </w:lvl>
-    <w:lvl w:ilvl="1" w:tplc="04160019" w:tentative="1">
-      <w:start w:val="1"/>
-      <w:numFmt w:val="lowerLetter"/>
-      <w:lvlText w:val="%2."/>
-      <w:lvlJc w:val="left"/>
-      <w:pPr>
-        <w:ind w:left="1440" w:hanging="360"/>
-      </w:pPr>
-    </w:lvl>
-    <w:lvl w:ilvl="2" w:tplc="0416001B" w:tentative="1">
-      <w:start w:val="1"/>
-      <w:numFmt w:val="lowerRoman"/>
-      <w:lvlText w:val="%3."/>
-      <w:lvlJc w:val="right"/>
-      <w:pPr>
-        <w:ind w:left="2160" w:hanging="180"/>
-      </w:pPr>
-    </w:lvl>
-    <w:lvl w:ilvl="3" w:tplc="0416000F" w:tentative="1">
-      <w:start w:val="1"/>
-      <w:numFmt w:val="decimal"/>
-      <w:lvlText w:val="%4."/>
-      <w:lvlJc w:val="left"/>
-      <w:pPr>
-        <w:ind w:left="2880" w:hanging="360"/>
-      </w:pPr>
-    </w:lvl>
-    <w:lvl w:ilvl="4" w:tplc="04160019" w:tentative="1">
-      <w:start w:val="1"/>
-      <w:numFmt w:val="lowerLetter"/>
-      <w:lvlText w:val="%5."/>
-      <w:lvlJc w:val="left"/>
-      <w:pPr>
-        <w:ind w:left="3600" w:hanging="360"/>
-      </w:pPr>
-    </w:lvl>
-    <w:lvl w:ilvl="5" w:tplc="0416001B" w:tentative="1">
-      <w:start w:val="1"/>
-      <w:numFmt w:val="lowerRoman"/>
-      <w:lvlText w:val="%6."/>
-      <w:lvlJc w:val="right"/>
-      <w:pPr>
-        <w:ind w:left="4320" w:hanging="180"/>
-      </w:pPr>
-    </w:lvl>
-    <w:lvl w:ilvl="6" w:tplc="0416000F" w:tentative="1">
-      <w:start w:val="1"/>
-      <w:numFmt w:val="decimal"/>
-      <w:lvlText w:val="%7."/>
-      <w:lvlJc w:val="left"/>
-      <w:pPr>
-        <w:ind w:left="5040" w:hanging="360"/>
-      </w:pPr>
-    </w:lvl>
-    <w:lvl w:ilvl="7" w:tplc="04160019" w:tentative="1">
-      <w:start w:val="1"/>
-      <w:numFmt w:val="lowerLetter"/>
-      <w:lvlText w:val="%8."/>
-      <w:lvlJc w:val="left"/>
-      <w:pPr>
-        <w:ind w:left="5760" w:hanging="360"/>
-      </w:pPr>
-    </w:lvl>
-    <w:lvl w:ilvl="8" w:tplc="0416001B" w:tentative="1">
-      <w:start w:val="1"/>
-      <w:numFmt w:val="lowerRoman"/>
-      <w:lvlText w:val="%9."/>
-      <w:lvlJc w:val="right"/>
-      <w:pPr>
-        <w:ind w:left="6480" w:hanging="180"/>
-      </w:pPr>
-    </w:lvl>
-  </w:abstractNum>
-  <w:abstractNum w:abstractNumId="3" w15:restartNumberingAfterBreak="0">
-    <w:nsid w:val="08C405ED"/>
-    <w:multiLevelType w:val="multilevel"/>
-    <w:tmpl w:val="2A4CF17C"/>
-    <w:lvl w:ilvl="0">
-      <w:start w:val="1"/>
-      <w:numFmt w:val="bullet"/>
-      <w:lvlText w:val=""/>
-      <w:lvlJc w:val="left"/>
-      <w:pPr>
-        <w:tabs>
-          <w:tab w:val="num" w:pos="720"/>
-        </w:tabs>
-        <w:ind w:left="720" w:hanging="360"/>
-      </w:pPr>
-      <w:rPr>
-        <w:rFonts w:ascii="Symbol" w:hAnsi="Symbol" w:hint="default"/>
-        <w:sz w:val="20"/>
-      </w:rPr>
-    </w:lvl>
-    <w:lvl w:ilvl="1" w:tentative="1">
-      <w:start w:val="1"/>
-      <w:numFmt w:val="bullet"/>
-      <w:lvlText w:val="o"/>
-      <w:lvlJc w:val="left"/>
-      <w:pPr>
-        <w:tabs>
-          <w:tab w:val="num" w:pos="1440"/>
-        </w:tabs>
-        <w:ind w:left="1440" w:hanging="360"/>
-      </w:pPr>
-      <w:rPr>
-        <w:rFonts w:ascii="Courier New" w:hAnsi="Courier New" w:hint="default"/>
-        <w:sz w:val="20"/>
-      </w:rPr>
-    </w:lvl>
-    <w:lvl w:ilvl="2" w:tentative="1">
-      <w:start w:val="1"/>
-      <w:numFmt w:val="bullet"/>
-      <w:lvlText w:val=""/>
-      <w:lvlJc w:val="left"/>
-      <w:pPr>
-        <w:tabs>
-          <w:tab w:val="num" w:pos="2160"/>
-        </w:tabs>
-        <w:ind w:left="2160" w:hanging="360"/>
-      </w:pPr>
-      <w:rPr>
-        <w:rFonts w:ascii="Wingdings" w:hAnsi="Wingdings" w:hint="default"/>
-        <w:sz w:val="20"/>
-      </w:rPr>
-    </w:lvl>
-    <w:lvl w:ilvl="3" w:tentative="1">
-      <w:start w:val="1"/>
-      <w:numFmt w:val="bullet"/>
-      <w:lvlText w:val=""/>
-      <w:lvlJc w:val="left"/>
-      <w:pPr>
-        <w:tabs>
-          <w:tab w:val="num" w:pos="2880"/>
-        </w:tabs>
-        <w:ind w:left="2880" w:hanging="360"/>
-      </w:pPr>
-      <w:rPr>
-        <w:rFonts w:ascii="Wingdings" w:hAnsi="Wingdings" w:hint="default"/>
-        <w:sz w:val="20"/>
-      </w:rPr>
-    </w:lvl>
-    <w:lvl w:ilvl="4" w:tentative="1">
-      <w:start w:val="1"/>
-      <w:numFmt w:val="bullet"/>
-      <w:lvlText w:val=""/>
-      <w:lvlJc w:val="left"/>
-      <w:pPr>
-        <w:tabs>
-          <w:tab w:val="num" w:pos="3600"/>
-        </w:tabs>
-        <w:ind w:left="3600" w:hanging="360"/>
-      </w:pPr>
-      <w:rPr>
-        <w:rFonts w:ascii="Wingdings" w:hAnsi="Wingdings" w:hint="default"/>
-        <w:sz w:val="20"/>
-      </w:rPr>
-    </w:lvl>
-    <w:lvl w:ilvl="5" w:tentative="1">
-      <w:start w:val="1"/>
-      <w:numFmt w:val="bullet"/>
-      <w:lvlText w:val=""/>
-      <w:lvlJc w:val="left"/>
-      <w:pPr>
-        <w:tabs>
-          <w:tab w:val="num" w:pos="4320"/>
-        </w:tabs>
-        <w:ind w:left="4320" w:hanging="360"/>
-      </w:pPr>
-      <w:rPr>
-        <w:rFonts w:ascii="Wingdings" w:hAnsi="Wingdings" w:hint="default"/>
-        <w:sz w:val="20"/>
-      </w:rPr>
-    </w:lvl>
-    <w:lvl w:ilvl="6" w:tentative="1">
-      <w:start w:val="1"/>
-      <w:numFmt w:val="bullet"/>
-      <w:lvlText w:val=""/>
-      <w:lvlJc w:val="left"/>
-      <w:pPr>
-        <w:tabs>
-          <w:tab w:val="num" w:pos="5040"/>
-        </w:tabs>
-        <w:ind w:left="5040" w:hanging="360"/>
-      </w:pPr>
-      <w:rPr>
-        <w:rFonts w:ascii="Wingdings" w:hAnsi="Wingdings" w:hint="default"/>
-        <w:sz w:val="20"/>
-      </w:rPr>
-    </w:lvl>
-    <w:lvl w:ilvl="7" w:tentative="1">
-      <w:start w:val="1"/>
-      <w:numFmt w:val="bullet"/>
-      <w:lvlText w:val=""/>
-      <w:lvlJc w:val="left"/>
-      <w:pPr>
-        <w:tabs>
-          <w:tab w:val="num" w:pos="5760"/>
-        </w:tabs>
-        <w:ind w:left="5760" w:hanging="360"/>
-      </w:pPr>
-      <w:rPr>
-        <w:rFonts w:ascii="Wingdings" w:hAnsi="Wingdings" w:hint="default"/>
-        <w:sz w:val="20"/>
-      </w:rPr>
-    </w:lvl>
-    <w:lvl w:ilvl="8" w:tentative="1">
-      <w:start w:val="1"/>
-      <w:numFmt w:val="bullet"/>
-      <w:lvlText w:val=""/>
-      <w:lvlJc w:val="left"/>
-      <w:pPr>
-        <w:tabs>
-          <w:tab w:val="num" w:pos="6480"/>
-        </w:tabs>
-        <w:ind w:left="6480" w:hanging="360"/>
-      </w:pPr>
-      <w:rPr>
-        <w:rFonts w:ascii="Wingdings" w:hAnsi="Wingdings" w:hint="default"/>
-        <w:sz w:val="20"/>
-      </w:rPr>
-    </w:lvl>
-  </w:abstractNum>
-  <w:abstractNum w:abstractNumId="4" w15:restartNumberingAfterBreak="0">
-    <w:nsid w:val="09A10A96"/>
-    <w:multiLevelType w:val="multilevel"/>
-    <w:tmpl w:val="8E4ED4B2"/>
-    <w:lvl w:ilvl="0">
-      <w:start w:val="1"/>
-      <w:numFmt w:val="decimal"/>
-      <w:lvlText w:val="%1."/>
-      <w:lvlJc w:val="left"/>
-      <w:pPr>
-        <w:tabs>
-          <w:tab w:val="num" w:pos="720"/>
-        </w:tabs>
-        <w:ind w:left="720" w:hanging="360"/>
-      </w:pPr>
-    </w:lvl>
-    <w:lvl w:ilvl="1">
-      <w:start w:val="1"/>
-      <w:numFmt w:val="bullet"/>
-      <w:lvlText w:val="o"/>
-      <w:lvlJc w:val="left"/>
-      <w:pPr>
-        <w:tabs>
-          <w:tab w:val="num" w:pos="1440"/>
-        </w:tabs>
-        <w:ind w:left="1440" w:hanging="360"/>
-      </w:pPr>
-      <w:rPr>
-        <w:rFonts w:ascii="Courier New" w:hAnsi="Courier New" w:hint="default"/>
-        <w:sz w:val="20"/>
-      </w:rPr>
-    </w:lvl>
-    <w:lvl w:ilvl="2" w:tentative="1">
-      <w:start w:val="1"/>
-      <w:numFmt w:val="decimal"/>
-      <w:lvlText w:val="%3."/>
-      <w:lvlJc w:val="left"/>
-      <w:pPr>
-        <w:tabs>
-          <w:tab w:val="num" w:pos="2160"/>
-        </w:tabs>
-        <w:ind w:left="2160" w:hanging="360"/>
-      </w:pPr>
-    </w:lvl>
-    <w:lvl w:ilvl="3" w:tentative="1">
-      <w:start w:val="1"/>
-      <w:numFmt w:val="decimal"/>
-      <w:lvlText w:val="%4."/>
-      <w:lvlJc w:val="left"/>
-      <w:pPr>
-        <w:tabs>
-          <w:tab w:val="num" w:pos="2880"/>
-        </w:tabs>
-        <w:ind w:left="2880" w:hanging="360"/>
-      </w:pPr>
-    </w:lvl>
-    <w:lvl w:ilvl="4" w:tentative="1">
-      <w:start w:val="1"/>
-      <w:numFmt w:val="decimal"/>
-      <w:lvlText w:val="%5."/>
-      <w:lvlJc w:val="left"/>
-      <w:pPr>
-        <w:tabs>
-          <w:tab w:val="num" w:pos="3600"/>
-        </w:tabs>
-        <w:ind w:left="3600" w:hanging="360"/>
-      </w:pPr>
-    </w:lvl>
-    <w:lvl w:ilvl="5" w:tentative="1">
-      <w:start w:val="1"/>
-      <w:numFmt w:val="decimal"/>
-      <w:lvlText w:val="%6."/>
-      <w:lvlJc w:val="left"/>
-      <w:pPr>
-        <w:tabs>
-          <w:tab w:val="num" w:pos="4320"/>
-        </w:tabs>
-        <w:ind w:left="4320" w:hanging="360"/>
-      </w:pPr>
-    </w:lvl>
-    <w:lvl w:ilvl="6" w:tentative="1">
-      <w:start w:val="1"/>
-      <w:numFmt w:val="decimal"/>
-      <w:lvlText w:val="%7."/>
-      <w:lvlJc w:val="left"/>
-      <w:pPr>
-        <w:tabs>
-          <w:tab w:val="num" w:pos="5040"/>
-        </w:tabs>
-        <w:ind w:left="5040" w:hanging="360"/>
-      </w:pPr>
-    </w:lvl>
-    <w:lvl w:ilvl="7" w:tentative="1">
-      <w:start w:val="1"/>
-      <w:numFmt w:val="decimal"/>
-      <w:lvlText w:val="%8."/>
-      <w:lvlJc w:val="left"/>
-      <w:pPr>
-        <w:tabs>
-          <w:tab w:val="num" w:pos="5760"/>
-        </w:tabs>
-        <w:ind w:left="5760" w:hanging="360"/>
-      </w:pPr>
-    </w:lvl>
-    <w:lvl w:ilvl="8" w:tentative="1">
-      <w:start w:val="1"/>
-      <w:numFmt w:val="decimal"/>
-      <w:lvlText w:val="%9."/>
-      <w:lvlJc w:val="left"/>
-      <w:pPr>
-        <w:tabs>
-          <w:tab w:val="num" w:pos="6480"/>
-        </w:tabs>
-        <w:ind w:left="6480" w:hanging="360"/>
-      </w:pPr>
-    </w:lvl>
-  </w:abstractNum>
-  <w:abstractNum w:abstractNumId="5" w15:restartNumberingAfterBreak="0">
-    <w:nsid w:val="09EC4D98"/>
-    <w:multiLevelType w:val="multilevel"/>
-    <w:tmpl w:val="007C0C14"/>
-    <w:lvl w:ilvl="0">
-      <w:start w:val="1"/>
-      <w:numFmt w:val="decimal"/>
-      <w:lvlText w:val="%1."/>
-      <w:lvlJc w:val="left"/>
-      <w:pPr>
-        <w:tabs>
-          <w:tab w:val="num" w:pos="720"/>
-        </w:tabs>
-        <w:ind w:left="720" w:hanging="360"/>
-      </w:pPr>
-    </w:lvl>
-    <w:lvl w:ilvl="1" w:tentative="1">
-      <w:start w:val="1"/>
-      <w:numFmt w:val="decimal"/>
-      <w:lvlText w:val="%2."/>
-      <w:lvlJc w:val="left"/>
-      <w:pPr>
-        <w:tabs>
-          <w:tab w:val="num" w:pos="1440"/>
-        </w:tabs>
-        <w:ind w:left="1440" w:hanging="360"/>
-      </w:pPr>
-    </w:lvl>
-    <w:lvl w:ilvl="2" w:tentative="1">
-      <w:start w:val="1"/>
-      <w:numFmt w:val="decimal"/>
-      <w:lvlText w:val="%3."/>
-      <w:lvlJc w:val="left"/>
-      <w:pPr>
-        <w:tabs>
-          <w:tab w:val="num" w:pos="2160"/>
-        </w:tabs>
-        <w:ind w:left="2160" w:hanging="360"/>
-      </w:pPr>
-    </w:lvl>
-    <w:lvl w:ilvl="3" w:tentative="1">
-      <w:start w:val="1"/>
-      <w:numFmt w:val="decimal"/>
-      <w:lvlText w:val="%4."/>
-      <w:lvlJc w:val="left"/>
-      <w:pPr>
-        <w:tabs>
-          <w:tab w:val="num" w:pos="2880"/>
-        </w:tabs>
-        <w:ind w:left="2880" w:hanging="360"/>
-      </w:pPr>
-    </w:lvl>
-    <w:lvl w:ilvl="4" w:tentative="1">
-      <w:start w:val="1"/>
-      <w:numFmt w:val="decimal"/>
-      <w:lvlText w:val="%5."/>
-      <w:lvlJc w:val="left"/>
-      <w:pPr>
-        <w:tabs>
-          <w:tab w:val="num" w:pos="3600"/>
-        </w:tabs>
-        <w:ind w:left="3600" w:hanging="360"/>
-      </w:pPr>
-    </w:lvl>
-    <w:lvl w:ilvl="5" w:tentative="1">
-      <w:start w:val="1"/>
-      <w:numFmt w:val="decimal"/>
-      <w:lvlText w:val="%6."/>
-      <w:lvlJc w:val="left"/>
-      <w:pPr>
-        <w:tabs>
-          <w:tab w:val="num" w:pos="4320"/>
-        </w:tabs>
-        <w:ind w:left="4320" w:hanging="360"/>
-      </w:pPr>
-    </w:lvl>
-    <w:lvl w:ilvl="6" w:tentative="1">
-      <w:start w:val="1"/>
-      <w:numFmt w:val="decimal"/>
-      <w:lvlText w:val="%7."/>
-      <w:lvlJc w:val="left"/>
-      <w:pPr>
-        <w:tabs>
-          <w:tab w:val="num" w:pos="5040"/>
-        </w:tabs>
-        <w:ind w:left="5040" w:hanging="360"/>
-      </w:pPr>
-    </w:lvl>
-    <w:lvl w:ilvl="7" w:tentative="1">
-      <w:start w:val="1"/>
-      <w:numFmt w:val="decimal"/>
-      <w:lvlText w:val="%8."/>
-      <w:lvlJc w:val="left"/>
-      <w:pPr>
-        <w:tabs>
-          <w:tab w:val="num" w:pos="5760"/>
-        </w:tabs>
-        <w:ind w:left="5760" w:hanging="360"/>
-      </w:pPr>
-    </w:lvl>
-    <w:lvl w:ilvl="8" w:tentative="1">
-      <w:start w:val="1"/>
-      <w:numFmt w:val="decimal"/>
-      <w:lvlText w:val="%9."/>
-      <w:lvlJc w:val="left"/>
-      <w:pPr>
-        <w:tabs>
-          <w:tab w:val="num" w:pos="6480"/>
-        </w:tabs>
-        <w:ind w:left="6480" w:hanging="360"/>
-      </w:pPr>
-    </w:lvl>
-  </w:abstractNum>
-  <w:abstractNum w:abstractNumId="6" w15:restartNumberingAfterBreak="0">
     <w:nsid w:val="0A28612A"/>
     <w:multiLevelType w:val="multilevel"/>
     <w:tmpl w:val="C1FA4968"/>
+    <w:lvl w:ilvl="0">
+      <w:start w:val="1"/>
+      <w:numFmt w:val="bullet"/>
+      <w:lvlText w:val=""/>
+      <w:lvlJc w:val="left"/>
+      <w:pPr>
+        <w:tabs>
+          <w:tab w:val="num" w:pos="720"/>
+        </w:tabs>
+        <w:ind w:left="720" w:hanging="360"/>
+      </w:pPr>
+      <w:rPr>
+        <w:rFonts w:ascii="Symbol" w:hAnsi="Symbol" w:hint="default"/>
+        <w:sz w:val="20"/>
+      </w:rPr>
+    </w:lvl>
+    <w:lvl w:ilvl="1" w:tentative="1">
+      <w:start w:val="1"/>
+      <w:numFmt w:val="bullet"/>
+      <w:lvlText w:val="o"/>
+      <w:lvlJc w:val="left"/>
+      <w:pPr>
+        <w:tabs>
+          <w:tab w:val="num" w:pos="1440"/>
+        </w:tabs>
+        <w:ind w:left="1440" w:hanging="360"/>
+      </w:pPr>
+      <w:rPr>
+        <w:rFonts w:ascii="Courier New" w:hAnsi="Courier New" w:hint="default"/>
+        <w:sz w:val="20"/>
+      </w:rPr>
+    </w:lvl>
+    <w:lvl w:ilvl="2" w:tentative="1">
+      <w:start w:val="1"/>
+      <w:numFmt w:val="bullet"/>
+      <w:lvlText w:val=""/>
+      <w:lvlJc w:val="left"/>
+      <w:pPr>
+        <w:tabs>
+          <w:tab w:val="num" w:pos="2160"/>
+        </w:tabs>
+        <w:ind w:left="2160" w:hanging="360"/>
+      </w:pPr>
+      <w:rPr>
+        <w:rFonts w:ascii="Wingdings" w:hAnsi="Wingdings" w:hint="default"/>
+        <w:sz w:val="20"/>
+      </w:rPr>
+    </w:lvl>
+    <w:lvl w:ilvl="3" w:tentative="1">
+      <w:start w:val="1"/>
+      <w:numFmt w:val="bullet"/>
+      <w:lvlText w:val=""/>
+      <w:lvlJc w:val="left"/>
+      <w:pPr>
+        <w:tabs>
+          <w:tab w:val="num" w:pos="2880"/>
+        </w:tabs>
+        <w:ind w:left="2880" w:hanging="360"/>
+      </w:pPr>
+      <w:rPr>
+        <w:rFonts w:ascii="Wingdings" w:hAnsi="Wingdings" w:hint="default"/>
+        <w:sz w:val="20"/>
+      </w:rPr>
+    </w:lvl>
+    <w:lvl w:ilvl="4" w:tentative="1">
+      <w:start w:val="1"/>
+      <w:numFmt w:val="bullet"/>
+      <w:lvlText w:val=""/>
+      <w:lvlJc w:val="left"/>
+      <w:pPr>
+        <w:tabs>
+          <w:tab w:val="num" w:pos="3600"/>
+        </w:tabs>
+        <w:ind w:left="3600" w:hanging="360"/>
+      </w:pPr>
+      <w:rPr>
+        <w:rFonts w:ascii="Wingdings" w:hAnsi="Wingdings" w:hint="default"/>
+        <w:sz w:val="20"/>
+      </w:rPr>
+    </w:lvl>
+    <w:lvl w:ilvl="5" w:tentative="1">
+      <w:start w:val="1"/>
+      <w:numFmt w:val="bullet"/>
+      <w:lvlText w:val=""/>
+      <w:lvlJc w:val="left"/>
+      <w:pPr>
+        <w:tabs>
+          <w:tab w:val="num" w:pos="4320"/>
+        </w:tabs>
+        <w:ind w:left="4320" w:hanging="360"/>
+      </w:pPr>
+      <w:rPr>
+        <w:rFonts w:ascii="Wingdings" w:hAnsi="Wingdings" w:hint="default"/>
+        <w:sz w:val="20"/>
+      </w:rPr>
+    </w:lvl>
+    <w:lvl w:ilvl="6" w:tentative="1">
+      <w:start w:val="1"/>
+      <w:numFmt w:val="bullet"/>
+      <w:lvlText w:val=""/>
+      <w:lvlJc w:val="left"/>
+      <w:pPr>
+        <w:tabs>
+          <w:tab w:val="num" w:pos="5040"/>
+        </w:tabs>
+        <w:ind w:left="5040" w:hanging="360"/>
+      </w:pPr>
+      <w:rPr>
+        <w:rFonts w:ascii="Wingdings" w:hAnsi="Wingdings" w:hint="default"/>
+        <w:sz w:val="20"/>
+      </w:rPr>
+    </w:lvl>
+    <w:lvl w:ilvl="7" w:tentative="1">
+      <w:start w:val="1"/>
+      <w:numFmt w:val="bullet"/>
+      <w:lvlText w:val=""/>
+      <w:lvlJc w:val="left"/>
+      <w:pPr>
+        <w:tabs>
+          <w:tab w:val="num" w:pos="5760"/>
+        </w:tabs>
+        <w:ind w:left="5760" w:hanging="360"/>
+      </w:pPr>
+      <w:rPr>
+        <w:rFonts w:ascii="Wingdings" w:hAnsi="Wingdings" w:hint="default"/>
+        <w:sz w:val="20"/>
+      </w:rPr>
+    </w:lvl>
+    <w:lvl w:ilvl="8" w:tentative="1">
+      <w:start w:val="1"/>
+      <w:numFmt w:val="bullet"/>
+      <w:lvlText w:val=""/>
+      <w:lvlJc w:val="left"/>
+      <w:pPr>
+        <w:tabs>
+          <w:tab w:val="num" w:pos="6480"/>
+        </w:tabs>
+        <w:ind w:left="6480" w:hanging="360"/>
+      </w:pPr>
+      <w:rPr>
+        <w:rFonts w:ascii="Wingdings" w:hAnsi="Wingdings" w:hint="default"/>
+        <w:sz w:val="20"/>
+      </w:rPr>
+    </w:lvl>
+  </w:abstractNum>
+  <w:abstractNum w:abstractNumId="3" w15:restartNumberingAfterBreak="0">
+    <w:nsid w:val="124B79D5"/>
+    <w:multiLevelType w:val="multilevel"/>
+    <w:tmpl w:val="83722BAA"/>
+    <w:lvl w:ilvl="0">
+      <w:start w:val="1"/>
+      <w:numFmt w:val="bullet"/>
+      <w:lvlText w:val=""/>
+      <w:lvlJc w:val="left"/>
+      <w:pPr>
+        <w:tabs>
+          <w:tab w:val="num" w:pos="720"/>
+        </w:tabs>
+        <w:ind w:left="720" w:hanging="360"/>
+      </w:pPr>
+      <w:rPr>
+        <w:rFonts w:ascii="Symbol" w:hAnsi="Symbol" w:hint="default"/>
+        <w:sz w:val="20"/>
+      </w:rPr>
+    </w:lvl>
+    <w:lvl w:ilvl="1" w:tentative="1">
+      <w:start w:val="1"/>
+      <w:numFmt w:val="bullet"/>
+      <w:lvlText w:val="o"/>
+      <w:lvlJc w:val="left"/>
+      <w:pPr>
+        <w:tabs>
+          <w:tab w:val="num" w:pos="1440"/>
+        </w:tabs>
+        <w:ind w:left="1440" w:hanging="360"/>
+      </w:pPr>
+      <w:rPr>
+        <w:rFonts w:ascii="Courier New" w:hAnsi="Courier New" w:hint="default"/>
+        <w:sz w:val="20"/>
+      </w:rPr>
+    </w:lvl>
+    <w:lvl w:ilvl="2" w:tentative="1">
+      <w:start w:val="1"/>
+      <w:numFmt w:val="bullet"/>
+      <w:lvlText w:val=""/>
+      <w:lvlJc w:val="left"/>
+      <w:pPr>
+        <w:tabs>
+          <w:tab w:val="num" w:pos="2160"/>
+        </w:tabs>
+        <w:ind w:left="2160" w:hanging="360"/>
+      </w:pPr>
+      <w:rPr>
+        <w:rFonts w:ascii="Wingdings" w:hAnsi="Wingdings" w:hint="default"/>
+        <w:sz w:val="20"/>
+      </w:rPr>
+    </w:lvl>
+    <w:lvl w:ilvl="3" w:tentative="1">
+      <w:start w:val="1"/>
+      <w:numFmt w:val="bullet"/>
+      <w:lvlText w:val=""/>
+      <w:lvlJc w:val="left"/>
+      <w:pPr>
+        <w:tabs>
+          <w:tab w:val="num" w:pos="2880"/>
+        </w:tabs>
+        <w:ind w:left="2880" w:hanging="360"/>
+      </w:pPr>
+      <w:rPr>
+        <w:rFonts w:ascii="Wingdings" w:hAnsi="Wingdings" w:hint="default"/>
+        <w:sz w:val="20"/>
+      </w:rPr>
+    </w:lvl>
+    <w:lvl w:ilvl="4" w:tentative="1">
+      <w:start w:val="1"/>
+      <w:numFmt w:val="bullet"/>
+      <w:lvlText w:val=""/>
+      <w:lvlJc w:val="left"/>
+      <w:pPr>
+        <w:tabs>
+          <w:tab w:val="num" w:pos="3600"/>
+        </w:tabs>
+        <w:ind w:left="3600" w:hanging="360"/>
+      </w:pPr>
+      <w:rPr>
+        <w:rFonts w:ascii="Wingdings" w:hAnsi="Wingdings" w:hint="default"/>
+        <w:sz w:val="20"/>
+      </w:rPr>
+    </w:lvl>
+    <w:lvl w:ilvl="5" w:tentative="1">
+      <w:start w:val="1"/>
+      <w:numFmt w:val="bullet"/>
+      <w:lvlText w:val=""/>
+      <w:lvlJc w:val="left"/>
+      <w:pPr>
+        <w:tabs>
+          <w:tab w:val="num" w:pos="4320"/>
+        </w:tabs>
+        <w:ind w:left="4320" w:hanging="360"/>
+      </w:pPr>
+      <w:rPr>
+        <w:rFonts w:ascii="Wingdings" w:hAnsi="Wingdings" w:hint="default"/>
+        <w:sz w:val="20"/>
+      </w:rPr>
+    </w:lvl>
+    <w:lvl w:ilvl="6" w:tentative="1">
+      <w:start w:val="1"/>
+      <w:numFmt w:val="bullet"/>
+      <w:lvlText w:val=""/>
+      <w:lvlJc w:val="left"/>
+      <w:pPr>
+        <w:tabs>
+          <w:tab w:val="num" w:pos="5040"/>
+        </w:tabs>
+        <w:ind w:left="5040" w:hanging="360"/>
+      </w:pPr>
+      <w:rPr>
+        <w:rFonts w:ascii="Wingdings" w:hAnsi="Wingdings" w:hint="default"/>
+        <w:sz w:val="20"/>
+      </w:rPr>
+    </w:lvl>
+    <w:lvl w:ilvl="7" w:tentative="1">
+      <w:start w:val="1"/>
+      <w:numFmt w:val="bullet"/>
+      <w:lvlText w:val=""/>
+      <w:lvlJc w:val="left"/>
+      <w:pPr>
+        <w:tabs>
+          <w:tab w:val="num" w:pos="5760"/>
+        </w:tabs>
+        <w:ind w:left="5760" w:hanging="360"/>
+      </w:pPr>
+      <w:rPr>
+        <w:rFonts w:ascii="Wingdings" w:hAnsi="Wingdings" w:hint="default"/>
+        <w:sz w:val="20"/>
+      </w:rPr>
+    </w:lvl>
+    <w:lvl w:ilvl="8" w:tentative="1">
+      <w:start w:val="1"/>
+      <w:numFmt w:val="bullet"/>
+      <w:lvlText w:val=""/>
+      <w:lvlJc w:val="left"/>
+      <w:pPr>
+        <w:tabs>
+          <w:tab w:val="num" w:pos="6480"/>
+        </w:tabs>
+        <w:ind w:left="6480" w:hanging="360"/>
+      </w:pPr>
+      <w:rPr>
+        <w:rFonts w:ascii="Wingdings" w:hAnsi="Wingdings" w:hint="default"/>
+        <w:sz w:val="20"/>
+      </w:rPr>
+    </w:lvl>
+  </w:abstractNum>
+  <w:abstractNum w:abstractNumId="4" w15:restartNumberingAfterBreak="0">
+    <w:nsid w:val="14065839"/>
+    <w:multiLevelType w:val="multilevel"/>
+    <w:tmpl w:val="979A5526"/>
+    <w:lvl w:ilvl="0">
+      <w:start w:val="1"/>
+      <w:numFmt w:val="bullet"/>
+      <w:lvlText w:val=""/>
+      <w:lvlJc w:val="left"/>
+      <w:pPr>
+        <w:tabs>
+          <w:tab w:val="num" w:pos="720"/>
+        </w:tabs>
+        <w:ind w:left="720" w:hanging="360"/>
+      </w:pPr>
+      <w:rPr>
+        <w:rFonts w:ascii="Symbol" w:hAnsi="Symbol" w:hint="default"/>
+        <w:sz w:val="20"/>
+      </w:rPr>
+    </w:lvl>
+    <w:lvl w:ilvl="1" w:tentative="1">
+      <w:start w:val="1"/>
+      <w:numFmt w:val="bullet"/>
+      <w:lvlText w:val="o"/>
+      <w:lvlJc w:val="left"/>
+      <w:pPr>
+        <w:tabs>
+          <w:tab w:val="num" w:pos="1440"/>
+        </w:tabs>
+        <w:ind w:left="1440" w:hanging="360"/>
+      </w:pPr>
+      <w:rPr>
+        <w:rFonts w:ascii="Courier New" w:hAnsi="Courier New" w:hint="default"/>
+        <w:sz w:val="20"/>
+      </w:rPr>
+    </w:lvl>
+    <w:lvl w:ilvl="2" w:tentative="1">
+      <w:start w:val="1"/>
+      <w:numFmt w:val="bullet"/>
+      <w:lvlText w:val=""/>
+      <w:lvlJc w:val="left"/>
+      <w:pPr>
+        <w:tabs>
+          <w:tab w:val="num" w:pos="2160"/>
+        </w:tabs>
+        <w:ind w:left="2160" w:hanging="360"/>
+      </w:pPr>
+      <w:rPr>
+        <w:rFonts w:ascii="Wingdings" w:hAnsi="Wingdings" w:hint="default"/>
+        <w:sz w:val="20"/>
+      </w:rPr>
+    </w:lvl>
+    <w:lvl w:ilvl="3" w:tentative="1">
+      <w:start w:val="1"/>
+      <w:numFmt w:val="bullet"/>
+      <w:lvlText w:val=""/>
+      <w:lvlJc w:val="left"/>
+      <w:pPr>
+        <w:tabs>
+          <w:tab w:val="num" w:pos="2880"/>
+        </w:tabs>
+        <w:ind w:left="2880" w:hanging="360"/>
+      </w:pPr>
+      <w:rPr>
+        <w:rFonts w:ascii="Wingdings" w:hAnsi="Wingdings" w:hint="default"/>
+        <w:sz w:val="20"/>
+      </w:rPr>
+    </w:lvl>
+    <w:lvl w:ilvl="4" w:tentative="1">
+      <w:start w:val="1"/>
+      <w:numFmt w:val="bullet"/>
+      <w:lvlText w:val=""/>
+      <w:lvlJc w:val="left"/>
+      <w:pPr>
+        <w:tabs>
+          <w:tab w:val="num" w:pos="3600"/>
+        </w:tabs>
+        <w:ind w:left="3600" w:hanging="360"/>
+      </w:pPr>
+      <w:rPr>
+        <w:rFonts w:ascii="Wingdings" w:hAnsi="Wingdings" w:hint="default"/>
+        <w:sz w:val="20"/>
+      </w:rPr>
+    </w:lvl>
+    <w:lvl w:ilvl="5" w:tentative="1">
+      <w:start w:val="1"/>
+      <w:numFmt w:val="bullet"/>
+      <w:lvlText w:val=""/>
+      <w:lvlJc w:val="left"/>
+      <w:pPr>
+        <w:tabs>
+          <w:tab w:val="num" w:pos="4320"/>
+        </w:tabs>
+        <w:ind w:left="4320" w:hanging="360"/>
+      </w:pPr>
+      <w:rPr>
+        <w:rFonts w:ascii="Wingdings" w:hAnsi="Wingdings" w:hint="default"/>
+        <w:sz w:val="20"/>
+      </w:rPr>
+    </w:lvl>
+    <w:lvl w:ilvl="6" w:tentative="1">
+      <w:start w:val="1"/>
+      <w:numFmt w:val="bullet"/>
+      <w:lvlText w:val=""/>
+      <w:lvlJc w:val="left"/>
+      <w:pPr>
+        <w:tabs>
+          <w:tab w:val="num" w:pos="5040"/>
+        </w:tabs>
+        <w:ind w:left="5040" w:hanging="360"/>
+      </w:pPr>
+      <w:rPr>
+        <w:rFonts w:ascii="Wingdings" w:hAnsi="Wingdings" w:hint="default"/>
+        <w:sz w:val="20"/>
+      </w:rPr>
+    </w:lvl>
+    <w:lvl w:ilvl="7" w:tentative="1">
+      <w:start w:val="1"/>
+      <w:numFmt w:val="bullet"/>
+      <w:lvlText w:val=""/>
+      <w:lvlJc w:val="left"/>
+      <w:pPr>
+        <w:tabs>
+          <w:tab w:val="num" w:pos="5760"/>
+        </w:tabs>
+        <w:ind w:left="5760" w:hanging="360"/>
+      </w:pPr>
+      <w:rPr>
+        <w:rFonts w:ascii="Wingdings" w:hAnsi="Wingdings" w:hint="default"/>
+        <w:sz w:val="20"/>
+      </w:rPr>
+    </w:lvl>
+    <w:lvl w:ilvl="8" w:tentative="1">
+      <w:start w:val="1"/>
+      <w:numFmt w:val="bullet"/>
+      <w:lvlText w:val=""/>
+      <w:lvlJc w:val="left"/>
+      <w:pPr>
+        <w:tabs>
+          <w:tab w:val="num" w:pos="6480"/>
+        </w:tabs>
+        <w:ind w:left="6480" w:hanging="360"/>
+      </w:pPr>
+      <w:rPr>
+        <w:rFonts w:ascii="Wingdings" w:hAnsi="Wingdings" w:hint="default"/>
+        <w:sz w:val="20"/>
+      </w:rPr>
+    </w:lvl>
+  </w:abstractNum>
+  <w:abstractNum w:abstractNumId="5" w15:restartNumberingAfterBreak="0">
+    <w:nsid w:val="1BE8500F"/>
+    <w:multiLevelType w:val="multilevel"/>
+    <w:tmpl w:val="0D6AF60E"/>
+    <w:lvl w:ilvl="0">
+      <w:start w:val="1"/>
+      <w:numFmt w:val="decimal"/>
+      <w:lvlText w:val="%1."/>
+      <w:lvlJc w:val="left"/>
+      <w:pPr>
+        <w:tabs>
+          <w:tab w:val="num" w:pos="720"/>
+        </w:tabs>
+        <w:ind w:left="720" w:hanging="360"/>
+      </w:pPr>
+    </w:lvl>
+    <w:lvl w:ilvl="1" w:tentative="1">
+      <w:start w:val="1"/>
+      <w:numFmt w:val="decimal"/>
+      <w:lvlText w:val="%2."/>
+      <w:lvlJc w:val="left"/>
+      <w:pPr>
+        <w:tabs>
+          <w:tab w:val="num" w:pos="1440"/>
+        </w:tabs>
+        <w:ind w:left="1440" w:hanging="360"/>
+      </w:pPr>
+    </w:lvl>
+    <w:lvl w:ilvl="2" w:tentative="1">
+      <w:start w:val="1"/>
+      <w:numFmt w:val="decimal"/>
+      <w:lvlText w:val="%3."/>
+      <w:lvlJc w:val="left"/>
+      <w:pPr>
+        <w:tabs>
+          <w:tab w:val="num" w:pos="2160"/>
+        </w:tabs>
+        <w:ind w:left="2160" w:hanging="360"/>
+      </w:pPr>
+    </w:lvl>
+    <w:lvl w:ilvl="3" w:tentative="1">
+      <w:start w:val="1"/>
+      <w:numFmt w:val="decimal"/>
+      <w:lvlText w:val="%4."/>
+      <w:lvlJc w:val="left"/>
+      <w:pPr>
+        <w:tabs>
+          <w:tab w:val="num" w:pos="2880"/>
+        </w:tabs>
+        <w:ind w:left="2880" w:hanging="360"/>
+      </w:pPr>
+    </w:lvl>
+    <w:lvl w:ilvl="4" w:tentative="1">
+      <w:start w:val="1"/>
+      <w:numFmt w:val="decimal"/>
+      <w:lvlText w:val="%5."/>
+      <w:lvlJc w:val="left"/>
+      <w:pPr>
+        <w:tabs>
+          <w:tab w:val="num" w:pos="3600"/>
+        </w:tabs>
+        <w:ind w:left="3600" w:hanging="360"/>
+      </w:pPr>
+    </w:lvl>
+    <w:lvl w:ilvl="5" w:tentative="1">
+      <w:start w:val="1"/>
+      <w:numFmt w:val="decimal"/>
+      <w:lvlText w:val="%6."/>
+      <w:lvlJc w:val="left"/>
+      <w:pPr>
+        <w:tabs>
+          <w:tab w:val="num" w:pos="4320"/>
+        </w:tabs>
+        <w:ind w:left="4320" w:hanging="360"/>
+      </w:pPr>
+    </w:lvl>
+    <w:lvl w:ilvl="6" w:tentative="1">
+      <w:start w:val="1"/>
+      <w:numFmt w:val="decimal"/>
+      <w:lvlText w:val="%7."/>
+      <w:lvlJc w:val="left"/>
+      <w:pPr>
+        <w:tabs>
+          <w:tab w:val="num" w:pos="5040"/>
+        </w:tabs>
+        <w:ind w:left="5040" w:hanging="360"/>
+      </w:pPr>
+    </w:lvl>
+    <w:lvl w:ilvl="7" w:tentative="1">
+      <w:start w:val="1"/>
+      <w:numFmt w:val="decimal"/>
+      <w:lvlText w:val="%8."/>
+      <w:lvlJc w:val="left"/>
+      <w:pPr>
+        <w:tabs>
+          <w:tab w:val="num" w:pos="5760"/>
+        </w:tabs>
+        <w:ind w:left="5760" w:hanging="360"/>
+      </w:pPr>
+    </w:lvl>
+    <w:lvl w:ilvl="8" w:tentative="1">
+      <w:start w:val="1"/>
+      <w:numFmt w:val="decimal"/>
+      <w:lvlText w:val="%9."/>
+      <w:lvlJc w:val="left"/>
+      <w:pPr>
+        <w:tabs>
+          <w:tab w:val="num" w:pos="6480"/>
+        </w:tabs>
+        <w:ind w:left="6480" w:hanging="360"/>
+      </w:pPr>
+    </w:lvl>
+  </w:abstractNum>
+  <w:abstractNum w:abstractNumId="6" w15:restartNumberingAfterBreak="0">
+    <w:nsid w:val="1EE20886"/>
+    <w:multiLevelType w:val="multilevel"/>
+    <w:tmpl w:val="5CCC9B2C"/>
     <w:lvl w:ilvl="0">
       <w:start w:val="1"/>
       <w:numFmt w:val="bullet"/>
@@ -3819,13 +3920,13 @@
     </w:lvl>
   </w:abstractNum>
   <w:abstractNum w:abstractNumId="8" w15:restartNumberingAfterBreak="0">
-    <w:nsid w:val="22490D95"/>
+    <w:nsid w:val="21556136"/>
     <w:multiLevelType w:val="multilevel"/>
-    <w:tmpl w:val="A1744888"/>
+    <w:tmpl w:val="5262D5B6"/>
     <w:lvl w:ilvl="0">
-      <w:start w:val="1"/>
-      <w:numFmt w:val="bullet"/>
-      <w:lvlText w:val=""/>
+      <w:start w:val="2"/>
+      <w:numFmt w:val="decimal"/>
+      <w:lvlText w:val="%1."/>
       <w:lvlJc w:val="left"/>
       <w:pPr>
         <w:tabs>
@@ -3833,12 +3934,8 @@
         </w:tabs>
         <w:ind w:left="720" w:hanging="360"/>
       </w:pPr>
-      <w:rPr>
-        <w:rFonts w:ascii="Symbol" w:hAnsi="Symbol" w:hint="default"/>
-        <w:sz w:val="20"/>
-      </w:rPr>
-    </w:lvl>
-    <w:lvl w:ilvl="1" w:tentative="1">
+    </w:lvl>
+    <w:lvl w:ilvl="1">
       <w:start w:val="1"/>
       <w:numFmt w:val="bullet"/>
       <w:lvlText w:val="o"/>
@@ -3856,8 +3953,8 @@
     </w:lvl>
     <w:lvl w:ilvl="2" w:tentative="1">
       <w:start w:val="1"/>
-      <w:numFmt w:val="bullet"/>
-      <w:lvlText w:val=""/>
+      <w:numFmt w:val="decimal"/>
+      <w:lvlText w:val="%3."/>
       <w:lvlJc w:val="left"/>
       <w:pPr>
         <w:tabs>
@@ -3865,15 +3962,11 @@
         </w:tabs>
         <w:ind w:left="2160" w:hanging="360"/>
       </w:pPr>
-      <w:rPr>
-        <w:rFonts w:ascii="Wingdings" w:hAnsi="Wingdings" w:hint="default"/>
-        <w:sz w:val="20"/>
-      </w:rPr>
     </w:lvl>
     <w:lvl w:ilvl="3" w:tentative="1">
       <w:start w:val="1"/>
-      <w:numFmt w:val="bullet"/>
-      <w:lvlText w:val=""/>
+      <w:numFmt w:val="decimal"/>
+      <w:lvlText w:val="%4."/>
       <w:lvlJc w:val="left"/>
       <w:pPr>
         <w:tabs>
@@ -3881,15 +3974,11 @@
         </w:tabs>
         <w:ind w:left="2880" w:hanging="360"/>
       </w:pPr>
-      <w:rPr>
-        <w:rFonts w:ascii="Wingdings" w:hAnsi="Wingdings" w:hint="default"/>
-        <w:sz w:val="20"/>
-      </w:rPr>
     </w:lvl>
     <w:lvl w:ilvl="4" w:tentative="1">
       <w:start w:val="1"/>
-      <w:numFmt w:val="bullet"/>
-      <w:lvlText w:val=""/>
+      <w:numFmt w:val="decimal"/>
+      <w:lvlText w:val="%5."/>
       <w:lvlJc w:val="left"/>
       <w:pPr>
         <w:tabs>
@@ -3897,15 +3986,11 @@
         </w:tabs>
         <w:ind w:left="3600" w:hanging="360"/>
       </w:pPr>
-      <w:rPr>
-        <w:rFonts w:ascii="Wingdings" w:hAnsi="Wingdings" w:hint="default"/>
-        <w:sz w:val="20"/>
-      </w:rPr>
     </w:lvl>
     <w:lvl w:ilvl="5" w:tentative="1">
       <w:start w:val="1"/>
-      <w:numFmt w:val="bullet"/>
-      <w:lvlText w:val=""/>
+      <w:numFmt w:val="decimal"/>
+      <w:lvlText w:val="%6."/>
       <w:lvlJc w:val="left"/>
       <w:pPr>
         <w:tabs>
@@ -3913,15 +3998,11 @@
         </w:tabs>
         <w:ind w:left="4320" w:hanging="360"/>
       </w:pPr>
-      <w:rPr>
-        <w:rFonts w:ascii="Wingdings" w:hAnsi="Wingdings" w:hint="default"/>
-        <w:sz w:val="20"/>
-      </w:rPr>
     </w:lvl>
     <w:lvl w:ilvl="6" w:tentative="1">
       <w:start w:val="1"/>
-      <w:numFmt w:val="bullet"/>
-      <w:lvlText w:val=""/>
+      <w:numFmt w:val="decimal"/>
+      <w:lvlText w:val="%7."/>
       <w:lvlJc w:val="left"/>
       <w:pPr>
         <w:tabs>
@@ -3929,15 +4010,11 @@
         </w:tabs>
         <w:ind w:left="5040" w:hanging="360"/>
       </w:pPr>
-      <w:rPr>
-        <w:rFonts w:ascii="Wingdings" w:hAnsi="Wingdings" w:hint="default"/>
-        <w:sz w:val="20"/>
-      </w:rPr>
     </w:lvl>
     <w:lvl w:ilvl="7" w:tentative="1">
       <w:start w:val="1"/>
-      <w:numFmt w:val="bullet"/>
-      <w:lvlText w:val=""/>
+      <w:numFmt w:val="decimal"/>
+      <w:lvlText w:val="%8."/>
       <w:lvlJc w:val="left"/>
       <w:pPr>
         <w:tabs>
@@ -3945,15 +4022,11 @@
         </w:tabs>
         <w:ind w:left="5760" w:hanging="360"/>
       </w:pPr>
-      <w:rPr>
-        <w:rFonts w:ascii="Wingdings" w:hAnsi="Wingdings" w:hint="default"/>
-        <w:sz w:val="20"/>
-      </w:rPr>
     </w:lvl>
     <w:lvl w:ilvl="8" w:tentative="1">
       <w:start w:val="1"/>
-      <w:numFmt w:val="bullet"/>
-      <w:lvlText w:val=""/>
+      <w:numFmt w:val="decimal"/>
+      <w:lvlText w:val="%9."/>
       <w:lvlJc w:val="left"/>
       <w:pPr>
         <w:tabs>
@@ -3961,10 +4034,6 @@
         </w:tabs>
         <w:ind w:left="6480" w:hanging="360"/>
       </w:pPr>
-      <w:rPr>
-        <w:rFonts w:ascii="Wingdings" w:hAnsi="Wingdings" w:hint="default"/>
-        <w:sz w:val="20"/>
-      </w:rPr>
     </w:lvl>
   </w:abstractNum>
   <w:abstractNum w:abstractNumId="9" w15:restartNumberingAfterBreak="0">
@@ -4081,6 +4150,155 @@
     </w:lvl>
   </w:abstractNum>
   <w:abstractNum w:abstractNumId="10" w15:restartNumberingAfterBreak="0">
+    <w:nsid w:val="26EA09B4"/>
+    <w:multiLevelType w:val="multilevel"/>
+    <w:tmpl w:val="EC7AC6E0"/>
+    <w:lvl w:ilvl="0">
+      <w:start w:val="1"/>
+      <w:numFmt w:val="bullet"/>
+      <w:lvlText w:val=""/>
+      <w:lvlJc w:val="left"/>
+      <w:pPr>
+        <w:tabs>
+          <w:tab w:val="num" w:pos="720"/>
+        </w:tabs>
+        <w:ind w:left="720" w:hanging="360"/>
+      </w:pPr>
+      <w:rPr>
+        <w:rFonts w:ascii="Symbol" w:hAnsi="Symbol" w:hint="default"/>
+        <w:sz w:val="20"/>
+      </w:rPr>
+    </w:lvl>
+    <w:lvl w:ilvl="1" w:tentative="1">
+      <w:start w:val="1"/>
+      <w:numFmt w:val="bullet"/>
+      <w:lvlText w:val="o"/>
+      <w:lvlJc w:val="left"/>
+      <w:pPr>
+        <w:tabs>
+          <w:tab w:val="num" w:pos="1440"/>
+        </w:tabs>
+        <w:ind w:left="1440" w:hanging="360"/>
+      </w:pPr>
+      <w:rPr>
+        <w:rFonts w:ascii="Courier New" w:hAnsi="Courier New" w:hint="default"/>
+        <w:sz w:val="20"/>
+      </w:rPr>
+    </w:lvl>
+    <w:lvl w:ilvl="2" w:tentative="1">
+      <w:start w:val="1"/>
+      <w:numFmt w:val="bullet"/>
+      <w:lvlText w:val=""/>
+      <w:lvlJc w:val="left"/>
+      <w:pPr>
+        <w:tabs>
+          <w:tab w:val="num" w:pos="2160"/>
+        </w:tabs>
+        <w:ind w:left="2160" w:hanging="360"/>
+      </w:pPr>
+      <w:rPr>
+        <w:rFonts w:ascii="Wingdings" w:hAnsi="Wingdings" w:hint="default"/>
+        <w:sz w:val="20"/>
+      </w:rPr>
+    </w:lvl>
+    <w:lvl w:ilvl="3" w:tentative="1">
+      <w:start w:val="1"/>
+      <w:numFmt w:val="bullet"/>
+      <w:lvlText w:val=""/>
+      <w:lvlJc w:val="left"/>
+      <w:pPr>
+        <w:tabs>
+          <w:tab w:val="num" w:pos="2880"/>
+        </w:tabs>
+        <w:ind w:left="2880" w:hanging="360"/>
+      </w:pPr>
+      <w:rPr>
+        <w:rFonts w:ascii="Wingdings" w:hAnsi="Wingdings" w:hint="default"/>
+        <w:sz w:val="20"/>
+      </w:rPr>
+    </w:lvl>
+    <w:lvl w:ilvl="4" w:tentative="1">
+      <w:start w:val="1"/>
+      <w:numFmt w:val="bullet"/>
+      <w:lvlText w:val=""/>
+      <w:lvlJc w:val="left"/>
+      <w:pPr>
+        <w:tabs>
+          <w:tab w:val="num" w:pos="3600"/>
+        </w:tabs>
+        <w:ind w:left="3600" w:hanging="360"/>
+      </w:pPr>
+      <w:rPr>
+        <w:rFonts w:ascii="Wingdings" w:hAnsi="Wingdings" w:hint="default"/>
+        <w:sz w:val="20"/>
+      </w:rPr>
+    </w:lvl>
+    <w:lvl w:ilvl="5" w:tentative="1">
+      <w:start w:val="1"/>
+      <w:numFmt w:val="bullet"/>
+      <w:lvlText w:val=""/>
+      <w:lvlJc w:val="left"/>
+      <w:pPr>
+        <w:tabs>
+          <w:tab w:val="num" w:pos="4320"/>
+        </w:tabs>
+        <w:ind w:left="4320" w:hanging="360"/>
+      </w:pPr>
+      <w:rPr>
+        <w:rFonts w:ascii="Wingdings" w:hAnsi="Wingdings" w:hint="default"/>
+        <w:sz w:val="20"/>
+      </w:rPr>
+    </w:lvl>
+    <w:lvl w:ilvl="6" w:tentative="1">
+      <w:start w:val="1"/>
+      <w:numFmt w:val="bullet"/>
+      <w:lvlText w:val=""/>
+      <w:lvlJc w:val="left"/>
+      <w:pPr>
+        <w:tabs>
+          <w:tab w:val="num" w:pos="5040"/>
+        </w:tabs>
+        <w:ind w:left="5040" w:hanging="360"/>
+      </w:pPr>
+      <w:rPr>
+        <w:rFonts w:ascii="Wingdings" w:hAnsi="Wingdings" w:hint="default"/>
+        <w:sz w:val="20"/>
+      </w:rPr>
+    </w:lvl>
+    <w:lvl w:ilvl="7" w:tentative="1">
+      <w:start w:val="1"/>
+      <w:numFmt w:val="bullet"/>
+      <w:lvlText w:val=""/>
+      <w:lvlJc w:val="left"/>
+      <w:pPr>
+        <w:tabs>
+          <w:tab w:val="num" w:pos="5760"/>
+        </w:tabs>
+        <w:ind w:left="5760" w:hanging="360"/>
+      </w:pPr>
+      <w:rPr>
+        <w:rFonts w:ascii="Wingdings" w:hAnsi="Wingdings" w:hint="default"/>
+        <w:sz w:val="20"/>
+      </w:rPr>
+    </w:lvl>
+    <w:lvl w:ilvl="8" w:tentative="1">
+      <w:start w:val="1"/>
+      <w:numFmt w:val="bullet"/>
+      <w:lvlText w:val=""/>
+      <w:lvlJc w:val="left"/>
+      <w:pPr>
+        <w:tabs>
+          <w:tab w:val="num" w:pos="6480"/>
+        </w:tabs>
+        <w:ind w:left="6480" w:hanging="360"/>
+      </w:pPr>
+      <w:rPr>
+        <w:rFonts w:ascii="Wingdings" w:hAnsi="Wingdings" w:hint="default"/>
+        <w:sz w:val="20"/>
+      </w:rPr>
+    </w:lvl>
+  </w:abstractNum>
+  <w:abstractNum w:abstractNumId="11" w15:restartNumberingAfterBreak="0">
     <w:nsid w:val="2978086B"/>
     <w:multiLevelType w:val="multilevel"/>
     <w:tmpl w:val="61D23D66"/>
@@ -4229,14 +4447,14 @@
       </w:rPr>
     </w:lvl>
   </w:abstractNum>
-  <w:abstractNum w:abstractNumId="11" w15:restartNumberingAfterBreak="0">
-    <w:nsid w:val="2FB74AF7"/>
+  <w:abstractNum w:abstractNumId="12" w15:restartNumberingAfterBreak="0">
+    <w:nsid w:val="31664114"/>
     <w:multiLevelType w:val="multilevel"/>
-    <w:tmpl w:val="3BF8F068"/>
+    <w:tmpl w:val="CF86C7AE"/>
     <w:lvl w:ilvl="0">
       <w:start w:val="1"/>
-      <w:numFmt w:val="decimal"/>
-      <w:lvlText w:val="%1."/>
+      <w:numFmt w:val="bullet"/>
+      <w:lvlText w:val=""/>
       <w:lvlJc w:val="left"/>
       <w:pPr>
         <w:tabs>
@@ -4244,11 +4462,15 @@
         </w:tabs>
         <w:ind w:left="720" w:hanging="360"/>
       </w:pPr>
+      <w:rPr>
+        <w:rFonts w:ascii="Symbol" w:hAnsi="Symbol" w:hint="default"/>
+        <w:sz w:val="20"/>
+      </w:rPr>
     </w:lvl>
     <w:lvl w:ilvl="1" w:tentative="1">
       <w:start w:val="1"/>
-      <w:numFmt w:val="decimal"/>
-      <w:lvlText w:val="%2."/>
+      <w:numFmt w:val="bullet"/>
+      <w:lvlText w:val="o"/>
       <w:lvlJc w:val="left"/>
       <w:pPr>
         <w:tabs>
@@ -4256,11 +4478,15 @@
         </w:tabs>
         <w:ind w:left="1440" w:hanging="360"/>
       </w:pPr>
+      <w:rPr>
+        <w:rFonts w:ascii="Courier New" w:hAnsi="Courier New" w:hint="default"/>
+        <w:sz w:val="20"/>
+      </w:rPr>
     </w:lvl>
     <w:lvl w:ilvl="2" w:tentative="1">
       <w:start w:val="1"/>
-      <w:numFmt w:val="decimal"/>
-      <w:lvlText w:val="%3."/>
+      <w:numFmt w:val="bullet"/>
+      <w:lvlText w:val=""/>
       <w:lvlJc w:val="left"/>
       <w:pPr>
         <w:tabs>
@@ -4268,11 +4494,15 @@
         </w:tabs>
         <w:ind w:left="2160" w:hanging="360"/>
       </w:pPr>
+      <w:rPr>
+        <w:rFonts w:ascii="Wingdings" w:hAnsi="Wingdings" w:hint="default"/>
+        <w:sz w:val="20"/>
+      </w:rPr>
     </w:lvl>
     <w:lvl w:ilvl="3" w:tentative="1">
       <w:start w:val="1"/>
-      <w:numFmt w:val="decimal"/>
-      <w:lvlText w:val="%4."/>
+      <w:numFmt w:val="bullet"/>
+      <w:lvlText w:val=""/>
       <w:lvlJc w:val="left"/>
       <w:pPr>
         <w:tabs>
@@ -4280,11 +4510,15 @@
         </w:tabs>
         <w:ind w:left="2880" w:hanging="360"/>
       </w:pPr>
+      <w:rPr>
+        <w:rFonts w:ascii="Wingdings" w:hAnsi="Wingdings" w:hint="default"/>
+        <w:sz w:val="20"/>
+      </w:rPr>
     </w:lvl>
     <w:lvl w:ilvl="4" w:tentative="1">
       <w:start w:val="1"/>
-      <w:numFmt w:val="decimal"/>
-      <w:lvlText w:val="%5."/>
+      <w:numFmt w:val="bullet"/>
+      <w:lvlText w:val=""/>
       <w:lvlJc w:val="left"/>
       <w:pPr>
         <w:tabs>
@@ -4292,11 +4526,15 @@
         </w:tabs>
         <w:ind w:left="3600" w:hanging="360"/>
       </w:pPr>
+      <w:rPr>
+        <w:rFonts w:ascii="Wingdings" w:hAnsi="Wingdings" w:hint="default"/>
+        <w:sz w:val="20"/>
+      </w:rPr>
     </w:lvl>
     <w:lvl w:ilvl="5" w:tentative="1">
       <w:start w:val="1"/>
-      <w:numFmt w:val="decimal"/>
-      <w:lvlText w:val="%6."/>
+      <w:numFmt w:val="bullet"/>
+      <w:lvlText w:val=""/>
       <w:lvlJc w:val="left"/>
       <w:pPr>
         <w:tabs>
@@ -4304,11 +4542,15 @@
         </w:tabs>
         <w:ind w:left="4320" w:hanging="360"/>
       </w:pPr>
+      <w:rPr>
+        <w:rFonts w:ascii="Wingdings" w:hAnsi="Wingdings" w:hint="default"/>
+        <w:sz w:val="20"/>
+      </w:rPr>
     </w:lvl>
     <w:lvl w:ilvl="6" w:tentative="1">
       <w:start w:val="1"/>
-      <w:numFmt w:val="decimal"/>
-      <w:lvlText w:val="%7."/>
+      <w:numFmt w:val="bullet"/>
+      <w:lvlText w:val=""/>
       <w:lvlJc w:val="left"/>
       <w:pPr>
         <w:tabs>
@@ -4316,11 +4558,15 @@
         </w:tabs>
         <w:ind w:left="5040" w:hanging="360"/>
       </w:pPr>
+      <w:rPr>
+        <w:rFonts w:ascii="Wingdings" w:hAnsi="Wingdings" w:hint="default"/>
+        <w:sz w:val="20"/>
+      </w:rPr>
     </w:lvl>
     <w:lvl w:ilvl="7" w:tentative="1">
       <w:start w:val="1"/>
-      <w:numFmt w:val="decimal"/>
-      <w:lvlText w:val="%8."/>
+      <w:numFmt w:val="bullet"/>
+      <w:lvlText w:val=""/>
       <w:lvlJc w:val="left"/>
       <w:pPr>
         <w:tabs>
@@ -4328,11 +4574,15 @@
         </w:tabs>
         <w:ind w:left="5760" w:hanging="360"/>
       </w:pPr>
+      <w:rPr>
+        <w:rFonts w:ascii="Wingdings" w:hAnsi="Wingdings" w:hint="default"/>
+        <w:sz w:val="20"/>
+      </w:rPr>
     </w:lvl>
     <w:lvl w:ilvl="8" w:tentative="1">
       <w:start w:val="1"/>
-      <w:numFmt w:val="decimal"/>
-      <w:lvlText w:val="%9."/>
+      <w:numFmt w:val="bullet"/>
+      <w:lvlText w:val=""/>
       <w:lvlJc w:val="left"/>
       <w:pPr>
         <w:tabs>
@@ -4340,105 +4590,20 @@
         </w:tabs>
         <w:ind w:left="6480" w:hanging="360"/>
       </w:pPr>
-    </w:lvl>
-  </w:abstractNum>
-  <w:abstractNum w:abstractNumId="12" w15:restartNumberingAfterBreak="0">
-    <w:nsid w:val="320A5CCA"/>
-    <w:multiLevelType w:val="hybridMultilevel"/>
-    <w:tmpl w:val="AB28959A"/>
-    <w:lvl w:ilvl="0" w:tplc="0416000F">
-      <w:start w:val="1"/>
-      <w:numFmt w:val="decimal"/>
-      <w:lvlText w:val="%1."/>
-      <w:lvlJc w:val="left"/>
-      <w:pPr>
-        <w:ind w:left="720" w:hanging="360"/>
-      </w:pPr>
-      <w:rPr>
-        <w:rFonts w:hint="default"/>
-      </w:rPr>
-    </w:lvl>
-    <w:lvl w:ilvl="1" w:tplc="04160019" w:tentative="1">
-      <w:start w:val="1"/>
-      <w:numFmt w:val="lowerLetter"/>
-      <w:lvlText w:val="%2."/>
-      <w:lvlJc w:val="left"/>
-      <w:pPr>
-        <w:ind w:left="1440" w:hanging="360"/>
-      </w:pPr>
-    </w:lvl>
-    <w:lvl w:ilvl="2" w:tplc="0416001B" w:tentative="1">
-      <w:start w:val="1"/>
-      <w:numFmt w:val="lowerRoman"/>
-      <w:lvlText w:val="%3."/>
-      <w:lvlJc w:val="right"/>
-      <w:pPr>
-        <w:ind w:left="2160" w:hanging="180"/>
-      </w:pPr>
-    </w:lvl>
-    <w:lvl w:ilvl="3" w:tplc="0416000F" w:tentative="1">
-      <w:start w:val="1"/>
-      <w:numFmt w:val="decimal"/>
-      <w:lvlText w:val="%4."/>
-      <w:lvlJc w:val="left"/>
-      <w:pPr>
-        <w:ind w:left="2880" w:hanging="360"/>
-      </w:pPr>
-    </w:lvl>
-    <w:lvl w:ilvl="4" w:tplc="04160019" w:tentative="1">
-      <w:start w:val="1"/>
-      <w:numFmt w:val="lowerLetter"/>
-      <w:lvlText w:val="%5."/>
-      <w:lvlJc w:val="left"/>
-      <w:pPr>
-        <w:ind w:left="3600" w:hanging="360"/>
-      </w:pPr>
-    </w:lvl>
-    <w:lvl w:ilvl="5" w:tplc="0416001B" w:tentative="1">
-      <w:start w:val="1"/>
-      <w:numFmt w:val="lowerRoman"/>
-      <w:lvlText w:val="%6."/>
-      <w:lvlJc w:val="right"/>
-      <w:pPr>
-        <w:ind w:left="4320" w:hanging="180"/>
-      </w:pPr>
-    </w:lvl>
-    <w:lvl w:ilvl="6" w:tplc="0416000F" w:tentative="1">
-      <w:start w:val="1"/>
-      <w:numFmt w:val="decimal"/>
-      <w:lvlText w:val="%7."/>
-      <w:lvlJc w:val="left"/>
-      <w:pPr>
-        <w:ind w:left="5040" w:hanging="360"/>
-      </w:pPr>
-    </w:lvl>
-    <w:lvl w:ilvl="7" w:tplc="04160019" w:tentative="1">
-      <w:start w:val="1"/>
-      <w:numFmt w:val="lowerLetter"/>
-      <w:lvlText w:val="%8."/>
-      <w:lvlJc w:val="left"/>
-      <w:pPr>
-        <w:ind w:left="5760" w:hanging="360"/>
-      </w:pPr>
-    </w:lvl>
-    <w:lvl w:ilvl="8" w:tplc="0416001B" w:tentative="1">
-      <w:start w:val="1"/>
-      <w:numFmt w:val="lowerRoman"/>
-      <w:lvlText w:val="%9."/>
-      <w:lvlJc w:val="right"/>
-      <w:pPr>
-        <w:ind w:left="6480" w:hanging="180"/>
-      </w:pPr>
+      <w:rPr>
+        <w:rFonts w:ascii="Wingdings" w:hAnsi="Wingdings" w:hint="default"/>
+        <w:sz w:val="20"/>
+      </w:rPr>
     </w:lvl>
   </w:abstractNum>
   <w:abstractNum w:abstractNumId="13" w15:restartNumberingAfterBreak="0">
-    <w:nsid w:val="341B237F"/>
+    <w:nsid w:val="34A61548"/>
     <w:multiLevelType w:val="multilevel"/>
-    <w:tmpl w:val="0492B7BC"/>
+    <w:tmpl w:val="5176873A"/>
     <w:lvl w:ilvl="0">
       <w:start w:val="1"/>
-      <w:numFmt w:val="decimal"/>
-      <w:lvlText w:val="%1."/>
+      <w:numFmt w:val="bullet"/>
+      <w:lvlText w:val=""/>
       <w:lvlJc w:val="left"/>
       <w:pPr>
         <w:tabs>
@@ -4446,11 +4611,15 @@
         </w:tabs>
         <w:ind w:left="720" w:hanging="360"/>
       </w:pPr>
+      <w:rPr>
+        <w:rFonts w:ascii="Symbol" w:hAnsi="Symbol" w:hint="default"/>
+        <w:sz w:val="20"/>
+      </w:rPr>
     </w:lvl>
     <w:lvl w:ilvl="1" w:tentative="1">
       <w:start w:val="1"/>
-      <w:numFmt w:val="decimal"/>
-      <w:lvlText w:val="%2."/>
+      <w:numFmt w:val="bullet"/>
+      <w:lvlText w:val="o"/>
       <w:lvlJc w:val="left"/>
       <w:pPr>
         <w:tabs>
@@ -4458,11 +4627,15 @@
         </w:tabs>
         <w:ind w:left="1440" w:hanging="360"/>
       </w:pPr>
+      <w:rPr>
+        <w:rFonts w:ascii="Courier New" w:hAnsi="Courier New" w:hint="default"/>
+        <w:sz w:val="20"/>
+      </w:rPr>
     </w:lvl>
     <w:lvl w:ilvl="2" w:tentative="1">
       <w:start w:val="1"/>
-      <w:numFmt w:val="decimal"/>
-      <w:lvlText w:val="%3."/>
+      <w:numFmt w:val="bullet"/>
+      <w:lvlText w:val=""/>
       <w:lvlJc w:val="left"/>
       <w:pPr>
         <w:tabs>
@@ -4470,11 +4643,15 @@
         </w:tabs>
         <w:ind w:left="2160" w:hanging="360"/>
       </w:pPr>
+      <w:rPr>
+        <w:rFonts w:ascii="Wingdings" w:hAnsi="Wingdings" w:hint="default"/>
+        <w:sz w:val="20"/>
+      </w:rPr>
     </w:lvl>
     <w:lvl w:ilvl="3" w:tentative="1">
       <w:start w:val="1"/>
-      <w:numFmt w:val="decimal"/>
-      <w:lvlText w:val="%4."/>
+      <w:numFmt w:val="bullet"/>
+      <w:lvlText w:val=""/>
       <w:lvlJc w:val="left"/>
       <w:pPr>
         <w:tabs>
@@ -4482,11 +4659,15 @@
         </w:tabs>
         <w:ind w:left="2880" w:hanging="360"/>
       </w:pPr>
+      <w:rPr>
+        <w:rFonts w:ascii="Wingdings" w:hAnsi="Wingdings" w:hint="default"/>
+        <w:sz w:val="20"/>
+      </w:rPr>
     </w:lvl>
     <w:lvl w:ilvl="4" w:tentative="1">
       <w:start w:val="1"/>
-      <w:numFmt w:val="decimal"/>
-      <w:lvlText w:val="%5."/>
+      <w:numFmt w:val="bullet"/>
+      <w:lvlText w:val=""/>
       <w:lvlJc w:val="left"/>
       <w:pPr>
         <w:tabs>
@@ -4494,11 +4675,15 @@
         </w:tabs>
         <w:ind w:left="3600" w:hanging="360"/>
       </w:pPr>
+      <w:rPr>
+        <w:rFonts w:ascii="Wingdings" w:hAnsi="Wingdings" w:hint="default"/>
+        <w:sz w:val="20"/>
+      </w:rPr>
     </w:lvl>
     <w:lvl w:ilvl="5" w:tentative="1">
       <w:start w:val="1"/>
-      <w:numFmt w:val="decimal"/>
-      <w:lvlText w:val="%6."/>
+      <w:numFmt w:val="bullet"/>
+      <w:lvlText w:val=""/>
       <w:lvlJc w:val="left"/>
       <w:pPr>
         <w:tabs>
@@ -4506,11 +4691,15 @@
         </w:tabs>
         <w:ind w:left="4320" w:hanging="360"/>
       </w:pPr>
+      <w:rPr>
+        <w:rFonts w:ascii="Wingdings" w:hAnsi="Wingdings" w:hint="default"/>
+        <w:sz w:val="20"/>
+      </w:rPr>
     </w:lvl>
     <w:lvl w:ilvl="6" w:tentative="1">
       <w:start w:val="1"/>
-      <w:numFmt w:val="decimal"/>
-      <w:lvlText w:val="%7."/>
+      <w:numFmt w:val="bullet"/>
+      <w:lvlText w:val=""/>
       <w:lvlJc w:val="left"/>
       <w:pPr>
         <w:tabs>
@@ -4518,11 +4707,15 @@
         </w:tabs>
         <w:ind w:left="5040" w:hanging="360"/>
       </w:pPr>
+      <w:rPr>
+        <w:rFonts w:ascii="Wingdings" w:hAnsi="Wingdings" w:hint="default"/>
+        <w:sz w:val="20"/>
+      </w:rPr>
     </w:lvl>
     <w:lvl w:ilvl="7" w:tentative="1">
       <w:start w:val="1"/>
-      <w:numFmt w:val="decimal"/>
-      <w:lvlText w:val="%8."/>
+      <w:numFmt w:val="bullet"/>
+      <w:lvlText w:val=""/>
       <w:lvlJc w:val="left"/>
       <w:pPr>
         <w:tabs>
@@ -4530,11 +4723,15 @@
         </w:tabs>
         <w:ind w:left="5760" w:hanging="360"/>
       </w:pPr>
+      <w:rPr>
+        <w:rFonts w:ascii="Wingdings" w:hAnsi="Wingdings" w:hint="default"/>
+        <w:sz w:val="20"/>
+      </w:rPr>
     </w:lvl>
     <w:lvl w:ilvl="8" w:tentative="1">
       <w:start w:val="1"/>
-      <w:numFmt w:val="decimal"/>
-      <w:lvlText w:val="%9."/>
+      <w:numFmt w:val="bullet"/>
+      <w:lvlText w:val=""/>
       <w:lvlJc w:val="left"/>
       <w:pPr>
         <w:tabs>
@@ -4542,12 +4739,16 @@
         </w:tabs>
         <w:ind w:left="6480" w:hanging="360"/>
       </w:pPr>
+      <w:rPr>
+        <w:rFonts w:ascii="Wingdings" w:hAnsi="Wingdings" w:hint="default"/>
+        <w:sz w:val="20"/>
+      </w:rPr>
     </w:lvl>
   </w:abstractNum>
   <w:abstractNum w:abstractNumId="14" w15:restartNumberingAfterBreak="0">
-    <w:nsid w:val="34446337"/>
+    <w:nsid w:val="34BA73CA"/>
     <w:multiLevelType w:val="multilevel"/>
-    <w:tmpl w:val="0AB8B3EA"/>
+    <w:tmpl w:val="952E9128"/>
     <w:lvl w:ilvl="0">
       <w:start w:val="1"/>
       <w:numFmt w:val="bullet"/>
@@ -4694,6 +4895,155 @@
     </w:lvl>
   </w:abstractNum>
   <w:abstractNum w:abstractNumId="15" w15:restartNumberingAfterBreak="0">
+    <w:nsid w:val="37476940"/>
+    <w:multiLevelType w:val="multilevel"/>
+    <w:tmpl w:val="255EF7B2"/>
+    <w:lvl w:ilvl="0">
+      <w:start w:val="1"/>
+      <w:numFmt w:val="bullet"/>
+      <w:lvlText w:val=""/>
+      <w:lvlJc w:val="left"/>
+      <w:pPr>
+        <w:tabs>
+          <w:tab w:val="num" w:pos="720"/>
+        </w:tabs>
+        <w:ind w:left="720" w:hanging="360"/>
+      </w:pPr>
+      <w:rPr>
+        <w:rFonts w:ascii="Symbol" w:hAnsi="Symbol" w:hint="default"/>
+        <w:sz w:val="20"/>
+      </w:rPr>
+    </w:lvl>
+    <w:lvl w:ilvl="1" w:tentative="1">
+      <w:start w:val="1"/>
+      <w:numFmt w:val="bullet"/>
+      <w:lvlText w:val="o"/>
+      <w:lvlJc w:val="left"/>
+      <w:pPr>
+        <w:tabs>
+          <w:tab w:val="num" w:pos="1440"/>
+        </w:tabs>
+        <w:ind w:left="1440" w:hanging="360"/>
+      </w:pPr>
+      <w:rPr>
+        <w:rFonts w:ascii="Courier New" w:hAnsi="Courier New" w:hint="default"/>
+        <w:sz w:val="20"/>
+      </w:rPr>
+    </w:lvl>
+    <w:lvl w:ilvl="2" w:tentative="1">
+      <w:start w:val="1"/>
+      <w:numFmt w:val="bullet"/>
+      <w:lvlText w:val=""/>
+      <w:lvlJc w:val="left"/>
+      <w:pPr>
+        <w:tabs>
+          <w:tab w:val="num" w:pos="2160"/>
+        </w:tabs>
+        <w:ind w:left="2160" w:hanging="360"/>
+      </w:pPr>
+      <w:rPr>
+        <w:rFonts w:ascii="Wingdings" w:hAnsi="Wingdings" w:hint="default"/>
+        <w:sz w:val="20"/>
+      </w:rPr>
+    </w:lvl>
+    <w:lvl w:ilvl="3" w:tentative="1">
+      <w:start w:val="1"/>
+      <w:numFmt w:val="bullet"/>
+      <w:lvlText w:val=""/>
+      <w:lvlJc w:val="left"/>
+      <w:pPr>
+        <w:tabs>
+          <w:tab w:val="num" w:pos="2880"/>
+        </w:tabs>
+        <w:ind w:left="2880" w:hanging="360"/>
+      </w:pPr>
+      <w:rPr>
+        <w:rFonts w:ascii="Wingdings" w:hAnsi="Wingdings" w:hint="default"/>
+        <w:sz w:val="20"/>
+      </w:rPr>
+    </w:lvl>
+    <w:lvl w:ilvl="4" w:tentative="1">
+      <w:start w:val="1"/>
+      <w:numFmt w:val="bullet"/>
+      <w:lvlText w:val=""/>
+      <w:lvlJc w:val="left"/>
+      <w:pPr>
+        <w:tabs>
+          <w:tab w:val="num" w:pos="3600"/>
+        </w:tabs>
+        <w:ind w:left="3600" w:hanging="360"/>
+      </w:pPr>
+      <w:rPr>
+        <w:rFonts w:ascii="Wingdings" w:hAnsi="Wingdings" w:hint="default"/>
+        <w:sz w:val="20"/>
+      </w:rPr>
+    </w:lvl>
+    <w:lvl w:ilvl="5" w:tentative="1">
+      <w:start w:val="1"/>
+      <w:numFmt w:val="bullet"/>
+      <w:lvlText w:val=""/>
+      <w:lvlJc w:val="left"/>
+      <w:pPr>
+        <w:tabs>
+          <w:tab w:val="num" w:pos="4320"/>
+        </w:tabs>
+        <w:ind w:left="4320" w:hanging="360"/>
+      </w:pPr>
+      <w:rPr>
+        <w:rFonts w:ascii="Wingdings" w:hAnsi="Wingdings" w:hint="default"/>
+        <w:sz w:val="20"/>
+      </w:rPr>
+    </w:lvl>
+    <w:lvl w:ilvl="6" w:tentative="1">
+      <w:start w:val="1"/>
+      <w:numFmt w:val="bullet"/>
+      <w:lvlText w:val=""/>
+      <w:lvlJc w:val="left"/>
+      <w:pPr>
+        <w:tabs>
+          <w:tab w:val="num" w:pos="5040"/>
+        </w:tabs>
+        <w:ind w:left="5040" w:hanging="360"/>
+      </w:pPr>
+      <w:rPr>
+        <w:rFonts w:ascii="Wingdings" w:hAnsi="Wingdings" w:hint="default"/>
+        <w:sz w:val="20"/>
+      </w:rPr>
+    </w:lvl>
+    <w:lvl w:ilvl="7" w:tentative="1">
+      <w:start w:val="1"/>
+      <w:numFmt w:val="bullet"/>
+      <w:lvlText w:val=""/>
+      <w:lvlJc w:val="left"/>
+      <w:pPr>
+        <w:tabs>
+          <w:tab w:val="num" w:pos="5760"/>
+        </w:tabs>
+        <w:ind w:left="5760" w:hanging="360"/>
+      </w:pPr>
+      <w:rPr>
+        <w:rFonts w:ascii="Wingdings" w:hAnsi="Wingdings" w:hint="default"/>
+        <w:sz w:val="20"/>
+      </w:rPr>
+    </w:lvl>
+    <w:lvl w:ilvl="8" w:tentative="1">
+      <w:start w:val="1"/>
+      <w:numFmt w:val="bullet"/>
+      <w:lvlText w:val=""/>
+      <w:lvlJc w:val="left"/>
+      <w:pPr>
+        <w:tabs>
+          <w:tab w:val="num" w:pos="6480"/>
+        </w:tabs>
+        <w:ind w:left="6480" w:hanging="360"/>
+      </w:pPr>
+      <w:rPr>
+        <w:rFonts w:ascii="Wingdings" w:hAnsi="Wingdings" w:hint="default"/>
+        <w:sz w:val="20"/>
+      </w:rPr>
+    </w:lvl>
+  </w:abstractNum>
+  <w:abstractNum w:abstractNumId="16" w15:restartNumberingAfterBreak="0">
     <w:nsid w:val="3D995CF3"/>
     <w:multiLevelType w:val="multilevel"/>
     <w:tmpl w:val="54B88552"/>
@@ -4842,7 +5192,7 @@
       </w:rPr>
     </w:lvl>
   </w:abstractNum>
-  <w:abstractNum w:abstractNumId="16" w15:restartNumberingAfterBreak="0">
+  <w:abstractNum w:abstractNumId="17" w15:restartNumberingAfterBreak="0">
     <w:nsid w:val="3DBD35CB"/>
     <w:multiLevelType w:val="multilevel"/>
     <w:tmpl w:val="E8E8D0FC"/>
@@ -4991,96 +5341,156 @@
       </w:rPr>
     </w:lvl>
   </w:abstractNum>
-  <w:abstractNum w:abstractNumId="17" w15:restartNumberingAfterBreak="0">
-    <w:nsid w:val="3FD167AC"/>
-    <w:multiLevelType w:val="hybridMultilevel"/>
-    <w:tmpl w:val="72D6F040"/>
-    <w:lvl w:ilvl="0" w:tplc="0416000F">
-      <w:start w:val="1"/>
-      <w:numFmt w:val="decimal"/>
-      <w:lvlText w:val="%1."/>
-      <w:lvlJc w:val="left"/>
-      <w:pPr>
+  <w:abstractNum w:abstractNumId="18" w15:restartNumberingAfterBreak="0">
+    <w:nsid w:val="3E1F75A4"/>
+    <w:multiLevelType w:val="multilevel"/>
+    <w:tmpl w:val="CA6E8A68"/>
+    <w:lvl w:ilvl="0">
+      <w:start w:val="1"/>
+      <w:numFmt w:val="bullet"/>
+      <w:lvlText w:val=""/>
+      <w:lvlJc w:val="left"/>
+      <w:pPr>
+        <w:tabs>
+          <w:tab w:val="num" w:pos="720"/>
+        </w:tabs>
         <w:ind w:left="720" w:hanging="360"/>
       </w:pPr>
       <w:rPr>
-        <w:rFonts w:hint="default"/>
-      </w:rPr>
-    </w:lvl>
-    <w:lvl w:ilvl="1" w:tplc="04160019" w:tentative="1">
-      <w:start w:val="1"/>
-      <w:numFmt w:val="lowerLetter"/>
-      <w:lvlText w:val="%2."/>
-      <w:lvlJc w:val="left"/>
-      <w:pPr>
+        <w:rFonts w:ascii="Symbol" w:hAnsi="Symbol" w:hint="default"/>
+        <w:sz w:val="20"/>
+      </w:rPr>
+    </w:lvl>
+    <w:lvl w:ilvl="1" w:tentative="1">
+      <w:start w:val="1"/>
+      <w:numFmt w:val="bullet"/>
+      <w:lvlText w:val="o"/>
+      <w:lvlJc w:val="left"/>
+      <w:pPr>
+        <w:tabs>
+          <w:tab w:val="num" w:pos="1440"/>
+        </w:tabs>
         <w:ind w:left="1440" w:hanging="360"/>
       </w:pPr>
-    </w:lvl>
-    <w:lvl w:ilvl="2" w:tplc="0416001B" w:tentative="1">
-      <w:start w:val="1"/>
-      <w:numFmt w:val="lowerRoman"/>
-      <w:lvlText w:val="%3."/>
-      <w:lvlJc w:val="right"/>
-      <w:pPr>
-        <w:ind w:left="2160" w:hanging="180"/>
-      </w:pPr>
-    </w:lvl>
-    <w:lvl w:ilvl="3" w:tplc="0416000F" w:tentative="1">
-      <w:start w:val="1"/>
-      <w:numFmt w:val="decimal"/>
-      <w:lvlText w:val="%4."/>
-      <w:lvlJc w:val="left"/>
-      <w:pPr>
+      <w:rPr>
+        <w:rFonts w:ascii="Courier New" w:hAnsi="Courier New" w:hint="default"/>
+        <w:sz w:val="20"/>
+      </w:rPr>
+    </w:lvl>
+    <w:lvl w:ilvl="2" w:tentative="1">
+      <w:start w:val="1"/>
+      <w:numFmt w:val="bullet"/>
+      <w:lvlText w:val=""/>
+      <w:lvlJc w:val="left"/>
+      <w:pPr>
+        <w:tabs>
+          <w:tab w:val="num" w:pos="2160"/>
+        </w:tabs>
+        <w:ind w:left="2160" w:hanging="360"/>
+      </w:pPr>
+      <w:rPr>
+        <w:rFonts w:ascii="Wingdings" w:hAnsi="Wingdings" w:hint="default"/>
+        <w:sz w:val="20"/>
+      </w:rPr>
+    </w:lvl>
+    <w:lvl w:ilvl="3" w:tentative="1">
+      <w:start w:val="1"/>
+      <w:numFmt w:val="bullet"/>
+      <w:lvlText w:val=""/>
+      <w:lvlJc w:val="left"/>
+      <w:pPr>
+        <w:tabs>
+          <w:tab w:val="num" w:pos="2880"/>
+        </w:tabs>
         <w:ind w:left="2880" w:hanging="360"/>
       </w:pPr>
-    </w:lvl>
-    <w:lvl w:ilvl="4" w:tplc="04160019" w:tentative="1">
-      <w:start w:val="1"/>
-      <w:numFmt w:val="lowerLetter"/>
-      <w:lvlText w:val="%5."/>
-      <w:lvlJc w:val="left"/>
-      <w:pPr>
+      <w:rPr>
+        <w:rFonts w:ascii="Wingdings" w:hAnsi="Wingdings" w:hint="default"/>
+        <w:sz w:val="20"/>
+      </w:rPr>
+    </w:lvl>
+    <w:lvl w:ilvl="4" w:tentative="1">
+      <w:start w:val="1"/>
+      <w:numFmt w:val="bullet"/>
+      <w:lvlText w:val=""/>
+      <w:lvlJc w:val="left"/>
+      <w:pPr>
+        <w:tabs>
+          <w:tab w:val="num" w:pos="3600"/>
+        </w:tabs>
         <w:ind w:left="3600" w:hanging="360"/>
       </w:pPr>
-    </w:lvl>
-    <w:lvl w:ilvl="5" w:tplc="0416001B" w:tentative="1">
-      <w:start w:val="1"/>
-      <w:numFmt w:val="lowerRoman"/>
-      <w:lvlText w:val="%6."/>
-      <w:lvlJc w:val="right"/>
-      <w:pPr>
-        <w:ind w:left="4320" w:hanging="180"/>
-      </w:pPr>
-    </w:lvl>
-    <w:lvl w:ilvl="6" w:tplc="0416000F" w:tentative="1">
-      <w:start w:val="1"/>
-      <w:numFmt w:val="decimal"/>
-      <w:lvlText w:val="%7."/>
-      <w:lvlJc w:val="left"/>
-      <w:pPr>
+      <w:rPr>
+        <w:rFonts w:ascii="Wingdings" w:hAnsi="Wingdings" w:hint="default"/>
+        <w:sz w:val="20"/>
+      </w:rPr>
+    </w:lvl>
+    <w:lvl w:ilvl="5" w:tentative="1">
+      <w:start w:val="1"/>
+      <w:numFmt w:val="bullet"/>
+      <w:lvlText w:val=""/>
+      <w:lvlJc w:val="left"/>
+      <w:pPr>
+        <w:tabs>
+          <w:tab w:val="num" w:pos="4320"/>
+        </w:tabs>
+        <w:ind w:left="4320" w:hanging="360"/>
+      </w:pPr>
+      <w:rPr>
+        <w:rFonts w:ascii="Wingdings" w:hAnsi="Wingdings" w:hint="default"/>
+        <w:sz w:val="20"/>
+      </w:rPr>
+    </w:lvl>
+    <w:lvl w:ilvl="6" w:tentative="1">
+      <w:start w:val="1"/>
+      <w:numFmt w:val="bullet"/>
+      <w:lvlText w:val=""/>
+      <w:lvlJc w:val="left"/>
+      <w:pPr>
+        <w:tabs>
+          <w:tab w:val="num" w:pos="5040"/>
+        </w:tabs>
         <w:ind w:left="5040" w:hanging="360"/>
       </w:pPr>
-    </w:lvl>
-    <w:lvl w:ilvl="7" w:tplc="04160019" w:tentative="1">
-      <w:start w:val="1"/>
-      <w:numFmt w:val="lowerLetter"/>
-      <w:lvlText w:val="%8."/>
-      <w:lvlJc w:val="left"/>
-      <w:pPr>
+      <w:rPr>
+        <w:rFonts w:ascii="Wingdings" w:hAnsi="Wingdings" w:hint="default"/>
+        <w:sz w:val="20"/>
+      </w:rPr>
+    </w:lvl>
+    <w:lvl w:ilvl="7" w:tentative="1">
+      <w:start w:val="1"/>
+      <w:numFmt w:val="bullet"/>
+      <w:lvlText w:val=""/>
+      <w:lvlJc w:val="left"/>
+      <w:pPr>
+        <w:tabs>
+          <w:tab w:val="num" w:pos="5760"/>
+        </w:tabs>
         <w:ind w:left="5760" w:hanging="360"/>
       </w:pPr>
-    </w:lvl>
-    <w:lvl w:ilvl="8" w:tplc="0416001B" w:tentative="1">
-      <w:start w:val="1"/>
-      <w:numFmt w:val="lowerRoman"/>
-      <w:lvlText w:val="%9."/>
-      <w:lvlJc w:val="right"/>
-      <w:pPr>
-        <w:ind w:left="6480" w:hanging="180"/>
-      </w:pPr>
+      <w:rPr>
+        <w:rFonts w:ascii="Wingdings" w:hAnsi="Wingdings" w:hint="default"/>
+        <w:sz w:val="20"/>
+      </w:rPr>
+    </w:lvl>
+    <w:lvl w:ilvl="8" w:tentative="1">
+      <w:start w:val="1"/>
+      <w:numFmt w:val="bullet"/>
+      <w:lvlText w:val=""/>
+      <w:lvlJc w:val="left"/>
+      <w:pPr>
+        <w:tabs>
+          <w:tab w:val="num" w:pos="6480"/>
+        </w:tabs>
+        <w:ind w:left="6480" w:hanging="360"/>
+      </w:pPr>
+      <w:rPr>
+        <w:rFonts w:ascii="Wingdings" w:hAnsi="Wingdings" w:hint="default"/>
+        <w:sz w:val="20"/>
+      </w:rPr>
     </w:lvl>
   </w:abstractNum>
-  <w:abstractNum w:abstractNumId="18" w15:restartNumberingAfterBreak="0">
+  <w:abstractNum w:abstractNumId="19" w15:restartNumberingAfterBreak="0">
     <w:nsid w:val="436007F7"/>
     <w:multiLevelType w:val="multilevel"/>
     <w:tmpl w:val="9B00E6FC"/>
@@ -5229,10 +5639,10 @@
       </w:rPr>
     </w:lvl>
   </w:abstractNum>
-  <w:abstractNum w:abstractNumId="19" w15:restartNumberingAfterBreak="0">
-    <w:nsid w:val="43944D57"/>
+  <w:abstractNum w:abstractNumId="20" w15:restartNumberingAfterBreak="0">
+    <w:nsid w:val="490F7812"/>
     <w:multiLevelType w:val="multilevel"/>
-    <w:tmpl w:val="8EE46C26"/>
+    <w:tmpl w:val="1E2A9630"/>
     <w:lvl w:ilvl="0">
       <w:start w:val="1"/>
       <w:numFmt w:val="bullet"/>
@@ -5376,187 +5786,9 @@
         <w:rFonts w:ascii="Wingdings" w:hAnsi="Wingdings" w:hint="default"/>
         <w:sz w:val="20"/>
       </w:rPr>
-    </w:lvl>
-  </w:abstractNum>
-  <w:abstractNum w:abstractNumId="20" w15:restartNumberingAfterBreak="0">
-    <w:nsid w:val="443608A6"/>
-    <w:multiLevelType w:val="hybridMultilevel"/>
-    <w:tmpl w:val="54AA8CBC"/>
-    <w:lvl w:ilvl="0" w:tplc="04160019">
-      <w:start w:val="1"/>
-      <w:numFmt w:val="lowerLetter"/>
-      <w:lvlText w:val="%1."/>
-      <w:lvlJc w:val="left"/>
-      <w:pPr>
-        <w:ind w:left="720" w:hanging="360"/>
-      </w:pPr>
-      <w:rPr>
-        <w:rFonts w:hint="default"/>
-      </w:rPr>
-    </w:lvl>
-    <w:lvl w:ilvl="1" w:tplc="04160019" w:tentative="1">
-      <w:start w:val="1"/>
-      <w:numFmt w:val="lowerLetter"/>
-      <w:lvlText w:val="%2."/>
-      <w:lvlJc w:val="left"/>
-      <w:pPr>
-        <w:ind w:left="1440" w:hanging="360"/>
-      </w:pPr>
-    </w:lvl>
-    <w:lvl w:ilvl="2" w:tplc="0416001B" w:tentative="1">
-      <w:start w:val="1"/>
-      <w:numFmt w:val="lowerRoman"/>
-      <w:lvlText w:val="%3."/>
-      <w:lvlJc w:val="right"/>
-      <w:pPr>
-        <w:ind w:left="2160" w:hanging="180"/>
-      </w:pPr>
-    </w:lvl>
-    <w:lvl w:ilvl="3" w:tplc="0416000F" w:tentative="1">
-      <w:start w:val="1"/>
-      <w:numFmt w:val="decimal"/>
-      <w:lvlText w:val="%4."/>
-      <w:lvlJc w:val="left"/>
-      <w:pPr>
-        <w:ind w:left="2880" w:hanging="360"/>
-      </w:pPr>
-    </w:lvl>
-    <w:lvl w:ilvl="4" w:tplc="04160019" w:tentative="1">
-      <w:start w:val="1"/>
-      <w:numFmt w:val="lowerLetter"/>
-      <w:lvlText w:val="%5."/>
-      <w:lvlJc w:val="left"/>
-      <w:pPr>
-        <w:ind w:left="3600" w:hanging="360"/>
-      </w:pPr>
-    </w:lvl>
-    <w:lvl w:ilvl="5" w:tplc="0416001B" w:tentative="1">
-      <w:start w:val="1"/>
-      <w:numFmt w:val="lowerRoman"/>
-      <w:lvlText w:val="%6."/>
-      <w:lvlJc w:val="right"/>
-      <w:pPr>
-        <w:ind w:left="4320" w:hanging="180"/>
-      </w:pPr>
-    </w:lvl>
-    <w:lvl w:ilvl="6" w:tplc="0416000F" w:tentative="1">
-      <w:start w:val="1"/>
-      <w:numFmt w:val="decimal"/>
-      <w:lvlText w:val="%7."/>
-      <w:lvlJc w:val="left"/>
-      <w:pPr>
-        <w:ind w:left="5040" w:hanging="360"/>
-      </w:pPr>
-    </w:lvl>
-    <w:lvl w:ilvl="7" w:tplc="04160019" w:tentative="1">
-      <w:start w:val="1"/>
-      <w:numFmt w:val="lowerLetter"/>
-      <w:lvlText w:val="%8."/>
-      <w:lvlJc w:val="left"/>
-      <w:pPr>
-        <w:ind w:left="5760" w:hanging="360"/>
-      </w:pPr>
-    </w:lvl>
-    <w:lvl w:ilvl="8" w:tplc="0416001B" w:tentative="1">
-      <w:start w:val="1"/>
-      <w:numFmt w:val="lowerRoman"/>
-      <w:lvlText w:val="%9."/>
-      <w:lvlJc w:val="right"/>
-      <w:pPr>
-        <w:ind w:left="6480" w:hanging="180"/>
-      </w:pPr>
     </w:lvl>
   </w:abstractNum>
   <w:abstractNum w:abstractNumId="21" w15:restartNumberingAfterBreak="0">
-    <w:nsid w:val="49D23352"/>
-    <w:multiLevelType w:val="hybridMultilevel"/>
-    <w:tmpl w:val="CC347B28"/>
-    <w:lvl w:ilvl="0" w:tplc="0416000F">
-      <w:start w:val="1"/>
-      <w:numFmt w:val="decimal"/>
-      <w:lvlText w:val="%1."/>
-      <w:lvlJc w:val="left"/>
-      <w:pPr>
-        <w:ind w:left="720" w:hanging="360"/>
-      </w:pPr>
-      <w:rPr>
-        <w:rFonts w:hint="default"/>
-      </w:rPr>
-    </w:lvl>
-    <w:lvl w:ilvl="1" w:tplc="04160019" w:tentative="1">
-      <w:start w:val="1"/>
-      <w:numFmt w:val="lowerLetter"/>
-      <w:lvlText w:val="%2."/>
-      <w:lvlJc w:val="left"/>
-      <w:pPr>
-        <w:ind w:left="1440" w:hanging="360"/>
-      </w:pPr>
-    </w:lvl>
-    <w:lvl w:ilvl="2" w:tplc="0416001B" w:tentative="1">
-      <w:start w:val="1"/>
-      <w:numFmt w:val="lowerRoman"/>
-      <w:lvlText w:val="%3."/>
-      <w:lvlJc w:val="right"/>
-      <w:pPr>
-        <w:ind w:left="2160" w:hanging="180"/>
-      </w:pPr>
-    </w:lvl>
-    <w:lvl w:ilvl="3" w:tplc="0416000F" w:tentative="1">
-      <w:start w:val="1"/>
-      <w:numFmt w:val="decimal"/>
-      <w:lvlText w:val="%4."/>
-      <w:lvlJc w:val="left"/>
-      <w:pPr>
-        <w:ind w:left="2880" w:hanging="360"/>
-      </w:pPr>
-    </w:lvl>
-    <w:lvl w:ilvl="4" w:tplc="04160019" w:tentative="1">
-      <w:start w:val="1"/>
-      <w:numFmt w:val="lowerLetter"/>
-      <w:lvlText w:val="%5."/>
-      <w:lvlJc w:val="left"/>
-      <w:pPr>
-        <w:ind w:left="3600" w:hanging="360"/>
-      </w:pPr>
-    </w:lvl>
-    <w:lvl w:ilvl="5" w:tplc="0416001B" w:tentative="1">
-      <w:start w:val="1"/>
-      <w:numFmt w:val="lowerRoman"/>
-      <w:lvlText w:val="%6."/>
-      <w:lvlJc w:val="right"/>
-      <w:pPr>
-        <w:ind w:left="4320" w:hanging="180"/>
-      </w:pPr>
-    </w:lvl>
-    <w:lvl w:ilvl="6" w:tplc="0416000F" w:tentative="1">
-      <w:start w:val="1"/>
-      <w:numFmt w:val="decimal"/>
-      <w:lvlText w:val="%7."/>
-      <w:lvlJc w:val="left"/>
-      <w:pPr>
-        <w:ind w:left="5040" w:hanging="360"/>
-      </w:pPr>
-    </w:lvl>
-    <w:lvl w:ilvl="7" w:tplc="04160019" w:tentative="1">
-      <w:start w:val="1"/>
-      <w:numFmt w:val="lowerLetter"/>
-      <w:lvlText w:val="%8."/>
-      <w:lvlJc w:val="left"/>
-      <w:pPr>
-        <w:ind w:left="5760" w:hanging="360"/>
-      </w:pPr>
-    </w:lvl>
-    <w:lvl w:ilvl="8" w:tplc="0416001B" w:tentative="1">
-      <w:start w:val="1"/>
-      <w:numFmt w:val="lowerRoman"/>
-      <w:lvlText w:val="%9."/>
-      <w:lvlJc w:val="right"/>
-      <w:pPr>
-        <w:ind w:left="6480" w:hanging="180"/>
-      </w:pPr>
-    </w:lvl>
-  </w:abstractNum>
-  <w:abstractNum w:abstractNumId="22" w15:restartNumberingAfterBreak="0">
     <w:nsid w:val="49F04E32"/>
     <w:multiLevelType w:val="multilevel"/>
     <w:tmpl w:val="10ACE5DC"/>
@@ -5705,7 +5937,7 @@
       </w:rPr>
     </w:lvl>
   </w:abstractNum>
-  <w:abstractNum w:abstractNumId="23" w15:restartNumberingAfterBreak="0">
+  <w:abstractNum w:abstractNumId="22" w15:restartNumberingAfterBreak="0">
     <w:nsid w:val="4C756668"/>
     <w:multiLevelType w:val="multilevel"/>
     <w:tmpl w:val="E62E266A"/>
@@ -5854,156 +6086,156 @@
       </w:rPr>
     </w:lvl>
   </w:abstractNum>
+  <w:abstractNum w:abstractNumId="23" w15:restartNumberingAfterBreak="0">
+    <w:nsid w:val="4D224FD7"/>
+    <w:multiLevelType w:val="multilevel"/>
+    <w:tmpl w:val="4AE6E412"/>
+    <w:lvl w:ilvl="0">
+      <w:start w:val="1"/>
+      <w:numFmt w:val="bullet"/>
+      <w:lvlText w:val=""/>
+      <w:lvlJc w:val="left"/>
+      <w:pPr>
+        <w:tabs>
+          <w:tab w:val="num" w:pos="720"/>
+        </w:tabs>
+        <w:ind w:left="720" w:hanging="360"/>
+      </w:pPr>
+      <w:rPr>
+        <w:rFonts w:ascii="Symbol" w:hAnsi="Symbol" w:hint="default"/>
+        <w:sz w:val="20"/>
+      </w:rPr>
+    </w:lvl>
+    <w:lvl w:ilvl="1" w:tentative="1">
+      <w:start w:val="1"/>
+      <w:numFmt w:val="bullet"/>
+      <w:lvlText w:val="o"/>
+      <w:lvlJc w:val="left"/>
+      <w:pPr>
+        <w:tabs>
+          <w:tab w:val="num" w:pos="1440"/>
+        </w:tabs>
+        <w:ind w:left="1440" w:hanging="360"/>
+      </w:pPr>
+      <w:rPr>
+        <w:rFonts w:ascii="Courier New" w:hAnsi="Courier New" w:hint="default"/>
+        <w:sz w:val="20"/>
+      </w:rPr>
+    </w:lvl>
+    <w:lvl w:ilvl="2" w:tentative="1">
+      <w:start w:val="1"/>
+      <w:numFmt w:val="bullet"/>
+      <w:lvlText w:val=""/>
+      <w:lvlJc w:val="left"/>
+      <w:pPr>
+        <w:tabs>
+          <w:tab w:val="num" w:pos="2160"/>
+        </w:tabs>
+        <w:ind w:left="2160" w:hanging="360"/>
+      </w:pPr>
+      <w:rPr>
+        <w:rFonts w:ascii="Wingdings" w:hAnsi="Wingdings" w:hint="default"/>
+        <w:sz w:val="20"/>
+      </w:rPr>
+    </w:lvl>
+    <w:lvl w:ilvl="3" w:tentative="1">
+      <w:start w:val="1"/>
+      <w:numFmt w:val="bullet"/>
+      <w:lvlText w:val=""/>
+      <w:lvlJc w:val="left"/>
+      <w:pPr>
+        <w:tabs>
+          <w:tab w:val="num" w:pos="2880"/>
+        </w:tabs>
+        <w:ind w:left="2880" w:hanging="360"/>
+      </w:pPr>
+      <w:rPr>
+        <w:rFonts w:ascii="Wingdings" w:hAnsi="Wingdings" w:hint="default"/>
+        <w:sz w:val="20"/>
+      </w:rPr>
+    </w:lvl>
+    <w:lvl w:ilvl="4" w:tentative="1">
+      <w:start w:val="1"/>
+      <w:numFmt w:val="bullet"/>
+      <w:lvlText w:val=""/>
+      <w:lvlJc w:val="left"/>
+      <w:pPr>
+        <w:tabs>
+          <w:tab w:val="num" w:pos="3600"/>
+        </w:tabs>
+        <w:ind w:left="3600" w:hanging="360"/>
+      </w:pPr>
+      <w:rPr>
+        <w:rFonts w:ascii="Wingdings" w:hAnsi="Wingdings" w:hint="default"/>
+        <w:sz w:val="20"/>
+      </w:rPr>
+    </w:lvl>
+    <w:lvl w:ilvl="5" w:tentative="1">
+      <w:start w:val="1"/>
+      <w:numFmt w:val="bullet"/>
+      <w:lvlText w:val=""/>
+      <w:lvlJc w:val="left"/>
+      <w:pPr>
+        <w:tabs>
+          <w:tab w:val="num" w:pos="4320"/>
+        </w:tabs>
+        <w:ind w:left="4320" w:hanging="360"/>
+      </w:pPr>
+      <w:rPr>
+        <w:rFonts w:ascii="Wingdings" w:hAnsi="Wingdings" w:hint="default"/>
+        <w:sz w:val="20"/>
+      </w:rPr>
+    </w:lvl>
+    <w:lvl w:ilvl="6" w:tentative="1">
+      <w:start w:val="1"/>
+      <w:numFmt w:val="bullet"/>
+      <w:lvlText w:val=""/>
+      <w:lvlJc w:val="left"/>
+      <w:pPr>
+        <w:tabs>
+          <w:tab w:val="num" w:pos="5040"/>
+        </w:tabs>
+        <w:ind w:left="5040" w:hanging="360"/>
+      </w:pPr>
+      <w:rPr>
+        <w:rFonts w:ascii="Wingdings" w:hAnsi="Wingdings" w:hint="default"/>
+        <w:sz w:val="20"/>
+      </w:rPr>
+    </w:lvl>
+    <w:lvl w:ilvl="7" w:tentative="1">
+      <w:start w:val="1"/>
+      <w:numFmt w:val="bullet"/>
+      <w:lvlText w:val=""/>
+      <w:lvlJc w:val="left"/>
+      <w:pPr>
+        <w:tabs>
+          <w:tab w:val="num" w:pos="5760"/>
+        </w:tabs>
+        <w:ind w:left="5760" w:hanging="360"/>
+      </w:pPr>
+      <w:rPr>
+        <w:rFonts w:ascii="Wingdings" w:hAnsi="Wingdings" w:hint="default"/>
+        <w:sz w:val="20"/>
+      </w:rPr>
+    </w:lvl>
+    <w:lvl w:ilvl="8" w:tentative="1">
+      <w:start w:val="1"/>
+      <w:numFmt w:val="bullet"/>
+      <w:lvlText w:val=""/>
+      <w:lvlJc w:val="left"/>
+      <w:pPr>
+        <w:tabs>
+          <w:tab w:val="num" w:pos="6480"/>
+        </w:tabs>
+        <w:ind w:left="6480" w:hanging="360"/>
+      </w:pPr>
+      <w:rPr>
+        <w:rFonts w:ascii="Wingdings" w:hAnsi="Wingdings" w:hint="default"/>
+        <w:sz w:val="20"/>
+      </w:rPr>
+    </w:lvl>
+  </w:abstractNum>
   <w:abstractNum w:abstractNumId="24" w15:restartNumberingAfterBreak="0">
-    <w:nsid w:val="4D370E89"/>
-    <w:multiLevelType w:val="multilevel"/>
-    <w:tmpl w:val="841CC634"/>
-    <w:lvl w:ilvl="0">
-      <w:start w:val="1"/>
-      <w:numFmt w:val="bullet"/>
-      <w:lvlText w:val=""/>
-      <w:lvlJc w:val="left"/>
-      <w:pPr>
-        <w:tabs>
-          <w:tab w:val="num" w:pos="720"/>
-        </w:tabs>
-        <w:ind w:left="720" w:hanging="360"/>
-      </w:pPr>
-      <w:rPr>
-        <w:rFonts w:ascii="Symbol" w:hAnsi="Symbol" w:hint="default"/>
-        <w:sz w:val="20"/>
-      </w:rPr>
-    </w:lvl>
-    <w:lvl w:ilvl="1" w:tentative="1">
-      <w:start w:val="1"/>
-      <w:numFmt w:val="bullet"/>
-      <w:lvlText w:val="o"/>
-      <w:lvlJc w:val="left"/>
-      <w:pPr>
-        <w:tabs>
-          <w:tab w:val="num" w:pos="1440"/>
-        </w:tabs>
-        <w:ind w:left="1440" w:hanging="360"/>
-      </w:pPr>
-      <w:rPr>
-        <w:rFonts w:ascii="Courier New" w:hAnsi="Courier New" w:hint="default"/>
-        <w:sz w:val="20"/>
-      </w:rPr>
-    </w:lvl>
-    <w:lvl w:ilvl="2" w:tentative="1">
-      <w:start w:val="1"/>
-      <w:numFmt w:val="bullet"/>
-      <w:lvlText w:val=""/>
-      <w:lvlJc w:val="left"/>
-      <w:pPr>
-        <w:tabs>
-          <w:tab w:val="num" w:pos="2160"/>
-        </w:tabs>
-        <w:ind w:left="2160" w:hanging="360"/>
-      </w:pPr>
-      <w:rPr>
-        <w:rFonts w:ascii="Wingdings" w:hAnsi="Wingdings" w:hint="default"/>
-        <w:sz w:val="20"/>
-      </w:rPr>
-    </w:lvl>
-    <w:lvl w:ilvl="3" w:tentative="1">
-      <w:start w:val="1"/>
-      <w:numFmt w:val="bullet"/>
-      <w:lvlText w:val=""/>
-      <w:lvlJc w:val="left"/>
-      <w:pPr>
-        <w:tabs>
-          <w:tab w:val="num" w:pos="2880"/>
-        </w:tabs>
-        <w:ind w:left="2880" w:hanging="360"/>
-      </w:pPr>
-      <w:rPr>
-        <w:rFonts w:ascii="Wingdings" w:hAnsi="Wingdings" w:hint="default"/>
-        <w:sz w:val="20"/>
-      </w:rPr>
-    </w:lvl>
-    <w:lvl w:ilvl="4" w:tentative="1">
-      <w:start w:val="1"/>
-      <w:numFmt w:val="bullet"/>
-      <w:lvlText w:val=""/>
-      <w:lvlJc w:val="left"/>
-      <w:pPr>
-        <w:tabs>
-          <w:tab w:val="num" w:pos="3600"/>
-        </w:tabs>
-        <w:ind w:left="3600" w:hanging="360"/>
-      </w:pPr>
-      <w:rPr>
-        <w:rFonts w:ascii="Wingdings" w:hAnsi="Wingdings" w:hint="default"/>
-        <w:sz w:val="20"/>
-      </w:rPr>
-    </w:lvl>
-    <w:lvl w:ilvl="5" w:tentative="1">
-      <w:start w:val="1"/>
-      <w:numFmt w:val="bullet"/>
-      <w:lvlText w:val=""/>
-      <w:lvlJc w:val="left"/>
-      <w:pPr>
-        <w:tabs>
-          <w:tab w:val="num" w:pos="4320"/>
-        </w:tabs>
-        <w:ind w:left="4320" w:hanging="360"/>
-      </w:pPr>
-      <w:rPr>
-        <w:rFonts w:ascii="Wingdings" w:hAnsi="Wingdings" w:hint="default"/>
-        <w:sz w:val="20"/>
-      </w:rPr>
-    </w:lvl>
-    <w:lvl w:ilvl="6" w:tentative="1">
-      <w:start w:val="1"/>
-      <w:numFmt w:val="bullet"/>
-      <w:lvlText w:val=""/>
-      <w:lvlJc w:val="left"/>
-      <w:pPr>
-        <w:tabs>
-          <w:tab w:val="num" w:pos="5040"/>
-        </w:tabs>
-        <w:ind w:left="5040" w:hanging="360"/>
-      </w:pPr>
-      <w:rPr>
-        <w:rFonts w:ascii="Wingdings" w:hAnsi="Wingdings" w:hint="default"/>
-        <w:sz w:val="20"/>
-      </w:rPr>
-    </w:lvl>
-    <w:lvl w:ilvl="7" w:tentative="1">
-      <w:start w:val="1"/>
-      <w:numFmt w:val="bullet"/>
-      <w:lvlText w:val=""/>
-      <w:lvlJc w:val="left"/>
-      <w:pPr>
-        <w:tabs>
-          <w:tab w:val="num" w:pos="5760"/>
-        </w:tabs>
-        <w:ind w:left="5760" w:hanging="360"/>
-      </w:pPr>
-      <w:rPr>
-        <w:rFonts w:ascii="Wingdings" w:hAnsi="Wingdings" w:hint="default"/>
-        <w:sz w:val="20"/>
-      </w:rPr>
-    </w:lvl>
-    <w:lvl w:ilvl="8" w:tentative="1">
-      <w:start w:val="1"/>
-      <w:numFmt w:val="bullet"/>
-      <w:lvlText w:val=""/>
-      <w:lvlJc w:val="left"/>
-      <w:pPr>
-        <w:tabs>
-          <w:tab w:val="num" w:pos="6480"/>
-        </w:tabs>
-        <w:ind w:left="6480" w:hanging="360"/>
-      </w:pPr>
-      <w:rPr>
-        <w:rFonts w:ascii="Wingdings" w:hAnsi="Wingdings" w:hint="default"/>
-        <w:sz w:val="20"/>
-      </w:rPr>
-    </w:lvl>
-  </w:abstractNum>
-  <w:abstractNum w:abstractNumId="25" w15:restartNumberingAfterBreak="0">
     <w:nsid w:val="4FB76B37"/>
     <w:multiLevelType w:val="multilevel"/>
     <w:tmpl w:val="EC900B52"/>
@@ -6152,209 +6384,7 @@
       </w:rPr>
     </w:lvl>
   </w:abstractNum>
-  <w:abstractNum w:abstractNumId="26" w15:restartNumberingAfterBreak="0">
-    <w:nsid w:val="506E624A"/>
-    <w:multiLevelType w:val="hybridMultilevel"/>
-    <w:tmpl w:val="A4C23E1C"/>
-    <w:lvl w:ilvl="0" w:tplc="0416000F">
-      <w:start w:val="1"/>
-      <w:numFmt w:val="decimal"/>
-      <w:lvlText w:val="%1."/>
-      <w:lvlJc w:val="left"/>
-      <w:pPr>
-        <w:ind w:left="720" w:hanging="360"/>
-      </w:pPr>
-      <w:rPr>
-        <w:rFonts w:hint="default"/>
-      </w:rPr>
-    </w:lvl>
-    <w:lvl w:ilvl="1" w:tplc="04160019" w:tentative="1">
-      <w:start w:val="1"/>
-      <w:numFmt w:val="lowerLetter"/>
-      <w:lvlText w:val="%2."/>
-      <w:lvlJc w:val="left"/>
-      <w:pPr>
-        <w:ind w:left="1440" w:hanging="360"/>
-      </w:pPr>
-    </w:lvl>
-    <w:lvl w:ilvl="2" w:tplc="0416001B" w:tentative="1">
-      <w:start w:val="1"/>
-      <w:numFmt w:val="lowerRoman"/>
-      <w:lvlText w:val="%3."/>
-      <w:lvlJc w:val="right"/>
-      <w:pPr>
-        <w:ind w:left="2160" w:hanging="180"/>
-      </w:pPr>
-    </w:lvl>
-    <w:lvl w:ilvl="3" w:tplc="0416000F" w:tentative="1">
-      <w:start w:val="1"/>
-      <w:numFmt w:val="decimal"/>
-      <w:lvlText w:val="%4."/>
-      <w:lvlJc w:val="left"/>
-      <w:pPr>
-        <w:ind w:left="2880" w:hanging="360"/>
-      </w:pPr>
-    </w:lvl>
-    <w:lvl w:ilvl="4" w:tplc="04160019" w:tentative="1">
-      <w:start w:val="1"/>
-      <w:numFmt w:val="lowerLetter"/>
-      <w:lvlText w:val="%5."/>
-      <w:lvlJc w:val="left"/>
-      <w:pPr>
-        <w:ind w:left="3600" w:hanging="360"/>
-      </w:pPr>
-    </w:lvl>
-    <w:lvl w:ilvl="5" w:tplc="0416001B" w:tentative="1">
-      <w:start w:val="1"/>
-      <w:numFmt w:val="lowerRoman"/>
-      <w:lvlText w:val="%6."/>
-      <w:lvlJc w:val="right"/>
-      <w:pPr>
-        <w:ind w:left="4320" w:hanging="180"/>
-      </w:pPr>
-    </w:lvl>
-    <w:lvl w:ilvl="6" w:tplc="0416000F" w:tentative="1">
-      <w:start w:val="1"/>
-      <w:numFmt w:val="decimal"/>
-      <w:lvlText w:val="%7."/>
-      <w:lvlJc w:val="left"/>
-      <w:pPr>
-        <w:ind w:left="5040" w:hanging="360"/>
-      </w:pPr>
-    </w:lvl>
-    <w:lvl w:ilvl="7" w:tplc="04160019" w:tentative="1">
-      <w:start w:val="1"/>
-      <w:numFmt w:val="lowerLetter"/>
-      <w:lvlText w:val="%8."/>
-      <w:lvlJc w:val="left"/>
-      <w:pPr>
-        <w:ind w:left="5760" w:hanging="360"/>
-      </w:pPr>
-    </w:lvl>
-    <w:lvl w:ilvl="8" w:tplc="0416001B" w:tentative="1">
-      <w:start w:val="1"/>
-      <w:numFmt w:val="lowerRoman"/>
-      <w:lvlText w:val="%9."/>
-      <w:lvlJc w:val="right"/>
-      <w:pPr>
-        <w:ind w:left="6480" w:hanging="180"/>
-      </w:pPr>
-    </w:lvl>
-  </w:abstractNum>
-  <w:abstractNum w:abstractNumId="27" w15:restartNumberingAfterBreak="0">
-    <w:nsid w:val="531D472B"/>
-    <w:multiLevelType w:val="multilevel"/>
-    <w:tmpl w:val="20F2554C"/>
-    <w:lvl w:ilvl="0">
-      <w:start w:val="1"/>
-      <w:numFmt w:val="decimal"/>
-      <w:lvlText w:val="%1."/>
-      <w:lvlJc w:val="left"/>
-      <w:pPr>
-        <w:tabs>
-          <w:tab w:val="num" w:pos="720"/>
-        </w:tabs>
-        <w:ind w:left="720" w:hanging="360"/>
-      </w:pPr>
-    </w:lvl>
-    <w:lvl w:ilvl="1" w:tentative="1">
-      <w:start w:val="1"/>
-      <w:numFmt w:val="decimal"/>
-      <w:lvlText w:val="%2."/>
-      <w:lvlJc w:val="left"/>
-      <w:pPr>
-        <w:tabs>
-          <w:tab w:val="num" w:pos="1440"/>
-        </w:tabs>
-        <w:ind w:left="1440" w:hanging="360"/>
-      </w:pPr>
-    </w:lvl>
-    <w:lvl w:ilvl="2" w:tentative="1">
-      <w:start w:val="1"/>
-      <w:numFmt w:val="decimal"/>
-      <w:lvlText w:val="%3."/>
-      <w:lvlJc w:val="left"/>
-      <w:pPr>
-        <w:tabs>
-          <w:tab w:val="num" w:pos="2160"/>
-        </w:tabs>
-        <w:ind w:left="2160" w:hanging="360"/>
-      </w:pPr>
-    </w:lvl>
-    <w:lvl w:ilvl="3" w:tentative="1">
-      <w:start w:val="1"/>
-      <w:numFmt w:val="decimal"/>
-      <w:lvlText w:val="%4."/>
-      <w:lvlJc w:val="left"/>
-      <w:pPr>
-        <w:tabs>
-          <w:tab w:val="num" w:pos="2880"/>
-        </w:tabs>
-        <w:ind w:left="2880" w:hanging="360"/>
-      </w:pPr>
-    </w:lvl>
-    <w:lvl w:ilvl="4" w:tentative="1">
-      <w:start w:val="1"/>
-      <w:numFmt w:val="decimal"/>
-      <w:lvlText w:val="%5."/>
-      <w:lvlJc w:val="left"/>
-      <w:pPr>
-        <w:tabs>
-          <w:tab w:val="num" w:pos="3600"/>
-        </w:tabs>
-        <w:ind w:left="3600" w:hanging="360"/>
-      </w:pPr>
-    </w:lvl>
-    <w:lvl w:ilvl="5" w:tentative="1">
-      <w:start w:val="1"/>
-      <w:numFmt w:val="decimal"/>
-      <w:lvlText w:val="%6."/>
-      <w:lvlJc w:val="left"/>
-      <w:pPr>
-        <w:tabs>
-          <w:tab w:val="num" w:pos="4320"/>
-        </w:tabs>
-        <w:ind w:left="4320" w:hanging="360"/>
-      </w:pPr>
-    </w:lvl>
-    <w:lvl w:ilvl="6" w:tentative="1">
-      <w:start w:val="1"/>
-      <w:numFmt w:val="decimal"/>
-      <w:lvlText w:val="%7."/>
-      <w:lvlJc w:val="left"/>
-      <w:pPr>
-        <w:tabs>
-          <w:tab w:val="num" w:pos="5040"/>
-        </w:tabs>
-        <w:ind w:left="5040" w:hanging="360"/>
-      </w:pPr>
-    </w:lvl>
-    <w:lvl w:ilvl="7" w:tentative="1">
-      <w:start w:val="1"/>
-      <w:numFmt w:val="decimal"/>
-      <w:lvlText w:val="%8."/>
-      <w:lvlJc w:val="left"/>
-      <w:pPr>
-        <w:tabs>
-          <w:tab w:val="num" w:pos="5760"/>
-        </w:tabs>
-        <w:ind w:left="5760" w:hanging="360"/>
-      </w:pPr>
-    </w:lvl>
-    <w:lvl w:ilvl="8" w:tentative="1">
-      <w:start w:val="1"/>
-      <w:numFmt w:val="decimal"/>
-      <w:lvlText w:val="%9."/>
-      <w:lvlJc w:val="left"/>
-      <w:pPr>
-        <w:tabs>
-          <w:tab w:val="num" w:pos="6480"/>
-        </w:tabs>
-        <w:ind w:left="6480" w:hanging="360"/>
-      </w:pPr>
-    </w:lvl>
-  </w:abstractNum>
-  <w:abstractNum w:abstractNumId="28" w15:restartNumberingAfterBreak="0">
+  <w:abstractNum w:abstractNumId="25" w15:restartNumberingAfterBreak="0">
     <w:nsid w:val="545C1C51"/>
     <w:multiLevelType w:val="multilevel"/>
     <w:tmpl w:val="E886EA0E"/>
@@ -6467,10 +6497,421 @@
       </w:pPr>
     </w:lvl>
   </w:abstractNum>
+  <w:abstractNum w:abstractNumId="26" w15:restartNumberingAfterBreak="0">
+    <w:nsid w:val="55921006"/>
+    <w:multiLevelType w:val="multilevel"/>
+    <w:tmpl w:val="DDCC8634"/>
+    <w:lvl w:ilvl="0">
+      <w:start w:val="1"/>
+      <w:numFmt w:val="bullet"/>
+      <w:lvlText w:val=""/>
+      <w:lvlJc w:val="left"/>
+      <w:pPr>
+        <w:tabs>
+          <w:tab w:val="num" w:pos="720"/>
+        </w:tabs>
+        <w:ind w:left="720" w:hanging="360"/>
+      </w:pPr>
+      <w:rPr>
+        <w:rFonts w:ascii="Symbol" w:hAnsi="Symbol" w:hint="default"/>
+        <w:sz w:val="20"/>
+      </w:rPr>
+    </w:lvl>
+    <w:lvl w:ilvl="1" w:tentative="1">
+      <w:start w:val="1"/>
+      <w:numFmt w:val="bullet"/>
+      <w:lvlText w:val="o"/>
+      <w:lvlJc w:val="left"/>
+      <w:pPr>
+        <w:tabs>
+          <w:tab w:val="num" w:pos="1440"/>
+        </w:tabs>
+        <w:ind w:left="1440" w:hanging="360"/>
+      </w:pPr>
+      <w:rPr>
+        <w:rFonts w:ascii="Courier New" w:hAnsi="Courier New" w:hint="default"/>
+        <w:sz w:val="20"/>
+      </w:rPr>
+    </w:lvl>
+    <w:lvl w:ilvl="2" w:tentative="1">
+      <w:start w:val="1"/>
+      <w:numFmt w:val="bullet"/>
+      <w:lvlText w:val=""/>
+      <w:lvlJc w:val="left"/>
+      <w:pPr>
+        <w:tabs>
+          <w:tab w:val="num" w:pos="2160"/>
+        </w:tabs>
+        <w:ind w:left="2160" w:hanging="360"/>
+      </w:pPr>
+      <w:rPr>
+        <w:rFonts w:ascii="Wingdings" w:hAnsi="Wingdings" w:hint="default"/>
+        <w:sz w:val="20"/>
+      </w:rPr>
+    </w:lvl>
+    <w:lvl w:ilvl="3" w:tentative="1">
+      <w:start w:val="1"/>
+      <w:numFmt w:val="bullet"/>
+      <w:lvlText w:val=""/>
+      <w:lvlJc w:val="left"/>
+      <w:pPr>
+        <w:tabs>
+          <w:tab w:val="num" w:pos="2880"/>
+        </w:tabs>
+        <w:ind w:left="2880" w:hanging="360"/>
+      </w:pPr>
+      <w:rPr>
+        <w:rFonts w:ascii="Wingdings" w:hAnsi="Wingdings" w:hint="default"/>
+        <w:sz w:val="20"/>
+      </w:rPr>
+    </w:lvl>
+    <w:lvl w:ilvl="4" w:tentative="1">
+      <w:start w:val="1"/>
+      <w:numFmt w:val="bullet"/>
+      <w:lvlText w:val=""/>
+      <w:lvlJc w:val="left"/>
+      <w:pPr>
+        <w:tabs>
+          <w:tab w:val="num" w:pos="3600"/>
+        </w:tabs>
+        <w:ind w:left="3600" w:hanging="360"/>
+      </w:pPr>
+      <w:rPr>
+        <w:rFonts w:ascii="Wingdings" w:hAnsi="Wingdings" w:hint="default"/>
+        <w:sz w:val="20"/>
+      </w:rPr>
+    </w:lvl>
+    <w:lvl w:ilvl="5" w:tentative="1">
+      <w:start w:val="1"/>
+      <w:numFmt w:val="bullet"/>
+      <w:lvlText w:val=""/>
+      <w:lvlJc w:val="left"/>
+      <w:pPr>
+        <w:tabs>
+          <w:tab w:val="num" w:pos="4320"/>
+        </w:tabs>
+        <w:ind w:left="4320" w:hanging="360"/>
+      </w:pPr>
+      <w:rPr>
+        <w:rFonts w:ascii="Wingdings" w:hAnsi="Wingdings" w:hint="default"/>
+        <w:sz w:val="20"/>
+      </w:rPr>
+    </w:lvl>
+    <w:lvl w:ilvl="6" w:tentative="1">
+      <w:start w:val="1"/>
+      <w:numFmt w:val="bullet"/>
+      <w:lvlText w:val=""/>
+      <w:lvlJc w:val="left"/>
+      <w:pPr>
+        <w:tabs>
+          <w:tab w:val="num" w:pos="5040"/>
+        </w:tabs>
+        <w:ind w:left="5040" w:hanging="360"/>
+      </w:pPr>
+      <w:rPr>
+        <w:rFonts w:ascii="Wingdings" w:hAnsi="Wingdings" w:hint="default"/>
+        <w:sz w:val="20"/>
+      </w:rPr>
+    </w:lvl>
+    <w:lvl w:ilvl="7" w:tentative="1">
+      <w:start w:val="1"/>
+      <w:numFmt w:val="bullet"/>
+      <w:lvlText w:val=""/>
+      <w:lvlJc w:val="left"/>
+      <w:pPr>
+        <w:tabs>
+          <w:tab w:val="num" w:pos="5760"/>
+        </w:tabs>
+        <w:ind w:left="5760" w:hanging="360"/>
+      </w:pPr>
+      <w:rPr>
+        <w:rFonts w:ascii="Wingdings" w:hAnsi="Wingdings" w:hint="default"/>
+        <w:sz w:val="20"/>
+      </w:rPr>
+    </w:lvl>
+    <w:lvl w:ilvl="8" w:tentative="1">
+      <w:start w:val="1"/>
+      <w:numFmt w:val="bullet"/>
+      <w:lvlText w:val=""/>
+      <w:lvlJc w:val="left"/>
+      <w:pPr>
+        <w:tabs>
+          <w:tab w:val="num" w:pos="6480"/>
+        </w:tabs>
+        <w:ind w:left="6480" w:hanging="360"/>
+      </w:pPr>
+      <w:rPr>
+        <w:rFonts w:ascii="Wingdings" w:hAnsi="Wingdings" w:hint="default"/>
+        <w:sz w:val="20"/>
+      </w:rPr>
+    </w:lvl>
+  </w:abstractNum>
+  <w:abstractNum w:abstractNumId="27" w15:restartNumberingAfterBreak="0">
+    <w:nsid w:val="5696720A"/>
+    <w:multiLevelType w:val="multilevel"/>
+    <w:tmpl w:val="4F108494"/>
+    <w:lvl w:ilvl="0">
+      <w:start w:val="1"/>
+      <w:numFmt w:val="bullet"/>
+      <w:lvlText w:val=""/>
+      <w:lvlJc w:val="left"/>
+      <w:pPr>
+        <w:tabs>
+          <w:tab w:val="num" w:pos="720"/>
+        </w:tabs>
+        <w:ind w:left="720" w:hanging="360"/>
+      </w:pPr>
+      <w:rPr>
+        <w:rFonts w:ascii="Symbol" w:hAnsi="Symbol" w:hint="default"/>
+        <w:sz w:val="20"/>
+      </w:rPr>
+    </w:lvl>
+    <w:lvl w:ilvl="1" w:tentative="1">
+      <w:start w:val="1"/>
+      <w:numFmt w:val="bullet"/>
+      <w:lvlText w:val="o"/>
+      <w:lvlJc w:val="left"/>
+      <w:pPr>
+        <w:tabs>
+          <w:tab w:val="num" w:pos="1440"/>
+        </w:tabs>
+        <w:ind w:left="1440" w:hanging="360"/>
+      </w:pPr>
+      <w:rPr>
+        <w:rFonts w:ascii="Courier New" w:hAnsi="Courier New" w:hint="default"/>
+        <w:sz w:val="20"/>
+      </w:rPr>
+    </w:lvl>
+    <w:lvl w:ilvl="2" w:tentative="1">
+      <w:start w:val="1"/>
+      <w:numFmt w:val="bullet"/>
+      <w:lvlText w:val=""/>
+      <w:lvlJc w:val="left"/>
+      <w:pPr>
+        <w:tabs>
+          <w:tab w:val="num" w:pos="2160"/>
+        </w:tabs>
+        <w:ind w:left="2160" w:hanging="360"/>
+      </w:pPr>
+      <w:rPr>
+        <w:rFonts w:ascii="Wingdings" w:hAnsi="Wingdings" w:hint="default"/>
+        <w:sz w:val="20"/>
+      </w:rPr>
+    </w:lvl>
+    <w:lvl w:ilvl="3" w:tentative="1">
+      <w:start w:val="1"/>
+      <w:numFmt w:val="bullet"/>
+      <w:lvlText w:val=""/>
+      <w:lvlJc w:val="left"/>
+      <w:pPr>
+        <w:tabs>
+          <w:tab w:val="num" w:pos="2880"/>
+        </w:tabs>
+        <w:ind w:left="2880" w:hanging="360"/>
+      </w:pPr>
+      <w:rPr>
+        <w:rFonts w:ascii="Wingdings" w:hAnsi="Wingdings" w:hint="default"/>
+        <w:sz w:val="20"/>
+      </w:rPr>
+    </w:lvl>
+    <w:lvl w:ilvl="4" w:tentative="1">
+      <w:start w:val="1"/>
+      <w:numFmt w:val="bullet"/>
+      <w:lvlText w:val=""/>
+      <w:lvlJc w:val="left"/>
+      <w:pPr>
+        <w:tabs>
+          <w:tab w:val="num" w:pos="3600"/>
+        </w:tabs>
+        <w:ind w:left="3600" w:hanging="360"/>
+      </w:pPr>
+      <w:rPr>
+        <w:rFonts w:ascii="Wingdings" w:hAnsi="Wingdings" w:hint="default"/>
+        <w:sz w:val="20"/>
+      </w:rPr>
+    </w:lvl>
+    <w:lvl w:ilvl="5" w:tentative="1">
+      <w:start w:val="1"/>
+      <w:numFmt w:val="bullet"/>
+      <w:lvlText w:val=""/>
+      <w:lvlJc w:val="left"/>
+      <w:pPr>
+        <w:tabs>
+          <w:tab w:val="num" w:pos="4320"/>
+        </w:tabs>
+        <w:ind w:left="4320" w:hanging="360"/>
+      </w:pPr>
+      <w:rPr>
+        <w:rFonts w:ascii="Wingdings" w:hAnsi="Wingdings" w:hint="default"/>
+        <w:sz w:val="20"/>
+      </w:rPr>
+    </w:lvl>
+    <w:lvl w:ilvl="6" w:tentative="1">
+      <w:start w:val="1"/>
+      <w:numFmt w:val="bullet"/>
+      <w:lvlText w:val=""/>
+      <w:lvlJc w:val="left"/>
+      <w:pPr>
+        <w:tabs>
+          <w:tab w:val="num" w:pos="5040"/>
+        </w:tabs>
+        <w:ind w:left="5040" w:hanging="360"/>
+      </w:pPr>
+      <w:rPr>
+        <w:rFonts w:ascii="Wingdings" w:hAnsi="Wingdings" w:hint="default"/>
+        <w:sz w:val="20"/>
+      </w:rPr>
+    </w:lvl>
+    <w:lvl w:ilvl="7" w:tentative="1">
+      <w:start w:val="1"/>
+      <w:numFmt w:val="bullet"/>
+      <w:lvlText w:val=""/>
+      <w:lvlJc w:val="left"/>
+      <w:pPr>
+        <w:tabs>
+          <w:tab w:val="num" w:pos="5760"/>
+        </w:tabs>
+        <w:ind w:left="5760" w:hanging="360"/>
+      </w:pPr>
+      <w:rPr>
+        <w:rFonts w:ascii="Wingdings" w:hAnsi="Wingdings" w:hint="default"/>
+        <w:sz w:val="20"/>
+      </w:rPr>
+    </w:lvl>
+    <w:lvl w:ilvl="8" w:tentative="1">
+      <w:start w:val="1"/>
+      <w:numFmt w:val="bullet"/>
+      <w:lvlText w:val=""/>
+      <w:lvlJc w:val="left"/>
+      <w:pPr>
+        <w:tabs>
+          <w:tab w:val="num" w:pos="6480"/>
+        </w:tabs>
+        <w:ind w:left="6480" w:hanging="360"/>
+      </w:pPr>
+      <w:rPr>
+        <w:rFonts w:ascii="Wingdings" w:hAnsi="Wingdings" w:hint="default"/>
+        <w:sz w:val="20"/>
+      </w:rPr>
+    </w:lvl>
+  </w:abstractNum>
+  <w:abstractNum w:abstractNumId="28" w15:restartNumberingAfterBreak="0">
+    <w:nsid w:val="5A3625AF"/>
+    <w:multiLevelType w:val="multilevel"/>
+    <w:tmpl w:val="AF6EA1B8"/>
+    <w:lvl w:ilvl="0">
+      <w:start w:val="2"/>
+      <w:numFmt w:val="decimal"/>
+      <w:lvlText w:val="%1."/>
+      <w:lvlJc w:val="left"/>
+      <w:pPr>
+        <w:tabs>
+          <w:tab w:val="num" w:pos="720"/>
+        </w:tabs>
+        <w:ind w:left="720" w:hanging="360"/>
+      </w:pPr>
+    </w:lvl>
+    <w:lvl w:ilvl="1" w:tentative="1">
+      <w:start w:val="1"/>
+      <w:numFmt w:val="decimal"/>
+      <w:lvlText w:val="%2."/>
+      <w:lvlJc w:val="left"/>
+      <w:pPr>
+        <w:tabs>
+          <w:tab w:val="num" w:pos="1440"/>
+        </w:tabs>
+        <w:ind w:left="1440" w:hanging="360"/>
+      </w:pPr>
+    </w:lvl>
+    <w:lvl w:ilvl="2" w:tentative="1">
+      <w:start w:val="1"/>
+      <w:numFmt w:val="decimal"/>
+      <w:lvlText w:val="%3."/>
+      <w:lvlJc w:val="left"/>
+      <w:pPr>
+        <w:tabs>
+          <w:tab w:val="num" w:pos="2160"/>
+        </w:tabs>
+        <w:ind w:left="2160" w:hanging="360"/>
+      </w:pPr>
+    </w:lvl>
+    <w:lvl w:ilvl="3" w:tentative="1">
+      <w:start w:val="1"/>
+      <w:numFmt w:val="decimal"/>
+      <w:lvlText w:val="%4."/>
+      <w:lvlJc w:val="left"/>
+      <w:pPr>
+        <w:tabs>
+          <w:tab w:val="num" w:pos="2880"/>
+        </w:tabs>
+        <w:ind w:left="2880" w:hanging="360"/>
+      </w:pPr>
+    </w:lvl>
+    <w:lvl w:ilvl="4" w:tentative="1">
+      <w:start w:val="1"/>
+      <w:numFmt w:val="decimal"/>
+      <w:lvlText w:val="%5."/>
+      <w:lvlJc w:val="left"/>
+      <w:pPr>
+        <w:tabs>
+          <w:tab w:val="num" w:pos="3600"/>
+        </w:tabs>
+        <w:ind w:left="3600" w:hanging="360"/>
+      </w:pPr>
+    </w:lvl>
+    <w:lvl w:ilvl="5" w:tentative="1">
+      <w:start w:val="1"/>
+      <w:numFmt w:val="decimal"/>
+      <w:lvlText w:val="%6."/>
+      <w:lvlJc w:val="left"/>
+      <w:pPr>
+        <w:tabs>
+          <w:tab w:val="num" w:pos="4320"/>
+        </w:tabs>
+        <w:ind w:left="4320" w:hanging="360"/>
+      </w:pPr>
+    </w:lvl>
+    <w:lvl w:ilvl="6" w:tentative="1">
+      <w:start w:val="1"/>
+      <w:numFmt w:val="decimal"/>
+      <w:lvlText w:val="%7."/>
+      <w:lvlJc w:val="left"/>
+      <w:pPr>
+        <w:tabs>
+          <w:tab w:val="num" w:pos="5040"/>
+        </w:tabs>
+        <w:ind w:left="5040" w:hanging="360"/>
+      </w:pPr>
+    </w:lvl>
+    <w:lvl w:ilvl="7" w:tentative="1">
+      <w:start w:val="1"/>
+      <w:numFmt w:val="decimal"/>
+      <w:lvlText w:val="%8."/>
+      <w:lvlJc w:val="left"/>
+      <w:pPr>
+        <w:tabs>
+          <w:tab w:val="num" w:pos="5760"/>
+        </w:tabs>
+        <w:ind w:left="5760" w:hanging="360"/>
+      </w:pPr>
+    </w:lvl>
+    <w:lvl w:ilvl="8" w:tentative="1">
+      <w:start w:val="1"/>
+      <w:numFmt w:val="decimal"/>
+      <w:lvlText w:val="%9."/>
+      <w:lvlJc w:val="left"/>
+      <w:pPr>
+        <w:tabs>
+          <w:tab w:val="num" w:pos="6480"/>
+        </w:tabs>
+        <w:ind w:left="6480" w:hanging="360"/>
+      </w:pPr>
+    </w:lvl>
+  </w:abstractNum>
   <w:abstractNum w:abstractNumId="29" w15:restartNumberingAfterBreak="0">
-    <w:nsid w:val="5BE47C56"/>
+    <w:nsid w:val="69EF4252"/>
     <w:multiLevelType w:val="multilevel"/>
-    <w:tmpl w:val="9BF0D59A"/>
+    <w:tmpl w:val="053ABB64"/>
     <w:lvl w:ilvl="0">
       <w:start w:val="1"/>
       <w:numFmt w:val="bullet"/>
@@ -6617,13 +7058,13 @@
     </w:lvl>
   </w:abstractNum>
   <w:abstractNum w:abstractNumId="30" w15:restartNumberingAfterBreak="0">
-    <w:nsid w:val="5DCF2972"/>
+    <w:nsid w:val="72CB1D22"/>
     <w:multiLevelType w:val="multilevel"/>
-    <w:tmpl w:val="647EB3AA"/>
+    <w:tmpl w:val="99A4D7B2"/>
     <w:lvl w:ilvl="0">
       <w:start w:val="1"/>
-      <w:numFmt w:val="decimal"/>
-      <w:lvlText w:val="%1."/>
+      <w:numFmt w:val="bullet"/>
+      <w:lvlText w:val=""/>
       <w:lvlJc w:val="left"/>
       <w:pPr>
         <w:tabs>
@@ -6631,11 +7072,15 @@
         </w:tabs>
         <w:ind w:left="720" w:hanging="360"/>
       </w:pPr>
+      <w:rPr>
+        <w:rFonts w:ascii="Symbol" w:hAnsi="Symbol" w:hint="default"/>
+        <w:sz w:val="20"/>
+      </w:rPr>
     </w:lvl>
     <w:lvl w:ilvl="1" w:tentative="1">
       <w:start w:val="1"/>
-      <w:numFmt w:val="decimal"/>
-      <w:lvlText w:val="%2."/>
+      <w:numFmt w:val="bullet"/>
+      <w:lvlText w:val="o"/>
       <w:lvlJc w:val="left"/>
       <w:pPr>
         <w:tabs>
@@ -6643,11 +7088,15 @@
         </w:tabs>
         <w:ind w:left="1440" w:hanging="360"/>
       </w:pPr>
+      <w:rPr>
+        <w:rFonts w:ascii="Courier New" w:hAnsi="Courier New" w:hint="default"/>
+        <w:sz w:val="20"/>
+      </w:rPr>
     </w:lvl>
     <w:lvl w:ilvl="2" w:tentative="1">
       <w:start w:val="1"/>
-      <w:numFmt w:val="decimal"/>
-      <w:lvlText w:val="%3."/>
+      <w:numFmt w:val="bullet"/>
+      <w:lvlText w:val=""/>
       <w:lvlJc w:val="left"/>
       <w:pPr>
         <w:tabs>
@@ -6655,11 +7104,15 @@
         </w:tabs>
         <w:ind w:left="2160" w:hanging="360"/>
       </w:pPr>
+      <w:rPr>
+        <w:rFonts w:ascii="Wingdings" w:hAnsi="Wingdings" w:hint="default"/>
+        <w:sz w:val="20"/>
+      </w:rPr>
     </w:lvl>
     <w:lvl w:ilvl="3" w:tentative="1">
       <w:start w:val="1"/>
-      <w:numFmt w:val="decimal"/>
-      <w:lvlText w:val="%4."/>
+      <w:numFmt w:val="bullet"/>
+      <w:lvlText w:val=""/>
       <w:lvlJc w:val="left"/>
       <w:pPr>
         <w:tabs>
@@ -6667,11 +7120,15 @@
         </w:tabs>
         <w:ind w:left="2880" w:hanging="360"/>
       </w:pPr>
+      <w:rPr>
+        <w:rFonts w:ascii="Wingdings" w:hAnsi="Wingdings" w:hint="default"/>
+        <w:sz w:val="20"/>
+      </w:rPr>
     </w:lvl>
     <w:lvl w:ilvl="4" w:tentative="1">
       <w:start w:val="1"/>
-      <w:numFmt w:val="decimal"/>
-      <w:lvlText w:val="%5."/>
+      <w:numFmt w:val="bullet"/>
+      <w:lvlText w:val=""/>
       <w:lvlJc w:val="left"/>
       <w:pPr>
         <w:tabs>
@@ -6679,11 +7136,15 @@
         </w:tabs>
         <w:ind w:left="3600" w:hanging="360"/>
       </w:pPr>
+      <w:rPr>
+        <w:rFonts w:ascii="Wingdings" w:hAnsi="Wingdings" w:hint="default"/>
+        <w:sz w:val="20"/>
+      </w:rPr>
     </w:lvl>
     <w:lvl w:ilvl="5" w:tentative="1">
       <w:start w:val="1"/>
-      <w:numFmt w:val="decimal"/>
-      <w:lvlText w:val="%6."/>
+      <w:numFmt w:val="bullet"/>
+      <w:lvlText w:val=""/>
       <w:lvlJc w:val="left"/>
       <w:pPr>
         <w:tabs>
@@ -6691,11 +7152,15 @@
         </w:tabs>
         <w:ind w:left="4320" w:hanging="360"/>
       </w:pPr>
+      <w:rPr>
+        <w:rFonts w:ascii="Wingdings" w:hAnsi="Wingdings" w:hint="default"/>
+        <w:sz w:val="20"/>
+      </w:rPr>
     </w:lvl>
     <w:lvl w:ilvl="6" w:tentative="1">
       <w:start w:val="1"/>
-      <w:numFmt w:val="decimal"/>
-      <w:lvlText w:val="%7."/>
+      <w:numFmt w:val="bullet"/>
+      <w:lvlText w:val=""/>
       <w:lvlJc w:val="left"/>
       <w:pPr>
         <w:tabs>
@@ -6703,11 +7168,15 @@
         </w:tabs>
         <w:ind w:left="5040" w:hanging="360"/>
       </w:pPr>
+      <w:rPr>
+        <w:rFonts w:ascii="Wingdings" w:hAnsi="Wingdings" w:hint="default"/>
+        <w:sz w:val="20"/>
+      </w:rPr>
     </w:lvl>
     <w:lvl w:ilvl="7" w:tentative="1">
       <w:start w:val="1"/>
-      <w:numFmt w:val="decimal"/>
-      <w:lvlText w:val="%8."/>
+      <w:numFmt w:val="bullet"/>
+      <w:lvlText w:val=""/>
       <w:lvlJc w:val="left"/>
       <w:pPr>
         <w:tabs>
@@ -6715,11 +7184,15 @@
         </w:tabs>
         <w:ind w:left="5760" w:hanging="360"/>
       </w:pPr>
+      <w:rPr>
+        <w:rFonts w:ascii="Wingdings" w:hAnsi="Wingdings" w:hint="default"/>
+        <w:sz w:val="20"/>
+      </w:rPr>
     </w:lvl>
     <w:lvl w:ilvl="8" w:tentative="1">
       <w:start w:val="1"/>
-      <w:numFmt w:val="decimal"/>
-      <w:lvlText w:val="%9."/>
+      <w:numFmt w:val="bullet"/>
+      <w:lvlText w:val=""/>
       <w:lvlJc w:val="left"/>
       <w:pPr>
         <w:tabs>
@@ -6727,384 +7200,13 @@
         </w:tabs>
         <w:ind w:left="6480" w:hanging="360"/>
       </w:pPr>
+      <w:rPr>
+        <w:rFonts w:ascii="Wingdings" w:hAnsi="Wingdings" w:hint="default"/>
+        <w:sz w:val="20"/>
+      </w:rPr>
     </w:lvl>
   </w:abstractNum>
   <w:abstractNum w:abstractNumId="31" w15:restartNumberingAfterBreak="0">
-    <w:nsid w:val="5E373A62"/>
-    <w:multiLevelType w:val="multilevel"/>
-    <w:tmpl w:val="1B48ECDC"/>
-    <w:lvl w:ilvl="0">
-      <w:start w:val="1"/>
-      <w:numFmt w:val="decimal"/>
-      <w:lvlText w:val="%1."/>
-      <w:lvlJc w:val="left"/>
-      <w:pPr>
-        <w:tabs>
-          <w:tab w:val="num" w:pos="720"/>
-        </w:tabs>
-        <w:ind w:left="720" w:hanging="360"/>
-      </w:pPr>
-    </w:lvl>
-    <w:lvl w:ilvl="1" w:tentative="1">
-      <w:start w:val="1"/>
-      <w:numFmt w:val="decimal"/>
-      <w:lvlText w:val="%2."/>
-      <w:lvlJc w:val="left"/>
-      <w:pPr>
-        <w:tabs>
-          <w:tab w:val="num" w:pos="1440"/>
-        </w:tabs>
-        <w:ind w:left="1440" w:hanging="360"/>
-      </w:pPr>
-    </w:lvl>
-    <w:lvl w:ilvl="2" w:tentative="1">
-      <w:start w:val="1"/>
-      <w:numFmt w:val="decimal"/>
-      <w:lvlText w:val="%3."/>
-      <w:lvlJc w:val="left"/>
-      <w:pPr>
-        <w:tabs>
-          <w:tab w:val="num" w:pos="2160"/>
-        </w:tabs>
-        <w:ind w:left="2160" w:hanging="360"/>
-      </w:pPr>
-    </w:lvl>
-    <w:lvl w:ilvl="3" w:tentative="1">
-      <w:start w:val="1"/>
-      <w:numFmt w:val="decimal"/>
-      <w:lvlText w:val="%4."/>
-      <w:lvlJc w:val="left"/>
-      <w:pPr>
-        <w:tabs>
-          <w:tab w:val="num" w:pos="2880"/>
-        </w:tabs>
-        <w:ind w:left="2880" w:hanging="360"/>
-      </w:pPr>
-    </w:lvl>
-    <w:lvl w:ilvl="4" w:tentative="1">
-      <w:start w:val="1"/>
-      <w:numFmt w:val="decimal"/>
-      <w:lvlText w:val="%5."/>
-      <w:lvlJc w:val="left"/>
-      <w:pPr>
-        <w:tabs>
-          <w:tab w:val="num" w:pos="3600"/>
-        </w:tabs>
-        <w:ind w:left="3600" w:hanging="360"/>
-      </w:pPr>
-    </w:lvl>
-    <w:lvl w:ilvl="5" w:tentative="1">
-      <w:start w:val="1"/>
-      <w:numFmt w:val="decimal"/>
-      <w:lvlText w:val="%6."/>
-      <w:lvlJc w:val="left"/>
-      <w:pPr>
-        <w:tabs>
-          <w:tab w:val="num" w:pos="4320"/>
-        </w:tabs>
-        <w:ind w:left="4320" w:hanging="360"/>
-      </w:pPr>
-    </w:lvl>
-    <w:lvl w:ilvl="6" w:tentative="1">
-      <w:start w:val="1"/>
-      <w:numFmt w:val="decimal"/>
-      <w:lvlText w:val="%7."/>
-      <w:lvlJc w:val="left"/>
-      <w:pPr>
-        <w:tabs>
-          <w:tab w:val="num" w:pos="5040"/>
-        </w:tabs>
-        <w:ind w:left="5040" w:hanging="360"/>
-      </w:pPr>
-    </w:lvl>
-    <w:lvl w:ilvl="7" w:tentative="1">
-      <w:start w:val="1"/>
-      <w:numFmt w:val="decimal"/>
-      <w:lvlText w:val="%8."/>
-      <w:lvlJc w:val="left"/>
-      <w:pPr>
-        <w:tabs>
-          <w:tab w:val="num" w:pos="5760"/>
-        </w:tabs>
-        <w:ind w:left="5760" w:hanging="360"/>
-      </w:pPr>
-    </w:lvl>
-    <w:lvl w:ilvl="8" w:tentative="1">
-      <w:start w:val="1"/>
-      <w:numFmt w:val="decimal"/>
-      <w:lvlText w:val="%9."/>
-      <w:lvlJc w:val="left"/>
-      <w:pPr>
-        <w:tabs>
-          <w:tab w:val="num" w:pos="6480"/>
-        </w:tabs>
-        <w:ind w:left="6480" w:hanging="360"/>
-      </w:pPr>
-    </w:lvl>
-  </w:abstractNum>
-  <w:abstractNum w:abstractNumId="32" w15:restartNumberingAfterBreak="0">
-    <w:nsid w:val="646E184A"/>
-    <w:multiLevelType w:val="multilevel"/>
-    <w:tmpl w:val="E27A03A0"/>
-    <w:lvl w:ilvl="0">
-      <w:start w:val="1"/>
-      <w:numFmt w:val="bullet"/>
-      <w:lvlText w:val=""/>
-      <w:lvlJc w:val="left"/>
-      <w:pPr>
-        <w:tabs>
-          <w:tab w:val="num" w:pos="720"/>
-        </w:tabs>
-        <w:ind w:left="720" w:hanging="360"/>
-      </w:pPr>
-      <w:rPr>
-        <w:rFonts w:ascii="Symbol" w:hAnsi="Symbol" w:hint="default"/>
-        <w:sz w:val="20"/>
-      </w:rPr>
-    </w:lvl>
-    <w:lvl w:ilvl="1" w:tentative="1">
-      <w:start w:val="1"/>
-      <w:numFmt w:val="bullet"/>
-      <w:lvlText w:val="o"/>
-      <w:lvlJc w:val="left"/>
-      <w:pPr>
-        <w:tabs>
-          <w:tab w:val="num" w:pos="1440"/>
-        </w:tabs>
-        <w:ind w:left="1440" w:hanging="360"/>
-      </w:pPr>
-      <w:rPr>
-        <w:rFonts w:ascii="Courier New" w:hAnsi="Courier New" w:hint="default"/>
-        <w:sz w:val="20"/>
-      </w:rPr>
-    </w:lvl>
-    <w:lvl w:ilvl="2" w:tentative="1">
-      <w:start w:val="1"/>
-      <w:numFmt w:val="bullet"/>
-      <w:lvlText w:val=""/>
-      <w:lvlJc w:val="left"/>
-      <w:pPr>
-        <w:tabs>
-          <w:tab w:val="num" w:pos="2160"/>
-        </w:tabs>
-        <w:ind w:left="2160" w:hanging="360"/>
-      </w:pPr>
-      <w:rPr>
-        <w:rFonts w:ascii="Wingdings" w:hAnsi="Wingdings" w:hint="default"/>
-        <w:sz w:val="20"/>
-      </w:rPr>
-    </w:lvl>
-    <w:lvl w:ilvl="3" w:tentative="1">
-      <w:start w:val="1"/>
-      <w:numFmt w:val="bullet"/>
-      <w:lvlText w:val=""/>
-      <w:lvlJc w:val="left"/>
-      <w:pPr>
-        <w:tabs>
-          <w:tab w:val="num" w:pos="2880"/>
-        </w:tabs>
-        <w:ind w:left="2880" w:hanging="360"/>
-      </w:pPr>
-      <w:rPr>
-        <w:rFonts w:ascii="Wingdings" w:hAnsi="Wingdings" w:hint="default"/>
-        <w:sz w:val="20"/>
-      </w:rPr>
-    </w:lvl>
-    <w:lvl w:ilvl="4" w:tentative="1">
-      <w:start w:val="1"/>
-      <w:numFmt w:val="bullet"/>
-      <w:lvlText w:val=""/>
-      <w:lvlJc w:val="left"/>
-      <w:pPr>
-        <w:tabs>
-          <w:tab w:val="num" w:pos="3600"/>
-        </w:tabs>
-        <w:ind w:left="3600" w:hanging="360"/>
-      </w:pPr>
-      <w:rPr>
-        <w:rFonts w:ascii="Wingdings" w:hAnsi="Wingdings" w:hint="default"/>
-        <w:sz w:val="20"/>
-      </w:rPr>
-    </w:lvl>
-    <w:lvl w:ilvl="5" w:tentative="1">
-      <w:start w:val="1"/>
-      <w:numFmt w:val="bullet"/>
-      <w:lvlText w:val=""/>
-      <w:lvlJc w:val="left"/>
-      <w:pPr>
-        <w:tabs>
-          <w:tab w:val="num" w:pos="4320"/>
-        </w:tabs>
-        <w:ind w:left="4320" w:hanging="360"/>
-      </w:pPr>
-      <w:rPr>
-        <w:rFonts w:ascii="Wingdings" w:hAnsi="Wingdings" w:hint="default"/>
-        <w:sz w:val="20"/>
-      </w:rPr>
-    </w:lvl>
-    <w:lvl w:ilvl="6" w:tentative="1">
-      <w:start w:val="1"/>
-      <w:numFmt w:val="bullet"/>
-      <w:lvlText w:val=""/>
-      <w:lvlJc w:val="left"/>
-      <w:pPr>
-        <w:tabs>
-          <w:tab w:val="num" w:pos="5040"/>
-        </w:tabs>
-        <w:ind w:left="5040" w:hanging="360"/>
-      </w:pPr>
-      <w:rPr>
-        <w:rFonts w:ascii="Wingdings" w:hAnsi="Wingdings" w:hint="default"/>
-        <w:sz w:val="20"/>
-      </w:rPr>
-    </w:lvl>
-    <w:lvl w:ilvl="7" w:tentative="1">
-      <w:start w:val="1"/>
-      <w:numFmt w:val="bullet"/>
-      <w:lvlText w:val=""/>
-      <w:lvlJc w:val="left"/>
-      <w:pPr>
-        <w:tabs>
-          <w:tab w:val="num" w:pos="5760"/>
-        </w:tabs>
-        <w:ind w:left="5760" w:hanging="360"/>
-      </w:pPr>
-      <w:rPr>
-        <w:rFonts w:ascii="Wingdings" w:hAnsi="Wingdings" w:hint="default"/>
-        <w:sz w:val="20"/>
-      </w:rPr>
-    </w:lvl>
-    <w:lvl w:ilvl="8" w:tentative="1">
-      <w:start w:val="1"/>
-      <w:numFmt w:val="bullet"/>
-      <w:lvlText w:val=""/>
-      <w:lvlJc w:val="left"/>
-      <w:pPr>
-        <w:tabs>
-          <w:tab w:val="num" w:pos="6480"/>
-        </w:tabs>
-        <w:ind w:left="6480" w:hanging="360"/>
-      </w:pPr>
-      <w:rPr>
-        <w:rFonts w:ascii="Wingdings" w:hAnsi="Wingdings" w:hint="default"/>
-        <w:sz w:val="20"/>
-      </w:rPr>
-    </w:lvl>
-  </w:abstractNum>
-  <w:abstractNum w:abstractNumId="33" w15:restartNumberingAfterBreak="0">
-    <w:nsid w:val="65D44896"/>
-    <w:multiLevelType w:val="multilevel"/>
-    <w:tmpl w:val="E8A4810E"/>
-    <w:lvl w:ilvl="0">
-      <w:start w:val="1"/>
-      <w:numFmt w:val="decimal"/>
-      <w:lvlText w:val="%1."/>
-      <w:lvlJc w:val="left"/>
-      <w:pPr>
-        <w:tabs>
-          <w:tab w:val="num" w:pos="720"/>
-        </w:tabs>
-        <w:ind w:left="720" w:hanging="360"/>
-      </w:pPr>
-    </w:lvl>
-    <w:lvl w:ilvl="1" w:tentative="1">
-      <w:start w:val="1"/>
-      <w:numFmt w:val="decimal"/>
-      <w:lvlText w:val="%2."/>
-      <w:lvlJc w:val="left"/>
-      <w:pPr>
-        <w:tabs>
-          <w:tab w:val="num" w:pos="1440"/>
-        </w:tabs>
-        <w:ind w:left="1440" w:hanging="360"/>
-      </w:pPr>
-    </w:lvl>
-    <w:lvl w:ilvl="2" w:tentative="1">
-      <w:start w:val="1"/>
-      <w:numFmt w:val="decimal"/>
-      <w:lvlText w:val="%3."/>
-      <w:lvlJc w:val="left"/>
-      <w:pPr>
-        <w:tabs>
-          <w:tab w:val="num" w:pos="2160"/>
-        </w:tabs>
-        <w:ind w:left="2160" w:hanging="360"/>
-      </w:pPr>
-    </w:lvl>
-    <w:lvl w:ilvl="3" w:tentative="1">
-      <w:start w:val="1"/>
-      <w:numFmt w:val="decimal"/>
-      <w:lvlText w:val="%4."/>
-      <w:lvlJc w:val="left"/>
-      <w:pPr>
-        <w:tabs>
-          <w:tab w:val="num" w:pos="2880"/>
-        </w:tabs>
-        <w:ind w:left="2880" w:hanging="360"/>
-      </w:pPr>
-    </w:lvl>
-    <w:lvl w:ilvl="4" w:tentative="1">
-      <w:start w:val="1"/>
-      <w:numFmt w:val="decimal"/>
-      <w:lvlText w:val="%5."/>
-      <w:lvlJc w:val="left"/>
-      <w:pPr>
-        <w:tabs>
-          <w:tab w:val="num" w:pos="3600"/>
-        </w:tabs>
-        <w:ind w:left="3600" w:hanging="360"/>
-      </w:pPr>
-    </w:lvl>
-    <w:lvl w:ilvl="5" w:tentative="1">
-      <w:start w:val="1"/>
-      <w:numFmt w:val="decimal"/>
-      <w:lvlText w:val="%6."/>
-      <w:lvlJc w:val="left"/>
-      <w:pPr>
-        <w:tabs>
-          <w:tab w:val="num" w:pos="4320"/>
-        </w:tabs>
-        <w:ind w:left="4320" w:hanging="360"/>
-      </w:pPr>
-    </w:lvl>
-    <w:lvl w:ilvl="6" w:tentative="1">
-      <w:start w:val="1"/>
-      <w:numFmt w:val="decimal"/>
-      <w:lvlText w:val="%7."/>
-      <w:lvlJc w:val="left"/>
-      <w:pPr>
-        <w:tabs>
-          <w:tab w:val="num" w:pos="5040"/>
-        </w:tabs>
-        <w:ind w:left="5040" w:hanging="360"/>
-      </w:pPr>
-    </w:lvl>
-    <w:lvl w:ilvl="7" w:tentative="1">
-      <w:start w:val="1"/>
-      <w:numFmt w:val="decimal"/>
-      <w:lvlText w:val="%8."/>
-      <w:lvlJc w:val="left"/>
-      <w:pPr>
-        <w:tabs>
-          <w:tab w:val="num" w:pos="5760"/>
-        </w:tabs>
-        <w:ind w:left="5760" w:hanging="360"/>
-      </w:pPr>
-    </w:lvl>
-    <w:lvl w:ilvl="8" w:tentative="1">
-      <w:start w:val="1"/>
-      <w:numFmt w:val="decimal"/>
-      <w:lvlText w:val="%9."/>
-      <w:lvlJc w:val="left"/>
-      <w:pPr>
-        <w:tabs>
-          <w:tab w:val="num" w:pos="6480"/>
-        </w:tabs>
-        <w:ind w:left="6480" w:hanging="360"/>
-      </w:pPr>
-    </w:lvl>
-  </w:abstractNum>
-  <w:abstractNum w:abstractNumId="34" w15:restartNumberingAfterBreak="0">
     <w:nsid w:val="7B1D4B78"/>
     <w:multiLevelType w:val="multilevel"/>
     <w:tmpl w:val="F2A8B954"/>
@@ -7253,111 +7355,371 @@
       </w:rPr>
     </w:lvl>
   </w:abstractNum>
-  <w:num w:numId="1" w16cid:durableId="873352154">
+  <w:abstractNum w:abstractNumId="32" w15:restartNumberingAfterBreak="0">
+    <w:nsid w:val="7BF82FEA"/>
+    <w:multiLevelType w:val="multilevel"/>
+    <w:tmpl w:val="9FE0FF6E"/>
+    <w:lvl w:ilvl="0">
+      <w:start w:val="1"/>
+      <w:numFmt w:val="bullet"/>
+      <w:lvlText w:val=""/>
+      <w:lvlJc w:val="left"/>
+      <w:pPr>
+        <w:tabs>
+          <w:tab w:val="num" w:pos="720"/>
+        </w:tabs>
+        <w:ind w:left="720" w:hanging="360"/>
+      </w:pPr>
+      <w:rPr>
+        <w:rFonts w:ascii="Symbol" w:hAnsi="Symbol" w:hint="default"/>
+        <w:sz w:val="20"/>
+      </w:rPr>
+    </w:lvl>
+    <w:lvl w:ilvl="1" w:tentative="1">
+      <w:start w:val="1"/>
+      <w:numFmt w:val="bullet"/>
+      <w:lvlText w:val="o"/>
+      <w:lvlJc w:val="left"/>
+      <w:pPr>
+        <w:tabs>
+          <w:tab w:val="num" w:pos="1440"/>
+        </w:tabs>
+        <w:ind w:left="1440" w:hanging="360"/>
+      </w:pPr>
+      <w:rPr>
+        <w:rFonts w:ascii="Courier New" w:hAnsi="Courier New" w:hint="default"/>
+        <w:sz w:val="20"/>
+      </w:rPr>
+    </w:lvl>
+    <w:lvl w:ilvl="2" w:tentative="1">
+      <w:start w:val="1"/>
+      <w:numFmt w:val="bullet"/>
+      <w:lvlText w:val=""/>
+      <w:lvlJc w:val="left"/>
+      <w:pPr>
+        <w:tabs>
+          <w:tab w:val="num" w:pos="2160"/>
+        </w:tabs>
+        <w:ind w:left="2160" w:hanging="360"/>
+      </w:pPr>
+      <w:rPr>
+        <w:rFonts w:ascii="Wingdings" w:hAnsi="Wingdings" w:hint="default"/>
+        <w:sz w:val="20"/>
+      </w:rPr>
+    </w:lvl>
+    <w:lvl w:ilvl="3" w:tentative="1">
+      <w:start w:val="1"/>
+      <w:numFmt w:val="bullet"/>
+      <w:lvlText w:val=""/>
+      <w:lvlJc w:val="left"/>
+      <w:pPr>
+        <w:tabs>
+          <w:tab w:val="num" w:pos="2880"/>
+        </w:tabs>
+        <w:ind w:left="2880" w:hanging="360"/>
+      </w:pPr>
+      <w:rPr>
+        <w:rFonts w:ascii="Wingdings" w:hAnsi="Wingdings" w:hint="default"/>
+        <w:sz w:val="20"/>
+      </w:rPr>
+    </w:lvl>
+    <w:lvl w:ilvl="4" w:tentative="1">
+      <w:start w:val="1"/>
+      <w:numFmt w:val="bullet"/>
+      <w:lvlText w:val=""/>
+      <w:lvlJc w:val="left"/>
+      <w:pPr>
+        <w:tabs>
+          <w:tab w:val="num" w:pos="3600"/>
+        </w:tabs>
+        <w:ind w:left="3600" w:hanging="360"/>
+      </w:pPr>
+      <w:rPr>
+        <w:rFonts w:ascii="Wingdings" w:hAnsi="Wingdings" w:hint="default"/>
+        <w:sz w:val="20"/>
+      </w:rPr>
+    </w:lvl>
+    <w:lvl w:ilvl="5" w:tentative="1">
+      <w:start w:val="1"/>
+      <w:numFmt w:val="bullet"/>
+      <w:lvlText w:val=""/>
+      <w:lvlJc w:val="left"/>
+      <w:pPr>
+        <w:tabs>
+          <w:tab w:val="num" w:pos="4320"/>
+        </w:tabs>
+        <w:ind w:left="4320" w:hanging="360"/>
+      </w:pPr>
+      <w:rPr>
+        <w:rFonts w:ascii="Wingdings" w:hAnsi="Wingdings" w:hint="default"/>
+        <w:sz w:val="20"/>
+      </w:rPr>
+    </w:lvl>
+    <w:lvl w:ilvl="6" w:tentative="1">
+      <w:start w:val="1"/>
+      <w:numFmt w:val="bullet"/>
+      <w:lvlText w:val=""/>
+      <w:lvlJc w:val="left"/>
+      <w:pPr>
+        <w:tabs>
+          <w:tab w:val="num" w:pos="5040"/>
+        </w:tabs>
+        <w:ind w:left="5040" w:hanging="360"/>
+      </w:pPr>
+      <w:rPr>
+        <w:rFonts w:ascii="Wingdings" w:hAnsi="Wingdings" w:hint="default"/>
+        <w:sz w:val="20"/>
+      </w:rPr>
+    </w:lvl>
+    <w:lvl w:ilvl="7" w:tentative="1">
+      <w:start w:val="1"/>
+      <w:numFmt w:val="bullet"/>
+      <w:lvlText w:val=""/>
+      <w:lvlJc w:val="left"/>
+      <w:pPr>
+        <w:tabs>
+          <w:tab w:val="num" w:pos="5760"/>
+        </w:tabs>
+        <w:ind w:left="5760" w:hanging="360"/>
+      </w:pPr>
+      <w:rPr>
+        <w:rFonts w:ascii="Wingdings" w:hAnsi="Wingdings" w:hint="default"/>
+        <w:sz w:val="20"/>
+      </w:rPr>
+    </w:lvl>
+    <w:lvl w:ilvl="8" w:tentative="1">
+      <w:start w:val="1"/>
+      <w:numFmt w:val="bullet"/>
+      <w:lvlText w:val=""/>
+      <w:lvlJc w:val="left"/>
+      <w:pPr>
+        <w:tabs>
+          <w:tab w:val="num" w:pos="6480"/>
+        </w:tabs>
+        <w:ind w:left="6480" w:hanging="360"/>
+      </w:pPr>
+      <w:rPr>
+        <w:rFonts w:ascii="Wingdings" w:hAnsi="Wingdings" w:hint="default"/>
+        <w:sz w:val="20"/>
+      </w:rPr>
+    </w:lvl>
+  </w:abstractNum>
+  <w:abstractNum w:abstractNumId="33" w15:restartNumberingAfterBreak="0">
+    <w:nsid w:val="7E683084"/>
+    <w:multiLevelType w:val="multilevel"/>
+    <w:tmpl w:val="0DFCF94E"/>
+    <w:lvl w:ilvl="0">
+      <w:start w:val="1"/>
+      <w:numFmt w:val="decimal"/>
+      <w:lvlText w:val="%1."/>
+      <w:lvlJc w:val="left"/>
+      <w:pPr>
+        <w:tabs>
+          <w:tab w:val="num" w:pos="720"/>
+        </w:tabs>
+        <w:ind w:left="720" w:hanging="360"/>
+      </w:pPr>
+    </w:lvl>
+    <w:lvl w:ilvl="1" w:tentative="1">
+      <w:start w:val="1"/>
+      <w:numFmt w:val="decimal"/>
+      <w:lvlText w:val="%2."/>
+      <w:lvlJc w:val="left"/>
+      <w:pPr>
+        <w:tabs>
+          <w:tab w:val="num" w:pos="1440"/>
+        </w:tabs>
+        <w:ind w:left="1440" w:hanging="360"/>
+      </w:pPr>
+    </w:lvl>
+    <w:lvl w:ilvl="2" w:tentative="1">
+      <w:start w:val="1"/>
+      <w:numFmt w:val="decimal"/>
+      <w:lvlText w:val="%3."/>
+      <w:lvlJc w:val="left"/>
+      <w:pPr>
+        <w:tabs>
+          <w:tab w:val="num" w:pos="2160"/>
+        </w:tabs>
+        <w:ind w:left="2160" w:hanging="360"/>
+      </w:pPr>
+    </w:lvl>
+    <w:lvl w:ilvl="3" w:tentative="1">
+      <w:start w:val="1"/>
+      <w:numFmt w:val="decimal"/>
+      <w:lvlText w:val="%4."/>
+      <w:lvlJc w:val="left"/>
+      <w:pPr>
+        <w:tabs>
+          <w:tab w:val="num" w:pos="2880"/>
+        </w:tabs>
+        <w:ind w:left="2880" w:hanging="360"/>
+      </w:pPr>
+    </w:lvl>
+    <w:lvl w:ilvl="4" w:tentative="1">
+      <w:start w:val="1"/>
+      <w:numFmt w:val="decimal"/>
+      <w:lvlText w:val="%5."/>
+      <w:lvlJc w:val="left"/>
+      <w:pPr>
+        <w:tabs>
+          <w:tab w:val="num" w:pos="3600"/>
+        </w:tabs>
+        <w:ind w:left="3600" w:hanging="360"/>
+      </w:pPr>
+    </w:lvl>
+    <w:lvl w:ilvl="5" w:tentative="1">
+      <w:start w:val="1"/>
+      <w:numFmt w:val="decimal"/>
+      <w:lvlText w:val="%6."/>
+      <w:lvlJc w:val="left"/>
+      <w:pPr>
+        <w:tabs>
+          <w:tab w:val="num" w:pos="4320"/>
+        </w:tabs>
+        <w:ind w:left="4320" w:hanging="360"/>
+      </w:pPr>
+    </w:lvl>
+    <w:lvl w:ilvl="6" w:tentative="1">
+      <w:start w:val="1"/>
+      <w:numFmt w:val="decimal"/>
+      <w:lvlText w:val="%7."/>
+      <w:lvlJc w:val="left"/>
+      <w:pPr>
+        <w:tabs>
+          <w:tab w:val="num" w:pos="5040"/>
+        </w:tabs>
+        <w:ind w:left="5040" w:hanging="360"/>
+      </w:pPr>
+    </w:lvl>
+    <w:lvl w:ilvl="7" w:tentative="1">
+      <w:start w:val="1"/>
+      <w:numFmt w:val="decimal"/>
+      <w:lvlText w:val="%8."/>
+      <w:lvlJc w:val="left"/>
+      <w:pPr>
+        <w:tabs>
+          <w:tab w:val="num" w:pos="5760"/>
+        </w:tabs>
+        <w:ind w:left="5760" w:hanging="360"/>
+      </w:pPr>
+    </w:lvl>
+    <w:lvl w:ilvl="8" w:tentative="1">
+      <w:start w:val="1"/>
+      <w:numFmt w:val="decimal"/>
+      <w:lvlText w:val="%9."/>
+      <w:lvlJc w:val="left"/>
+      <w:pPr>
+        <w:tabs>
+          <w:tab w:val="num" w:pos="6480"/>
+        </w:tabs>
+        <w:ind w:left="6480" w:hanging="360"/>
+      </w:pPr>
+    </w:lvl>
+  </w:abstractNum>
+  <w:num w:numId="1" w16cid:durableId="1571037869">
+    <w:abstractNumId w:val="24"/>
+  </w:num>
+  <w:num w:numId="2" w16cid:durableId="219483369">
+    <w:abstractNumId w:val="22"/>
+  </w:num>
+  <w:num w:numId="3" w16cid:durableId="1548957082">
+    <w:abstractNumId w:val="21"/>
+  </w:num>
+  <w:num w:numId="4" w16cid:durableId="1776292851">
+    <w:abstractNumId w:val="11"/>
+  </w:num>
+  <w:num w:numId="5" w16cid:durableId="1123767997">
+    <w:abstractNumId w:val="1"/>
+  </w:num>
+  <w:num w:numId="6" w16cid:durableId="2088722366">
     <w:abstractNumId w:val="17"/>
   </w:num>
-  <w:num w:numId="2" w16cid:durableId="955328668">
+  <w:num w:numId="7" w16cid:durableId="703749351">
+    <w:abstractNumId w:val="7"/>
+  </w:num>
+  <w:num w:numId="8" w16cid:durableId="1666469634">
+    <w:abstractNumId w:val="25"/>
+  </w:num>
+  <w:num w:numId="9" w16cid:durableId="1884173462">
+    <w:abstractNumId w:val="19"/>
+  </w:num>
+  <w:num w:numId="10" w16cid:durableId="952052356">
+    <w:abstractNumId w:val="9"/>
+  </w:num>
+  <w:num w:numId="11" w16cid:durableId="47611767">
+    <w:abstractNumId w:val="16"/>
+  </w:num>
+  <w:num w:numId="12" w16cid:durableId="1115061379">
+    <w:abstractNumId w:val="31"/>
+  </w:num>
+  <w:num w:numId="13" w16cid:durableId="1340623059">
+    <w:abstractNumId w:val="2"/>
+  </w:num>
+  <w:num w:numId="14" w16cid:durableId="330068240">
+    <w:abstractNumId w:val="13"/>
+  </w:num>
+  <w:num w:numId="15" w16cid:durableId="1333605791">
+    <w:abstractNumId w:val="27"/>
+  </w:num>
+  <w:num w:numId="16" w16cid:durableId="361515666">
+    <w:abstractNumId w:val="15"/>
+  </w:num>
+  <w:num w:numId="17" w16cid:durableId="88428742">
+    <w:abstractNumId w:val="23"/>
+  </w:num>
+  <w:num w:numId="18" w16cid:durableId="92939730">
+    <w:abstractNumId w:val="0"/>
+  </w:num>
+  <w:num w:numId="19" w16cid:durableId="939484312">
+    <w:abstractNumId w:val="3"/>
+  </w:num>
+  <w:num w:numId="20" w16cid:durableId="1411654917">
+    <w:abstractNumId w:val="33"/>
+  </w:num>
+  <w:num w:numId="21" w16cid:durableId="593560184">
+    <w:abstractNumId w:val="8"/>
+  </w:num>
+  <w:num w:numId="22" w16cid:durableId="1230728888">
+    <w:abstractNumId w:val="6"/>
+  </w:num>
+  <w:num w:numId="23" w16cid:durableId="409470167">
+    <w:abstractNumId w:val="18"/>
+  </w:num>
+  <w:num w:numId="24" w16cid:durableId="74471958">
+    <w:abstractNumId w:val="26"/>
+  </w:num>
+  <w:num w:numId="25" w16cid:durableId="1787971">
+    <w:abstractNumId w:val="12"/>
+  </w:num>
+  <w:num w:numId="26" w16cid:durableId="1972325294">
+    <w:abstractNumId w:val="32"/>
+  </w:num>
+  <w:num w:numId="27" w16cid:durableId="515655966">
+    <w:abstractNumId w:val="5"/>
+  </w:num>
+  <w:num w:numId="28" w16cid:durableId="1516074014">
+    <w:abstractNumId w:val="28"/>
+  </w:num>
+  <w:num w:numId="29" w16cid:durableId="137889174">
+    <w:abstractNumId w:val="14"/>
+  </w:num>
+  <w:num w:numId="30" w16cid:durableId="1128159524">
+    <w:abstractNumId w:val="30"/>
+  </w:num>
+  <w:num w:numId="31" w16cid:durableId="767392321">
     <w:abstractNumId w:val="20"/>
   </w:num>
-  <w:num w:numId="3" w16cid:durableId="301622814">
-    <w:abstractNumId w:val="12"/>
+  <w:num w:numId="32" w16cid:durableId="325548052">
+    <w:abstractNumId w:val="4"/>
   </w:num>
-  <w:num w:numId="4" w16cid:durableId="188875417">
-    <w:abstractNumId w:val="21"/>
+  <w:num w:numId="33" w16cid:durableId="446852499">
+    <w:abstractNumId w:val="10"/>
   </w:num>
-  <w:num w:numId="5" w16cid:durableId="454104914">
-    <w:abstractNumId w:val="26"/>
-  </w:num>
-  <w:num w:numId="6" w16cid:durableId="96869752">
-    <w:abstractNumId w:val="2"/>
-  </w:num>
-  <w:num w:numId="7" w16cid:durableId="2065834598">
-    <w:abstractNumId w:val="1"/>
-  </w:num>
-  <w:num w:numId="8" w16cid:durableId="646934018">
-    <w:abstractNumId w:val="24"/>
-  </w:num>
-  <w:num w:numId="9" w16cid:durableId="1929925069">
-    <w:abstractNumId w:val="8"/>
-  </w:num>
-  <w:num w:numId="10" w16cid:durableId="403990279">
+  <w:num w:numId="34" w16cid:durableId="924148494">
     <w:abstractNumId w:val="29"/>
   </w:num>
-  <w:num w:numId="11" w16cid:durableId="364714062">
-    <w:abstractNumId w:val="13"/>
-  </w:num>
-  <w:num w:numId="12" w16cid:durableId="854728012">
-    <w:abstractNumId w:val="31"/>
-  </w:num>
-  <w:num w:numId="13" w16cid:durableId="1059283483">
-    <w:abstractNumId w:val="11"/>
-  </w:num>
-  <w:num w:numId="14" w16cid:durableId="1483959598">
-    <w:abstractNumId w:val="27"/>
-  </w:num>
-  <w:num w:numId="15" w16cid:durableId="1368410884">
-    <w:abstractNumId w:val="5"/>
-  </w:num>
-  <w:num w:numId="16" w16cid:durableId="425350218">
-    <w:abstractNumId w:val="30"/>
-  </w:num>
-  <w:num w:numId="17" w16cid:durableId="1497112590">
-    <w:abstractNumId w:val="14"/>
-  </w:num>
-  <w:num w:numId="18" w16cid:durableId="1862621463">
-    <w:abstractNumId w:val="3"/>
-  </w:num>
-  <w:num w:numId="19" w16cid:durableId="1138032927">
-    <w:abstractNumId w:val="32"/>
-  </w:num>
-  <w:num w:numId="20" w16cid:durableId="1123619708">
-    <w:abstractNumId w:val="19"/>
-  </w:num>
-  <w:num w:numId="21" w16cid:durableId="866262712">
-    <w:abstractNumId w:val="4"/>
-  </w:num>
-  <w:num w:numId="22" w16cid:durableId="1319918130">
-    <w:abstractNumId w:val="33"/>
-  </w:num>
-  <w:num w:numId="23" w16cid:durableId="1571037869">
-    <w:abstractNumId w:val="25"/>
-  </w:num>
-  <w:num w:numId="24" w16cid:durableId="219483369">
-    <w:abstractNumId w:val="23"/>
-  </w:num>
-  <w:num w:numId="25" w16cid:durableId="1548957082">
-    <w:abstractNumId w:val="22"/>
-  </w:num>
-  <w:num w:numId="26" w16cid:durableId="1776292851">
-    <w:abstractNumId w:val="10"/>
-  </w:num>
-  <w:num w:numId="27" w16cid:durableId="1123767997">
-    <w:abstractNumId w:val="0"/>
-  </w:num>
-  <w:num w:numId="28" w16cid:durableId="2088722366">
-    <w:abstractNumId w:val="16"/>
-  </w:num>
-  <w:num w:numId="29" w16cid:durableId="703749351">
-    <w:abstractNumId w:val="7"/>
-  </w:num>
-  <w:num w:numId="30" w16cid:durableId="1666469634">
-    <w:abstractNumId w:val="28"/>
-  </w:num>
-  <w:num w:numId="31" w16cid:durableId="1884173462">
-    <w:abstractNumId w:val="18"/>
-  </w:num>
-  <w:num w:numId="32" w16cid:durableId="952052356">
-    <w:abstractNumId w:val="9"/>
-  </w:num>
-  <w:num w:numId="33" w16cid:durableId="47611767">
-    <w:abstractNumId w:val="15"/>
-  </w:num>
-  <w:num w:numId="34" w16cid:durableId="1115061379">
-    <w:abstractNumId w:val="34"/>
-  </w:num>
-  <w:num w:numId="35" w16cid:durableId="1340623059">
-    <w:abstractNumId w:val="6"/>
-  </w:num>
+  <w:numIdMacAtCleanup w:val="34"/>
 </w:numbering>
 </file>
 
@@ -7763,6 +8125,7 @@
   <w:style w:type="character" w:default="1" w:styleId="Fontepargpadro">
     <w:name w:val="Default Paragraph Font"/>
     <w:uiPriority w:val="1"/>
+    <w:semiHidden/>
     <w:unhideWhenUsed/>
   </w:style>
   <w:style w:type="table" w:default="1" w:styleId="Tabelanormal">

</xml_diff>